<commit_message>
Document updated with temp sensor details
</commit_message>
<xml_diff>
--- a/Documents/Safe Flame_V1.docx
+++ b/Documents/Safe Flame_V1.docx
@@ -3055,18 +3055,32 @@
           <w:szCs w:val="24"/>
           <w:lang w:val="en-US"/>
         </w:rPr>
-        <w:t>Rs=((Vref-Vout)/</w:t>
-      </w:r>
-      <w:proofErr w:type="gramStart"/>
-      <w:r>
-        <w:rPr>
-          <w:sz w:val="24"/>
-          <w:szCs w:val="24"/>
-          <w:lang w:val="en-US"/>
-        </w:rPr>
-        <w:t>Vout)*</w:t>
-      </w:r>
-      <w:proofErr w:type="gramEnd"/>
+        <w:t>Rs=((Vref-Vout)/Vout)</w:t>
+      </w:r>
+      <w:r>
+        <w:rPr>
+          <w:sz w:val="24"/>
+          <w:szCs w:val="24"/>
+          <w:lang w:val="en-US"/>
+        </w:rPr>
+        <w:t xml:space="preserve"> </w:t>
+      </w:r>
+      <w:r>
+        <w:rPr>
+          <w:sz w:val="24"/>
+          <w:szCs w:val="24"/>
+          <w:lang w:val="en-US"/>
+        </w:rPr>
+        <w:t>*</w:t>
+      </w:r>
+      <w:r>
+        <w:rPr>
+          <w:sz w:val="24"/>
+          <w:szCs w:val="24"/>
+          <w:lang w:val="en-US"/>
+        </w:rPr>
+        <w:t xml:space="preserve"> </w:t>
+      </w:r>
       <w:r>
         <w:rPr>
           <w:sz w:val="24"/>
@@ -3205,43 +3219,3062 @@
     </w:p>
     <w:p>
       <w:pPr>
-        <w:jc w:val="both"/>
-        <w:rPr>
-          <w:sz w:val="24"/>
-          <w:szCs w:val="24"/>
-          <w:lang w:val="en-US"/>
-        </w:rPr>
-      </w:pPr>
-    </w:p>
-    <w:p>
-      <w:pPr>
-        <w:jc w:val="both"/>
-        <w:rPr>
-          <w:sz w:val="24"/>
-          <w:szCs w:val="24"/>
-          <w:lang w:val="en-US"/>
-        </w:rPr>
-      </w:pPr>
-    </w:p>
-    <w:p>
-      <w:pPr>
-        <w:jc w:val="both"/>
-        <w:rPr>
-          <w:sz w:val="24"/>
-          <w:szCs w:val="24"/>
-          <w:lang w:val="en-US"/>
-        </w:rPr>
-      </w:pPr>
-    </w:p>
-    <w:p>
-      <w:pPr>
-        <w:jc w:val="both"/>
-        <w:rPr>
-          <w:sz w:val="24"/>
-          <w:szCs w:val="24"/>
-          <w:lang w:val="en-US"/>
-        </w:rPr>
-      </w:pPr>
+        <w:pStyle w:val="ListParagraph"/>
+        <w:jc w:val="both"/>
+        <w:rPr>
+          <w:sz w:val="24"/>
+          <w:szCs w:val="24"/>
+          <w:lang w:val="en-US"/>
+        </w:rPr>
+      </w:pPr>
+    </w:p>
+    <w:p>
+      <w:pPr>
+        <w:pStyle w:val="ListParagraph"/>
+        <w:jc w:val="both"/>
+        <w:rPr>
+          <w:sz w:val="24"/>
+          <w:szCs w:val="24"/>
+          <w:lang w:val="en-US"/>
+        </w:rPr>
+      </w:pPr>
+    </w:p>
+    <w:p>
+      <w:pPr>
+        <w:pStyle w:val="ListParagraph"/>
+        <w:jc w:val="both"/>
+        <w:rPr>
+          <w:b/>
+          <w:bCs/>
+          <w:sz w:val="24"/>
+          <w:szCs w:val="24"/>
+          <w:lang w:val="en-US"/>
+        </w:rPr>
+      </w:pPr>
+    </w:p>
+    <w:p>
+      <w:pPr>
+        <w:jc w:val="both"/>
+        <w:rPr>
+          <w:b/>
+          <w:bCs/>
+          <w:sz w:val="24"/>
+          <w:szCs w:val="24"/>
+          <w:lang w:val="en-US"/>
+        </w:rPr>
+      </w:pPr>
+      <w:r>
+        <w:rPr>
+          <w:b/>
+          <w:bCs/>
+          <w:sz w:val="24"/>
+          <w:szCs w:val="24"/>
+          <w:lang w:val="en-US"/>
+        </w:rPr>
+        <w:t xml:space="preserve">Temperature and </w:t>
+      </w:r>
+      <w:r>
+        <w:rPr>
+          <w:b/>
+          <w:bCs/>
+          <w:sz w:val="24"/>
+          <w:szCs w:val="24"/>
+          <w:lang w:val="en-US"/>
+        </w:rPr>
+        <w:t>H</w:t>
+      </w:r>
+      <w:r>
+        <w:rPr>
+          <w:b/>
+          <w:bCs/>
+          <w:sz w:val="24"/>
+          <w:szCs w:val="24"/>
+          <w:lang w:val="en-US"/>
+        </w:rPr>
+        <w:t>umidity sensor-DHT22</w:t>
+      </w:r>
+    </w:p>
+    <w:p>
+      <w:pPr>
+        <w:jc w:val="both"/>
+        <w:rPr>
+          <w:sz w:val="24"/>
+          <w:szCs w:val="24"/>
+        </w:rPr>
+      </w:pPr>
+      <w:r>
+        <w:rPr>
+          <w:sz w:val="24"/>
+          <w:szCs w:val="24"/>
+        </w:rPr>
+        <w:t>The DHT22 Sensor (also called AM2302) is a digital sensor that measure</w:t>
+      </w:r>
+      <w:r>
+        <w:rPr>
+          <w:sz w:val="24"/>
+          <w:szCs w:val="24"/>
+        </w:rPr>
+        <w:t>s t</w:t>
+      </w:r>
+      <w:r>
+        <w:rPr>
+          <w:sz w:val="24"/>
+          <w:szCs w:val="24"/>
+        </w:rPr>
+        <w:t>emperature</w:t>
+      </w:r>
+      <w:r>
+        <w:rPr>
+          <w:sz w:val="24"/>
+          <w:szCs w:val="24"/>
+        </w:rPr>
+        <w:t xml:space="preserve"> and r</w:t>
+      </w:r>
+      <w:r>
+        <w:rPr>
+          <w:sz w:val="24"/>
+          <w:szCs w:val="24"/>
+        </w:rPr>
+        <w:t>elative Humidity and sends the readings to a microcontroller</w:t>
+      </w:r>
+      <w:r>
+        <w:rPr>
+          <w:sz w:val="24"/>
+          <w:szCs w:val="24"/>
+        </w:rPr>
+        <w:t xml:space="preserve"> </w:t>
+      </w:r>
+      <w:r>
+        <w:rPr>
+          <w:sz w:val="24"/>
+          <w:szCs w:val="24"/>
+        </w:rPr>
+        <w:t>using a single-wire digital communication protocol.</w:t>
+      </w:r>
+      <w:r>
+        <w:rPr>
+          <w:sz w:val="24"/>
+          <w:szCs w:val="24"/>
+        </w:rPr>
+        <w:t xml:space="preserve"> </w:t>
+      </w:r>
+      <w:r>
+        <w:rPr>
+          <w:sz w:val="24"/>
+          <w:szCs w:val="24"/>
+        </w:rPr>
+        <w:t>Inside the DHT22 there are mainly:</w:t>
+      </w:r>
+    </w:p>
+    <w:p>
+      <w:pPr>
+        <w:jc w:val="both"/>
+        <w:rPr>
+          <w:b/>
+          <w:bCs/>
+          <w:sz w:val="24"/>
+          <w:szCs w:val="24"/>
+        </w:rPr>
+      </w:pPr>
+      <w:r>
+        <w:rPr>
+          <w:b/>
+          <w:bCs/>
+          <w:sz w:val="24"/>
+          <w:szCs w:val="24"/>
+        </w:rPr>
+        <w:t>A) Humidity Sensing Element</w:t>
+      </w:r>
+    </w:p>
+    <w:p>
+      <w:pPr>
+        <w:jc w:val="both"/>
+        <w:rPr>
+          <w:sz w:val="24"/>
+          <w:szCs w:val="24"/>
+        </w:rPr>
+      </w:pPr>
+      <w:r>
+        <w:rPr>
+          <w:sz w:val="24"/>
+          <w:szCs w:val="24"/>
+        </w:rPr>
+        <w:t xml:space="preserve">It contains a </w:t>
+      </w:r>
+      <w:r>
+        <w:rPr>
+          <w:b/>
+          <w:bCs/>
+          <w:sz w:val="24"/>
+          <w:szCs w:val="24"/>
+        </w:rPr>
+        <w:t>moisture-holding substrate</w:t>
+      </w:r>
+      <w:r>
+        <w:rPr>
+          <w:sz w:val="24"/>
+          <w:szCs w:val="24"/>
+        </w:rPr>
+        <w:t xml:space="preserve"> between two electrodes.</w:t>
+      </w:r>
+    </w:p>
+    <w:p>
+      <w:pPr>
+        <w:numPr>
+          <w:ilvl w:val="0"/>
+          <w:numId w:val="23"/>
+        </w:numPr>
+        <w:jc w:val="both"/>
+        <w:rPr>
+          <w:sz w:val="24"/>
+          <w:szCs w:val="24"/>
+        </w:rPr>
+      </w:pPr>
+      <w:r>
+        <w:rPr>
+          <w:sz w:val="24"/>
+          <w:szCs w:val="24"/>
+        </w:rPr>
+        <w:t xml:space="preserve">Water vapor changes the electrical properties (capacitance). </w:t>
+      </w:r>
+    </w:p>
+    <w:p>
+      <w:pPr>
+        <w:numPr>
+          <w:ilvl w:val="0"/>
+          <w:numId w:val="23"/>
+        </w:numPr>
+        <w:jc w:val="both"/>
+        <w:rPr>
+          <w:sz w:val="24"/>
+          <w:szCs w:val="24"/>
+        </w:rPr>
+      </w:pPr>
+      <w:r>
+        <w:rPr>
+          <w:sz w:val="24"/>
+          <w:szCs w:val="24"/>
+        </w:rPr>
+        <w:t xml:space="preserve">The internal IC measures this change. </w:t>
+      </w:r>
+    </w:p>
+    <w:p>
+      <w:pPr>
+        <w:numPr>
+          <w:ilvl w:val="0"/>
+          <w:numId w:val="23"/>
+        </w:numPr>
+        <w:jc w:val="both"/>
+        <w:rPr>
+          <w:sz w:val="24"/>
+          <w:szCs w:val="24"/>
+        </w:rPr>
+      </w:pPr>
+      <w:r>
+        <w:rPr>
+          <w:sz w:val="24"/>
+          <w:szCs w:val="24"/>
+        </w:rPr>
+        <w:t>It converts it into humidity percentage (%RH).</w:t>
+      </w:r>
+    </w:p>
+    <w:p>
+      <w:pPr>
+        <w:jc w:val="both"/>
+        <w:rPr>
+          <w:b/>
+          <w:bCs/>
+          <w:sz w:val="24"/>
+          <w:szCs w:val="24"/>
+        </w:rPr>
+      </w:pPr>
+      <w:r>
+        <w:rPr>
+          <w:b/>
+          <w:bCs/>
+          <w:sz w:val="24"/>
+          <w:szCs w:val="24"/>
+        </w:rPr>
+        <w:t>B) Temperature Sensor</w:t>
+      </w:r>
+    </w:p>
+    <w:p>
+      <w:pPr>
+        <w:jc w:val="both"/>
+        <w:rPr>
+          <w:sz w:val="24"/>
+          <w:szCs w:val="24"/>
+        </w:rPr>
+      </w:pPr>
+      <w:r>
+        <w:rPr>
+          <w:sz w:val="24"/>
+          <w:szCs w:val="24"/>
+        </w:rPr>
+        <w:t xml:space="preserve">It uses an </w:t>
+      </w:r>
+      <w:r>
+        <w:rPr>
+          <w:b/>
+          <w:bCs/>
+          <w:sz w:val="24"/>
+          <w:szCs w:val="24"/>
+        </w:rPr>
+        <w:t>NTC thermistor</w:t>
+      </w:r>
+      <w:r>
+        <w:rPr>
+          <w:sz w:val="24"/>
+          <w:szCs w:val="24"/>
+        </w:rPr>
+        <w:t>.</w:t>
+      </w:r>
+    </w:p>
+    <w:p>
+      <w:pPr>
+        <w:jc w:val="both"/>
+        <w:rPr>
+          <w:sz w:val="24"/>
+          <w:szCs w:val="24"/>
+        </w:rPr>
+      </w:pPr>
+      <w:r>
+        <w:rPr>
+          <w:sz w:val="24"/>
+          <w:szCs w:val="24"/>
+        </w:rPr>
+        <w:t>NTC means:</w:t>
+      </w:r>
+    </w:p>
+    <w:p>
+      <w:pPr>
+        <w:numPr>
+          <w:ilvl w:val="0"/>
+          <w:numId w:val="24"/>
+        </w:numPr>
+        <w:jc w:val="both"/>
+        <w:rPr>
+          <w:sz w:val="24"/>
+          <w:szCs w:val="24"/>
+        </w:rPr>
+      </w:pPr>
+      <w:r>
+        <w:rPr>
+          <w:sz w:val="24"/>
+          <w:szCs w:val="24"/>
+        </w:rPr>
+        <w:t xml:space="preserve">Temperature </w:t>
+      </w:r>
+      <w:r>
+        <w:rPr>
+          <w:sz w:val="24"/>
+          <w:szCs w:val="24"/>
+        </w:rPr>
+        <w:t>↑ Resistance</w:t>
+      </w:r>
+      <w:r>
+        <w:rPr>
+          <w:sz w:val="24"/>
+          <w:szCs w:val="24"/>
+        </w:rPr>
+        <w:t xml:space="preserve"> ↓ </w:t>
+      </w:r>
+    </w:p>
+    <w:p>
+      <w:pPr>
+        <w:jc w:val="both"/>
+        <w:rPr>
+          <w:sz w:val="24"/>
+          <w:szCs w:val="24"/>
+        </w:rPr>
+      </w:pPr>
+      <w:r>
+        <w:rPr>
+          <w:sz w:val="24"/>
+          <w:szCs w:val="24"/>
+        </w:rPr>
+        <w:t>The internal chip measures this resistance and converts it into temperature.</w:t>
+      </w:r>
+    </w:p>
+    <w:p>
+      <w:pPr>
+        <w:jc w:val="both"/>
+        <w:rPr>
+          <w:b/>
+          <w:bCs/>
+          <w:sz w:val="24"/>
+          <w:szCs w:val="24"/>
+        </w:rPr>
+      </w:pPr>
+      <w:r>
+        <w:rPr>
+          <w:b/>
+          <w:bCs/>
+          <w:sz w:val="24"/>
+          <w:szCs w:val="24"/>
+        </w:rPr>
+        <w:t>C) Internal ADC + Controller</w:t>
+      </w:r>
+    </w:p>
+    <w:p>
+      <w:pPr>
+        <w:jc w:val="both"/>
+        <w:rPr>
+          <w:sz w:val="24"/>
+          <w:szCs w:val="24"/>
+        </w:rPr>
+      </w:pPr>
+      <w:r>
+        <w:rPr>
+          <w:sz w:val="24"/>
+          <w:szCs w:val="24"/>
+        </w:rPr>
+        <w:t>An internal microcontroller:</w:t>
+      </w:r>
+    </w:p>
+    <w:p>
+      <w:pPr>
+        <w:numPr>
+          <w:ilvl w:val="0"/>
+          <w:numId w:val="25"/>
+        </w:numPr>
+        <w:jc w:val="both"/>
+        <w:rPr>
+          <w:sz w:val="24"/>
+          <w:szCs w:val="24"/>
+        </w:rPr>
+      </w:pPr>
+      <w:r>
+        <w:rPr>
+          <w:sz w:val="24"/>
+          <w:szCs w:val="24"/>
+        </w:rPr>
+        <w:t xml:space="preserve">Reads humidity sensor </w:t>
+      </w:r>
+    </w:p>
+    <w:p>
+      <w:pPr>
+        <w:numPr>
+          <w:ilvl w:val="0"/>
+          <w:numId w:val="25"/>
+        </w:numPr>
+        <w:jc w:val="both"/>
+        <w:rPr>
+          <w:sz w:val="24"/>
+          <w:szCs w:val="24"/>
+        </w:rPr>
+      </w:pPr>
+      <w:r>
+        <w:rPr>
+          <w:sz w:val="24"/>
+          <w:szCs w:val="24"/>
+        </w:rPr>
+        <w:t xml:space="preserve">Reads thermistor </w:t>
+      </w:r>
+    </w:p>
+    <w:p>
+      <w:pPr>
+        <w:numPr>
+          <w:ilvl w:val="0"/>
+          <w:numId w:val="25"/>
+        </w:numPr>
+        <w:jc w:val="both"/>
+        <w:rPr>
+          <w:sz w:val="24"/>
+          <w:szCs w:val="24"/>
+        </w:rPr>
+      </w:pPr>
+      <w:r>
+        <w:rPr>
+          <w:sz w:val="24"/>
+          <w:szCs w:val="24"/>
+        </w:rPr>
+        <w:t xml:space="preserve">Converts analog values into digital form </w:t>
+      </w:r>
+    </w:p>
+    <w:p>
+      <w:pPr>
+        <w:numPr>
+          <w:ilvl w:val="0"/>
+          <w:numId w:val="25"/>
+        </w:numPr>
+        <w:jc w:val="both"/>
+        <w:rPr>
+          <w:sz w:val="24"/>
+          <w:szCs w:val="24"/>
+        </w:rPr>
+      </w:pPr>
+      <w:r>
+        <w:rPr>
+          <w:sz w:val="24"/>
+          <w:szCs w:val="24"/>
+        </w:rPr>
+        <w:lastRenderedPageBreak/>
+        <w:t>Sends 40-bit data serially</w:t>
+      </w:r>
+    </w:p>
+    <w:p>
+      <w:pPr>
+        <w:jc w:val="both"/>
+        <w:rPr>
+          <w:sz w:val="24"/>
+          <w:szCs w:val="24"/>
+        </w:rPr>
+      </w:pPr>
+      <w:r>
+        <w:rPr>
+          <w:sz w:val="24"/>
+          <w:szCs w:val="24"/>
+        </w:rPr>
+        <w:drawing>
+          <wp:inline distT="0" distB="0" distL="0" distR="0" wp14:anchorId="0B60079A" wp14:editId="4FD7749C">
+            <wp:extent cx="5731510" cy="3103418"/>
+            <wp:effectExtent l="0" t="0" r="2540" b="1905"/>
+            <wp:docPr id="1789161871" name="Picture 1"/>
+            <wp:cNvGraphicFramePr>
+              <a:graphicFrameLocks xmlns:a="http://schemas.openxmlformats.org/drawingml/2006/main" noChangeAspect="1"/>
+            </wp:cNvGraphicFramePr>
+            <a:graphic xmlns:a="http://schemas.openxmlformats.org/drawingml/2006/main">
+              <a:graphicData uri="http://schemas.openxmlformats.org/drawingml/2006/picture">
+                <pic:pic xmlns:pic="http://schemas.openxmlformats.org/drawingml/2006/picture">
+                  <pic:nvPicPr>
+                    <pic:cNvPr id="1789161871" name=""/>
+                    <pic:cNvPicPr/>
+                  </pic:nvPicPr>
+                  <pic:blipFill rotWithShape="1">
+                    <a:blip r:embed="rId13"/>
+                    <a:srcRect b="2625"/>
+                    <a:stretch>
+                      <a:fillRect/>
+                    </a:stretch>
+                  </pic:blipFill>
+                  <pic:spPr bwMode="auto">
+                    <a:xfrm>
+                      <a:off x="0" y="0"/>
+                      <a:ext cx="5731510" cy="3103418"/>
+                    </a:xfrm>
+                    <a:prstGeom prst="rect">
+                      <a:avLst/>
+                    </a:prstGeom>
+                    <a:ln>
+                      <a:noFill/>
+                    </a:ln>
+                    <a:extLst>
+                      <a:ext uri="{53640926-AAD7-44D8-BBD7-CCE9431645EC}">
+                        <a14:shadowObscured xmlns:a14="http://schemas.microsoft.com/office/drawing/2010/main"/>
+                      </a:ext>
+                    </a:extLst>
+                  </pic:spPr>
+                </pic:pic>
+              </a:graphicData>
+            </a:graphic>
+          </wp:inline>
+        </w:drawing>
+      </w:r>
+    </w:p>
+    <w:p>
+      <w:pPr>
+        <w:jc w:val="both"/>
+        <w:rPr>
+          <w:b/>
+          <w:bCs/>
+          <w:sz w:val="24"/>
+          <w:szCs w:val="24"/>
+        </w:rPr>
+      </w:pPr>
+      <w:r>
+        <w:rPr>
+          <w:b/>
+          <w:bCs/>
+          <w:sz w:val="24"/>
+          <w:szCs w:val="24"/>
+        </w:rPr>
+        <w:t>Communication Interface for DHT22</w:t>
+      </w:r>
+    </w:p>
+    <w:p>
+      <w:pPr>
+        <w:jc w:val="both"/>
+        <w:rPr>
+          <w:sz w:val="24"/>
+          <w:szCs w:val="24"/>
+        </w:rPr>
+      </w:pPr>
+      <w:r>
+        <w:rPr>
+          <w:b/>
+          <w:bCs/>
+          <w:sz w:val="24"/>
+          <w:szCs w:val="24"/>
+        </w:rPr>
+        <w:t>Step 1:</w:t>
+      </w:r>
+      <w:r>
+        <w:rPr>
+          <w:sz w:val="24"/>
+          <w:szCs w:val="24"/>
+        </w:rPr>
+        <w:t xml:space="preserve"> MCU sends START signal</w:t>
+      </w:r>
+    </w:p>
+    <w:p>
+      <w:pPr>
+        <w:jc w:val="both"/>
+        <w:rPr>
+          <w:sz w:val="24"/>
+          <w:szCs w:val="24"/>
+        </w:rPr>
+      </w:pPr>
+      <w:r>
+        <w:rPr>
+          <w:sz w:val="24"/>
+          <w:szCs w:val="24"/>
+        </w:rPr>
+        <w:t>The microcontroller pulls the data line LOW for about:</w:t>
+      </w:r>
+    </w:p>
+    <w:p>
+      <w:pPr>
+        <w:numPr>
+          <w:ilvl w:val="0"/>
+          <w:numId w:val="26"/>
+        </w:numPr>
+        <w:jc w:val="both"/>
+        <w:rPr>
+          <w:sz w:val="24"/>
+          <w:szCs w:val="24"/>
+        </w:rPr>
+      </w:pPr>
+      <w:r>
+        <w:rPr>
+          <w:sz w:val="24"/>
+          <w:szCs w:val="24"/>
+        </w:rPr>
+        <w:t xml:space="preserve">&gt;1 ms </w:t>
+      </w:r>
+    </w:p>
+    <w:p>
+      <w:pPr>
+        <w:jc w:val="both"/>
+        <w:rPr>
+          <w:sz w:val="24"/>
+          <w:szCs w:val="24"/>
+        </w:rPr>
+      </w:pPr>
+      <w:r>
+        <w:rPr>
+          <w:sz w:val="24"/>
+          <w:szCs w:val="24"/>
+        </w:rPr>
+        <w:t>Then releases it HIGH.</w:t>
+      </w:r>
+    </w:p>
+    <w:p>
+      <w:pPr>
+        <w:jc w:val="both"/>
+        <w:rPr>
+          <w:sz w:val="24"/>
+          <w:szCs w:val="24"/>
+        </w:rPr>
+      </w:pPr>
+    </w:p>
+    <w:p>
+      <w:pPr>
+        <w:jc w:val="both"/>
+        <w:rPr>
+          <w:sz w:val="24"/>
+          <w:szCs w:val="24"/>
+        </w:rPr>
+      </w:pPr>
+      <w:r>
+        <w:rPr>
+          <w:b/>
+          <w:bCs/>
+          <w:sz w:val="24"/>
+          <w:szCs w:val="24"/>
+        </w:rPr>
+        <w:t>Step 2</w:t>
+      </w:r>
+      <w:r>
+        <w:rPr>
+          <w:sz w:val="24"/>
+          <w:szCs w:val="24"/>
+        </w:rPr>
+        <w:t>: DHT22 responds</w:t>
+      </w:r>
+    </w:p>
+    <w:p>
+      <w:pPr>
+        <w:jc w:val="both"/>
+        <w:rPr>
+          <w:sz w:val="24"/>
+          <w:szCs w:val="24"/>
+        </w:rPr>
+      </w:pPr>
+      <w:r>
+        <w:rPr>
+          <w:sz w:val="24"/>
+          <w:szCs w:val="24"/>
+        </w:rPr>
+        <w:t>Sensor replies:</w:t>
+      </w:r>
+    </w:p>
+    <w:p>
+      <w:pPr>
+        <w:numPr>
+          <w:ilvl w:val="0"/>
+          <w:numId w:val="27"/>
+        </w:numPr>
+        <w:jc w:val="both"/>
+        <w:rPr>
+          <w:sz w:val="24"/>
+          <w:szCs w:val="24"/>
+        </w:rPr>
+      </w:pPr>
+      <w:r>
+        <w:rPr>
+          <w:sz w:val="24"/>
+          <w:szCs w:val="24"/>
+        </w:rPr>
+        <w:t xml:space="preserve">LOW for 80 µs </w:t>
+      </w:r>
+    </w:p>
+    <w:p>
+      <w:pPr>
+        <w:numPr>
+          <w:ilvl w:val="0"/>
+          <w:numId w:val="27"/>
+        </w:numPr>
+        <w:jc w:val="both"/>
+        <w:rPr>
+          <w:sz w:val="24"/>
+          <w:szCs w:val="24"/>
+        </w:rPr>
+      </w:pPr>
+      <w:r>
+        <w:rPr>
+          <w:sz w:val="24"/>
+          <w:szCs w:val="24"/>
+        </w:rPr>
+        <w:t xml:space="preserve">HIGH for 80 µs </w:t>
+      </w:r>
+    </w:p>
+    <w:p>
+      <w:pPr>
+        <w:jc w:val="both"/>
+        <w:rPr>
+          <w:sz w:val="24"/>
+          <w:szCs w:val="24"/>
+        </w:rPr>
+      </w:pPr>
+      <w:r>
+        <w:rPr>
+          <w:sz w:val="24"/>
+          <w:szCs w:val="24"/>
+        </w:rPr>
+        <w:t>This means:"I am ready to transmit."</w:t>
+      </w:r>
+    </w:p>
+    <w:p>
+      <w:pPr>
+        <w:jc w:val="both"/>
+        <w:rPr>
+          <w:b/>
+          <w:bCs/>
+          <w:sz w:val="24"/>
+          <w:szCs w:val="24"/>
+        </w:rPr>
+      </w:pPr>
+    </w:p>
+    <w:p>
+      <w:pPr>
+        <w:jc w:val="both"/>
+        <w:rPr>
+          <w:sz w:val="24"/>
+          <w:szCs w:val="24"/>
+        </w:rPr>
+      </w:pPr>
+      <w:r>
+        <w:rPr>
+          <w:b/>
+          <w:bCs/>
+          <w:sz w:val="24"/>
+          <w:szCs w:val="24"/>
+        </w:rPr>
+        <w:t>Step 3</w:t>
+      </w:r>
+      <w:r>
+        <w:rPr>
+          <w:sz w:val="24"/>
+          <w:szCs w:val="24"/>
+        </w:rPr>
+        <w:t>: Sensor sends 40 bits</w:t>
+      </w:r>
+    </w:p>
+    <w:p>
+      <w:pPr>
+        <w:jc w:val="both"/>
+        <w:rPr>
+          <w:sz w:val="24"/>
+          <w:szCs w:val="24"/>
+        </w:rPr>
+      </w:pPr>
+      <w:r>
+        <w:rPr>
+          <w:sz w:val="24"/>
+          <w:szCs w:val="24"/>
+        </w:rPr>
+        <w:t>The data format is:</w:t>
+      </w:r>
+    </w:p>
+    <w:p>
+      <w:pPr>
+        <w:jc w:val="both"/>
+        <w:rPr>
+          <w:sz w:val="24"/>
+          <w:szCs w:val="24"/>
+        </w:rPr>
+      </w:pPr>
+    </w:p>
+    <w:p>
+      <w:pPr>
+        <w:jc w:val="both"/>
+        <w:rPr>
+          <w:b/>
+          <w:bCs/>
+          <w:sz w:val="24"/>
+          <w:szCs w:val="24"/>
+        </w:rPr>
+      </w:pPr>
+    </w:p>
+    <w:tbl>
+      <w:tblPr>
+        <w:tblW w:w="0" w:type="auto"/>
+        <w:tblCellSpacing w:w="15" w:type="dxa"/>
+        <w:tblLayout w:type="fixed"/>
+        <w:tblCellMar>
+          <w:top w:w="15" w:type="dxa"/>
+          <w:left w:w="15" w:type="dxa"/>
+          <w:bottom w:w="15" w:type="dxa"/>
+          <w:right w:w="15" w:type="dxa"/>
+        </w:tblCellMar>
+        <w:tblLook w:val="04A0" w:firstRow="1" w:lastRow="0" w:firstColumn="1" w:lastColumn="0" w:noHBand="0" w:noVBand="1"/>
+      </w:tblPr>
+      <w:tblGrid>
+        <w:gridCol w:w="1843"/>
+        <w:gridCol w:w="2977"/>
+      </w:tblGrid>
+      <w:tr>
+        <w:trPr>
+          <w:tblHeader/>
+          <w:tblCellSpacing w:w="15" w:type="dxa"/>
+        </w:trPr>
+        <w:tc>
+          <w:tcPr>
+            <w:tcW w:w="1798" w:type="dxa"/>
+            <w:vAlign w:val="center"/>
+            <w:hideMark/>
+          </w:tcPr>
+          <w:p>
+            <w:pPr>
+              <w:jc w:val="both"/>
+              <w:rPr>
+                <w:b/>
+                <w:bCs/>
+                <w:sz w:val="24"/>
+                <w:szCs w:val="24"/>
+              </w:rPr>
+            </w:pPr>
+            <w:r>
+              <w:rPr>
+                <w:b/>
+                <w:bCs/>
+                <w:sz w:val="24"/>
+                <w:szCs w:val="24"/>
+              </w:rPr>
+              <w:lastRenderedPageBreak/>
+              <w:t>Bits</w:t>
+            </w:r>
+          </w:p>
+        </w:tc>
+        <w:tc>
+          <w:tcPr>
+            <w:tcW w:w="2932" w:type="dxa"/>
+            <w:vAlign w:val="center"/>
+            <w:hideMark/>
+          </w:tcPr>
+          <w:p>
+            <w:pPr>
+              <w:jc w:val="both"/>
+              <w:rPr>
+                <w:b/>
+                <w:bCs/>
+                <w:sz w:val="24"/>
+                <w:szCs w:val="24"/>
+              </w:rPr>
+            </w:pPr>
+            <w:r>
+              <w:rPr>
+                <w:b/>
+                <w:bCs/>
+                <w:sz w:val="24"/>
+                <w:szCs w:val="24"/>
+              </w:rPr>
+              <w:t>Meaning</w:t>
+            </w:r>
+          </w:p>
+        </w:tc>
+      </w:tr>
+      <w:tr>
+        <w:trPr>
+          <w:tblCellSpacing w:w="15" w:type="dxa"/>
+        </w:trPr>
+        <w:tc>
+          <w:tcPr>
+            <w:tcW w:w="1798" w:type="dxa"/>
+            <w:vAlign w:val="center"/>
+            <w:hideMark/>
+          </w:tcPr>
+          <w:p>
+            <w:pPr>
+              <w:jc w:val="both"/>
+              <w:rPr>
+                <w:sz w:val="24"/>
+                <w:szCs w:val="24"/>
+              </w:rPr>
+            </w:pPr>
+            <w:r>
+              <w:rPr>
+                <w:sz w:val="24"/>
+                <w:szCs w:val="24"/>
+              </w:rPr>
+              <w:t>16 bits</w:t>
+            </w:r>
+          </w:p>
+        </w:tc>
+        <w:tc>
+          <w:tcPr>
+            <w:tcW w:w="2932" w:type="dxa"/>
+            <w:vAlign w:val="center"/>
+            <w:hideMark/>
+          </w:tcPr>
+          <w:p>
+            <w:pPr>
+              <w:jc w:val="both"/>
+              <w:rPr>
+                <w:sz w:val="24"/>
+                <w:szCs w:val="24"/>
+              </w:rPr>
+            </w:pPr>
+            <w:r>
+              <w:rPr>
+                <w:sz w:val="24"/>
+                <w:szCs w:val="24"/>
+              </w:rPr>
+              <w:t>Humidity</w:t>
+            </w:r>
+          </w:p>
+        </w:tc>
+      </w:tr>
+      <w:tr>
+        <w:trPr>
+          <w:tblCellSpacing w:w="15" w:type="dxa"/>
+        </w:trPr>
+        <w:tc>
+          <w:tcPr>
+            <w:tcW w:w="1798" w:type="dxa"/>
+            <w:vAlign w:val="center"/>
+            <w:hideMark/>
+          </w:tcPr>
+          <w:p>
+            <w:pPr>
+              <w:jc w:val="both"/>
+              <w:rPr>
+                <w:sz w:val="24"/>
+                <w:szCs w:val="24"/>
+              </w:rPr>
+            </w:pPr>
+            <w:r>
+              <w:rPr>
+                <w:sz w:val="24"/>
+                <w:szCs w:val="24"/>
+              </w:rPr>
+              <w:t>16 bits</w:t>
+            </w:r>
+          </w:p>
+        </w:tc>
+        <w:tc>
+          <w:tcPr>
+            <w:tcW w:w="2932" w:type="dxa"/>
+            <w:vAlign w:val="center"/>
+            <w:hideMark/>
+          </w:tcPr>
+          <w:p>
+            <w:pPr>
+              <w:jc w:val="both"/>
+              <w:rPr>
+                <w:sz w:val="24"/>
+                <w:szCs w:val="24"/>
+              </w:rPr>
+            </w:pPr>
+            <w:r>
+              <w:rPr>
+                <w:sz w:val="24"/>
+                <w:szCs w:val="24"/>
+              </w:rPr>
+              <w:t>Temperature</w:t>
+            </w:r>
+          </w:p>
+        </w:tc>
+      </w:tr>
+      <w:tr>
+        <w:trPr>
+          <w:tblCellSpacing w:w="15" w:type="dxa"/>
+        </w:trPr>
+        <w:tc>
+          <w:tcPr>
+            <w:tcW w:w="1798" w:type="dxa"/>
+            <w:vAlign w:val="center"/>
+            <w:hideMark/>
+          </w:tcPr>
+          <w:p>
+            <w:pPr>
+              <w:jc w:val="both"/>
+              <w:rPr>
+                <w:sz w:val="24"/>
+                <w:szCs w:val="24"/>
+              </w:rPr>
+            </w:pPr>
+            <w:r>
+              <w:rPr>
+                <w:sz w:val="24"/>
+                <w:szCs w:val="24"/>
+              </w:rPr>
+              <w:t>8 bits</w:t>
+            </w:r>
+          </w:p>
+        </w:tc>
+        <w:tc>
+          <w:tcPr>
+            <w:tcW w:w="2932" w:type="dxa"/>
+            <w:vAlign w:val="center"/>
+            <w:hideMark/>
+          </w:tcPr>
+          <w:p>
+            <w:pPr>
+              <w:jc w:val="both"/>
+              <w:rPr>
+                <w:sz w:val="24"/>
+                <w:szCs w:val="24"/>
+              </w:rPr>
+            </w:pPr>
+            <w:r>
+              <w:rPr>
+                <w:sz w:val="24"/>
+                <w:szCs w:val="24"/>
+              </w:rPr>
+              <w:t>Checksum</w:t>
+            </w:r>
+          </w:p>
+        </w:tc>
+      </w:tr>
+    </w:tbl>
+    <w:p>
+      <w:pPr>
+        <w:jc w:val="both"/>
+        <w:rPr>
+          <w:b/>
+          <w:bCs/>
+          <w:sz w:val="24"/>
+          <w:szCs w:val="24"/>
+        </w:rPr>
+      </w:pPr>
+      <w:r>
+        <w:rPr>
+          <w:b/>
+          <w:bCs/>
+          <w:sz w:val="24"/>
+          <w:szCs w:val="24"/>
+        </w:rPr>
+        <w:t>How Bits Are Encoded</w:t>
+      </w:r>
+    </w:p>
+    <w:p>
+      <w:pPr>
+        <w:jc w:val="both"/>
+        <w:rPr>
+          <w:sz w:val="24"/>
+          <w:szCs w:val="24"/>
+        </w:rPr>
+      </w:pPr>
+      <w:r>
+        <w:rPr>
+          <w:sz w:val="24"/>
+          <w:szCs w:val="24"/>
+        </w:rPr>
+        <w:t>Each bit starts with:</w:t>
+      </w:r>
+    </w:p>
+    <w:p>
+      <w:pPr>
+        <w:numPr>
+          <w:ilvl w:val="0"/>
+          <w:numId w:val="28"/>
+        </w:numPr>
+        <w:jc w:val="both"/>
+        <w:rPr>
+          <w:sz w:val="24"/>
+          <w:szCs w:val="24"/>
+        </w:rPr>
+      </w:pPr>
+      <w:r>
+        <w:rPr>
+          <w:sz w:val="24"/>
+          <w:szCs w:val="24"/>
+        </w:rPr>
+        <w:t xml:space="preserve">LOW for 50 µs </w:t>
+      </w:r>
+    </w:p>
+    <w:p>
+      <w:pPr>
+        <w:jc w:val="both"/>
+        <w:rPr>
+          <w:sz w:val="24"/>
+          <w:szCs w:val="24"/>
+        </w:rPr>
+      </w:pPr>
+      <w:r>
+        <w:rPr>
+          <w:sz w:val="24"/>
+          <w:szCs w:val="24"/>
+        </w:rPr>
+        <w:t>Then HIGH pulse duration decides whether it is 0 or 1.</w:t>
+      </w:r>
+    </w:p>
+    <w:tbl>
+      <w:tblPr>
+        <w:tblW w:w="0" w:type="auto"/>
+        <w:tblCellSpacing w:w="15" w:type="dxa"/>
+        <w:tblCellMar>
+          <w:top w:w="15" w:type="dxa"/>
+          <w:left w:w="15" w:type="dxa"/>
+          <w:bottom w:w="15" w:type="dxa"/>
+          <w:right w:w="15" w:type="dxa"/>
+        </w:tblCellMar>
+        <w:tblLook w:val="04A0" w:firstRow="1" w:lastRow="0" w:firstColumn="1" w:lastColumn="0" w:noHBand="0" w:noVBand="1"/>
+      </w:tblPr>
+      <w:tblGrid>
+        <w:gridCol w:w="2268"/>
+        <w:gridCol w:w="426"/>
+      </w:tblGrid>
+      <w:tr>
+        <w:trPr>
+          <w:tblHeader/>
+          <w:tblCellSpacing w:w="15" w:type="dxa"/>
+        </w:trPr>
+        <w:tc>
+          <w:tcPr>
+            <w:tcW w:w="2223" w:type="dxa"/>
+            <w:vAlign w:val="center"/>
+            <w:hideMark/>
+          </w:tcPr>
+          <w:p>
+            <w:pPr>
+              <w:jc w:val="both"/>
+              <w:rPr>
+                <w:b/>
+                <w:bCs/>
+                <w:sz w:val="24"/>
+                <w:szCs w:val="24"/>
+              </w:rPr>
+            </w:pPr>
+            <w:r>
+              <w:rPr>
+                <w:b/>
+                <w:bCs/>
+                <w:sz w:val="24"/>
+                <w:szCs w:val="24"/>
+              </w:rPr>
+              <w:t>HIGH Duration</w:t>
+            </w:r>
+          </w:p>
+        </w:tc>
+        <w:tc>
+          <w:tcPr>
+            <w:tcW w:w="381" w:type="dxa"/>
+            <w:vAlign w:val="center"/>
+            <w:hideMark/>
+          </w:tcPr>
+          <w:p>
+            <w:pPr>
+              <w:jc w:val="both"/>
+              <w:rPr>
+                <w:b/>
+                <w:bCs/>
+                <w:sz w:val="24"/>
+                <w:szCs w:val="24"/>
+              </w:rPr>
+            </w:pPr>
+            <w:r>
+              <w:rPr>
+                <w:b/>
+                <w:bCs/>
+                <w:sz w:val="24"/>
+                <w:szCs w:val="24"/>
+              </w:rPr>
+              <w:t>Bit</w:t>
+            </w:r>
+          </w:p>
+        </w:tc>
+      </w:tr>
+      <w:tr>
+        <w:trPr>
+          <w:tblCellSpacing w:w="15" w:type="dxa"/>
+        </w:trPr>
+        <w:tc>
+          <w:tcPr>
+            <w:tcW w:w="2223" w:type="dxa"/>
+            <w:vAlign w:val="center"/>
+            <w:hideMark/>
+          </w:tcPr>
+          <w:p>
+            <w:pPr>
+              <w:jc w:val="both"/>
+              <w:rPr>
+                <w:sz w:val="24"/>
+                <w:szCs w:val="24"/>
+              </w:rPr>
+            </w:pPr>
+            <w:r>
+              <w:rPr>
+                <w:sz w:val="24"/>
+                <w:szCs w:val="24"/>
+              </w:rPr>
+              <w:t>~26–28 µs</w:t>
+            </w:r>
+          </w:p>
+        </w:tc>
+        <w:tc>
+          <w:tcPr>
+            <w:tcW w:w="381" w:type="dxa"/>
+            <w:vAlign w:val="center"/>
+            <w:hideMark/>
+          </w:tcPr>
+          <w:p>
+            <w:pPr>
+              <w:jc w:val="both"/>
+              <w:rPr>
+                <w:sz w:val="24"/>
+                <w:szCs w:val="24"/>
+              </w:rPr>
+            </w:pPr>
+            <w:r>
+              <w:rPr>
+                <w:sz w:val="24"/>
+                <w:szCs w:val="24"/>
+              </w:rPr>
+              <w:t>0</w:t>
+            </w:r>
+          </w:p>
+        </w:tc>
+      </w:tr>
+      <w:tr>
+        <w:trPr>
+          <w:tblCellSpacing w:w="15" w:type="dxa"/>
+        </w:trPr>
+        <w:tc>
+          <w:tcPr>
+            <w:tcW w:w="2223" w:type="dxa"/>
+            <w:vAlign w:val="center"/>
+            <w:hideMark/>
+          </w:tcPr>
+          <w:p>
+            <w:pPr>
+              <w:jc w:val="both"/>
+              <w:rPr>
+                <w:sz w:val="24"/>
+                <w:szCs w:val="24"/>
+              </w:rPr>
+            </w:pPr>
+            <w:r>
+              <w:rPr>
+                <w:sz w:val="24"/>
+                <w:szCs w:val="24"/>
+              </w:rPr>
+              <w:t>~70 µs</w:t>
+            </w:r>
+          </w:p>
+        </w:tc>
+        <w:tc>
+          <w:tcPr>
+            <w:tcW w:w="381" w:type="dxa"/>
+            <w:vAlign w:val="center"/>
+            <w:hideMark/>
+          </w:tcPr>
+          <w:p>
+            <w:pPr>
+              <w:jc w:val="both"/>
+              <w:rPr>
+                <w:sz w:val="24"/>
+                <w:szCs w:val="24"/>
+              </w:rPr>
+            </w:pPr>
+            <w:r>
+              <w:rPr>
+                <w:sz w:val="24"/>
+                <w:szCs w:val="24"/>
+              </w:rPr>
+              <w:t>1</w:t>
+            </w:r>
+          </w:p>
+        </w:tc>
+      </w:tr>
+    </w:tbl>
+    <w:p>
+      <w:pPr>
+        <w:jc w:val="both"/>
+        <w:rPr>
+          <w:sz w:val="24"/>
+          <w:szCs w:val="24"/>
+        </w:rPr>
+      </w:pPr>
+      <w:r>
+        <w:rPr>
+          <w:sz w:val="24"/>
+          <w:szCs w:val="24"/>
+        </w:rPr>
+        <w:t>So MCU measures pulse width</w:t>
+      </w:r>
+      <w:r>
+        <w:rPr>
+          <w:sz w:val="24"/>
+          <w:szCs w:val="24"/>
+        </w:rPr>
+        <w:t xml:space="preserve"> to facilitate data transmission.</w:t>
+      </w:r>
+    </w:p>
+    <w:p>
+      <w:pPr>
+        <w:jc w:val="both"/>
+        <w:rPr>
+          <w:b/>
+          <w:bCs/>
+          <w:sz w:val="24"/>
+          <w:szCs w:val="24"/>
+        </w:rPr>
+      </w:pPr>
+      <w:r>
+        <w:rPr>
+          <w:b/>
+          <w:bCs/>
+          <w:sz w:val="24"/>
+          <w:szCs w:val="24"/>
+        </w:rPr>
+        <w:t>Step 4:</w:t>
+      </w:r>
+      <w:r>
+        <w:rPr>
+          <w:rFonts w:ascii="Times New Roman" w:eastAsia="Times New Roman" w:hAnsi="Times New Roman" w:cs="Times New Roman"/>
+          <w:b/>
+          <w:bCs/>
+          <w:kern w:val="36"/>
+          <w:sz w:val="48"/>
+          <w:szCs w:val="48"/>
+          <w:lang w:eastAsia="en-IN"/>
+          <w14:ligatures w14:val="none"/>
+        </w:rPr>
+        <w:t xml:space="preserve"> </w:t>
+      </w:r>
+      <w:r>
+        <w:rPr>
+          <w:sz w:val="24"/>
+          <w:szCs w:val="24"/>
+        </w:rPr>
+        <w:t>Data Format</w:t>
+      </w:r>
+    </w:p>
+    <w:p>
+      <w:pPr>
+        <w:jc w:val="both"/>
+        <w:rPr>
+          <w:sz w:val="24"/>
+          <w:szCs w:val="24"/>
+        </w:rPr>
+      </w:pPr>
+      <w:r>
+        <w:rPr>
+          <w:sz w:val="24"/>
+          <w:szCs w:val="24"/>
+        </w:rPr>
+        <w:t>The 40 bits are grouped into 5 bytes</w:t>
+      </w:r>
+      <w:r>
+        <w:rPr>
+          <w:sz w:val="24"/>
+          <w:szCs w:val="24"/>
+        </w:rPr>
+        <w:t xml:space="preserve">. </w:t>
+      </w:r>
+      <w:r>
+        <w:rPr>
+          <w:sz w:val="24"/>
+          <w:szCs w:val="24"/>
+        </w:rPr>
+        <w:t>The sensor</w:t>
+      </w:r>
+      <w:r>
+        <w:rPr>
+          <w:sz w:val="24"/>
+          <w:szCs w:val="24"/>
+        </w:rPr>
+        <w:t xml:space="preserve"> sends</w:t>
+      </w:r>
+      <w:r>
+        <w:rPr>
+          <w:sz w:val="24"/>
+          <w:szCs w:val="24"/>
+        </w:rPr>
+        <w:t xml:space="preserve"> </w:t>
+      </w:r>
+      <w:r>
+        <w:rPr>
+          <w:sz w:val="24"/>
+          <w:szCs w:val="24"/>
+        </w:rPr>
+        <w:t xml:space="preserve">the data in </w:t>
+      </w:r>
+      <w:r>
+        <w:rPr>
+          <w:sz w:val="24"/>
+          <w:szCs w:val="24"/>
+        </w:rPr>
+        <w:t>following format</w:t>
+      </w:r>
+      <w:r>
+        <w:rPr>
+          <w:sz w:val="24"/>
+          <w:szCs w:val="24"/>
+        </w:rPr>
+        <w:t>:</w:t>
+      </w:r>
+    </w:p>
+    <w:p>
+      <w:pPr>
+        <w:pStyle w:val="ListParagraph"/>
+        <w:numPr>
+          <w:ilvl w:val="0"/>
+          <w:numId w:val="29"/>
+        </w:numPr>
+        <w:jc w:val="both"/>
+        <w:rPr>
+          <w:sz w:val="24"/>
+          <w:szCs w:val="24"/>
+        </w:rPr>
+      </w:pPr>
+      <w:r>
+        <w:rPr>
+          <w:sz w:val="24"/>
+          <w:szCs w:val="24"/>
+        </w:rPr>
+        <w:t>Byte 1</w:t>
+      </w:r>
+      <w:r>
+        <w:rPr>
+          <w:sz w:val="24"/>
+          <w:szCs w:val="24"/>
+        </w:rPr>
+        <w:t>:</w:t>
+      </w:r>
+      <w:r>
+        <w:rPr>
+          <w:sz w:val="24"/>
+          <w:szCs w:val="24"/>
+        </w:rPr>
+        <w:t xml:space="preserve"> -</w:t>
+      </w:r>
+      <w:r>
+        <w:rPr>
+          <w:sz w:val="24"/>
+          <w:szCs w:val="24"/>
+        </w:rPr>
+        <w:t xml:space="preserve"> </w:t>
+      </w:r>
+      <w:r>
+        <w:rPr>
+          <w:sz w:val="24"/>
+          <w:szCs w:val="24"/>
+        </w:rPr>
+        <w:t>8-bit Humidity Integer</w:t>
+      </w:r>
+    </w:p>
+    <w:p>
+      <w:pPr>
+        <w:pStyle w:val="ListParagraph"/>
+        <w:numPr>
+          <w:ilvl w:val="0"/>
+          <w:numId w:val="29"/>
+        </w:numPr>
+        <w:jc w:val="both"/>
+        <w:rPr>
+          <w:sz w:val="24"/>
+          <w:szCs w:val="24"/>
+        </w:rPr>
+      </w:pPr>
+      <w:r>
+        <w:rPr>
+          <w:sz w:val="24"/>
+          <w:szCs w:val="24"/>
+        </w:rPr>
+        <w:t xml:space="preserve">Byte </w:t>
+      </w:r>
+      <w:r>
+        <w:rPr>
+          <w:sz w:val="24"/>
+          <w:szCs w:val="24"/>
+        </w:rPr>
+        <w:t>2</w:t>
+      </w:r>
+      <w:r>
+        <w:rPr>
+          <w:sz w:val="24"/>
+          <w:szCs w:val="24"/>
+        </w:rPr>
+        <w:t>:</w:t>
+      </w:r>
+      <w:r>
+        <w:rPr>
+          <w:sz w:val="24"/>
+          <w:szCs w:val="24"/>
+        </w:rPr>
+        <w:t xml:space="preserve"> </w:t>
+      </w:r>
+      <w:r>
+        <w:rPr>
+          <w:sz w:val="24"/>
+          <w:szCs w:val="24"/>
+        </w:rPr>
+        <w:t>-</w:t>
+      </w:r>
+      <w:r>
+        <w:rPr>
+          <w:sz w:val="24"/>
+          <w:szCs w:val="24"/>
+        </w:rPr>
+        <w:t>8-bit Humidity Decimal</w:t>
+      </w:r>
+    </w:p>
+    <w:p>
+      <w:pPr>
+        <w:pStyle w:val="ListParagraph"/>
+        <w:numPr>
+          <w:ilvl w:val="0"/>
+          <w:numId w:val="29"/>
+        </w:numPr>
+        <w:jc w:val="both"/>
+        <w:rPr>
+          <w:sz w:val="24"/>
+          <w:szCs w:val="24"/>
+        </w:rPr>
+      </w:pPr>
+      <w:r>
+        <w:rPr>
+          <w:sz w:val="24"/>
+          <w:szCs w:val="24"/>
+        </w:rPr>
+        <w:t xml:space="preserve">Byte </w:t>
+      </w:r>
+      <w:r>
+        <w:rPr>
+          <w:sz w:val="24"/>
+          <w:szCs w:val="24"/>
+        </w:rPr>
+        <w:t>3</w:t>
+      </w:r>
+      <w:r>
+        <w:rPr>
+          <w:sz w:val="24"/>
+          <w:szCs w:val="24"/>
+        </w:rPr>
+        <w:t>:</w:t>
+      </w:r>
+      <w:r>
+        <w:rPr>
+          <w:sz w:val="24"/>
+          <w:szCs w:val="24"/>
+        </w:rPr>
+        <w:t xml:space="preserve"> </w:t>
+      </w:r>
+      <w:r>
+        <w:rPr>
+          <w:sz w:val="24"/>
+          <w:szCs w:val="24"/>
+        </w:rPr>
+        <w:t>-</w:t>
+      </w:r>
+      <w:r>
+        <w:rPr>
+          <w:sz w:val="24"/>
+          <w:szCs w:val="24"/>
+        </w:rPr>
+        <w:t xml:space="preserve"> </w:t>
+      </w:r>
+      <w:r>
+        <w:rPr>
+          <w:sz w:val="24"/>
+          <w:szCs w:val="24"/>
+        </w:rPr>
+        <w:t>8-bit Temperature Integer</w:t>
+      </w:r>
+    </w:p>
+    <w:p>
+      <w:pPr>
+        <w:pStyle w:val="ListParagraph"/>
+        <w:numPr>
+          <w:ilvl w:val="0"/>
+          <w:numId w:val="29"/>
+        </w:numPr>
+        <w:jc w:val="both"/>
+        <w:rPr>
+          <w:sz w:val="24"/>
+          <w:szCs w:val="24"/>
+        </w:rPr>
+      </w:pPr>
+      <w:r>
+        <w:rPr>
+          <w:sz w:val="24"/>
+          <w:szCs w:val="24"/>
+        </w:rPr>
+        <w:t xml:space="preserve">Byte </w:t>
+      </w:r>
+      <w:r>
+        <w:rPr>
+          <w:sz w:val="24"/>
+          <w:szCs w:val="24"/>
+        </w:rPr>
+        <w:t>4</w:t>
+      </w:r>
+      <w:r>
+        <w:rPr>
+          <w:sz w:val="24"/>
+          <w:szCs w:val="24"/>
+        </w:rPr>
+        <w:t>:</w:t>
+      </w:r>
+      <w:r>
+        <w:rPr>
+          <w:sz w:val="24"/>
+          <w:szCs w:val="24"/>
+        </w:rPr>
+        <w:t xml:space="preserve"> </w:t>
+      </w:r>
+      <w:r>
+        <w:rPr>
+          <w:sz w:val="24"/>
+          <w:szCs w:val="24"/>
+        </w:rPr>
+        <w:t>-</w:t>
+      </w:r>
+      <w:r>
+        <w:rPr>
+          <w:sz w:val="24"/>
+          <w:szCs w:val="24"/>
+        </w:rPr>
+        <w:t xml:space="preserve"> </w:t>
+      </w:r>
+      <w:r>
+        <w:rPr>
+          <w:sz w:val="24"/>
+          <w:szCs w:val="24"/>
+        </w:rPr>
+        <w:t>8-bit Temperature Decimal</w:t>
+      </w:r>
+    </w:p>
+    <w:p>
+      <w:pPr>
+        <w:pStyle w:val="ListParagraph"/>
+        <w:numPr>
+          <w:ilvl w:val="0"/>
+          <w:numId w:val="29"/>
+        </w:numPr>
+        <w:jc w:val="both"/>
+        <w:rPr>
+          <w:sz w:val="24"/>
+          <w:szCs w:val="24"/>
+        </w:rPr>
+      </w:pPr>
+      <w:r>
+        <w:rPr>
+          <w:sz w:val="24"/>
+          <w:szCs w:val="24"/>
+        </w:rPr>
+        <w:t xml:space="preserve">Byte </w:t>
+      </w:r>
+      <w:r>
+        <w:rPr>
+          <w:sz w:val="24"/>
+          <w:szCs w:val="24"/>
+        </w:rPr>
+        <w:t>5</w:t>
+      </w:r>
+      <w:r>
+        <w:rPr>
+          <w:sz w:val="24"/>
+          <w:szCs w:val="24"/>
+        </w:rPr>
+        <w:t>:</w:t>
+      </w:r>
+      <w:r>
+        <w:rPr>
+          <w:sz w:val="24"/>
+          <w:szCs w:val="24"/>
+        </w:rPr>
+        <w:t xml:space="preserve"> </w:t>
+      </w:r>
+      <w:r>
+        <w:rPr>
+          <w:sz w:val="24"/>
+          <w:szCs w:val="24"/>
+        </w:rPr>
+        <w:t>-</w:t>
+      </w:r>
+      <w:r>
+        <w:rPr>
+          <w:sz w:val="24"/>
+          <w:szCs w:val="24"/>
+        </w:rPr>
+        <w:t xml:space="preserve"> </w:t>
+      </w:r>
+      <w:r>
+        <w:rPr>
+          <w:sz w:val="24"/>
+          <w:szCs w:val="24"/>
+        </w:rPr>
+        <w:t>8-bit Checksum</w:t>
+      </w:r>
+    </w:p>
+    <w:p>
+      <w:pPr>
+        <w:jc w:val="both"/>
+        <w:rPr>
+          <w:sz w:val="24"/>
+          <w:szCs w:val="24"/>
+        </w:rPr>
+      </w:pPr>
+      <w:r>
+        <w:rPr>
+          <w:b/>
+          <w:bCs/>
+          <w:sz w:val="24"/>
+          <w:szCs w:val="24"/>
+        </w:rPr>
+        <w:t>Step 5</w:t>
+      </w:r>
+      <w:r>
+        <w:rPr>
+          <w:sz w:val="24"/>
+          <w:szCs w:val="24"/>
+        </w:rPr>
+        <w:t>: Interpretation of temperature and humidity values</w:t>
+      </w:r>
+    </w:p>
+    <w:p>
+      <w:pPr>
+        <w:jc w:val="both"/>
+        <w:rPr>
+          <w:sz w:val="24"/>
+          <w:szCs w:val="24"/>
+        </w:rPr>
+      </w:pPr>
+      <w:r>
+        <w:rPr>
+          <w:sz w:val="24"/>
+          <w:szCs w:val="24"/>
+        </w:rPr>
+        <w:t>The actual formula for calculating temperature and humidity is shown below:</w:t>
+      </w:r>
+    </w:p>
+    <w:p>
+      <w:pPr>
+        <w:jc w:val="center"/>
+        <w:rPr>
+          <w:sz w:val="24"/>
+          <w:szCs w:val="24"/>
+        </w:rPr>
+      </w:pPr>
+      <w:r>
+        <w:rPr>
+          <w:sz w:val="24"/>
+          <w:szCs w:val="24"/>
+        </w:rPr>
+        <w:drawing>
+          <wp:inline distT="0" distB="0" distL="0" distR="0" wp14:anchorId="4C7EE371" wp14:editId="6B725D3A">
+            <wp:extent cx="2202007" cy="1297908"/>
+            <wp:effectExtent l="0" t="0" r="8255" b="0"/>
+            <wp:docPr id="306012088" name="Picture 1"/>
+            <wp:cNvGraphicFramePr>
+              <a:graphicFrameLocks xmlns:a="http://schemas.openxmlformats.org/drawingml/2006/main" noChangeAspect="1"/>
+            </wp:cNvGraphicFramePr>
+            <a:graphic xmlns:a="http://schemas.openxmlformats.org/drawingml/2006/main">
+              <a:graphicData uri="http://schemas.openxmlformats.org/drawingml/2006/picture">
+                <pic:pic xmlns:pic="http://schemas.openxmlformats.org/drawingml/2006/picture">
+                  <pic:nvPicPr>
+                    <pic:cNvPr id="306012088" name=""/>
+                    <pic:cNvPicPr/>
+                  </pic:nvPicPr>
+                  <pic:blipFill>
+                    <a:blip r:embed="rId14"/>
+                    <a:stretch>
+                      <a:fillRect/>
+                    </a:stretch>
+                  </pic:blipFill>
+                  <pic:spPr>
+                    <a:xfrm>
+                      <a:off x="0" y="0"/>
+                      <a:ext cx="2209750" cy="1302472"/>
+                    </a:xfrm>
+                    <a:prstGeom prst="rect">
+                      <a:avLst/>
+                    </a:prstGeom>
+                  </pic:spPr>
+                </pic:pic>
+              </a:graphicData>
+            </a:graphic>
+          </wp:inline>
+        </w:drawing>
+      </w:r>
+    </w:p>
+    <w:p>
+      <w:pPr>
+        <w:jc w:val="both"/>
+        <w:rPr>
+          <w:sz w:val="24"/>
+          <w:szCs w:val="24"/>
+        </w:rPr>
+      </w:pPr>
+    </w:p>
+    <w:p>
+      <w:pPr>
+        <w:jc w:val="both"/>
+        <w:rPr>
+          <w:sz w:val="24"/>
+          <w:szCs w:val="24"/>
+        </w:rPr>
+      </w:pPr>
+    </w:p>
+    <w:p>
+      <w:pPr>
+        <w:jc w:val="both"/>
+        <w:rPr>
+          <w:sz w:val="24"/>
+          <w:szCs w:val="24"/>
+        </w:rPr>
+      </w:pPr>
+    </w:p>
+    <w:p>
+      <w:pPr>
+        <w:jc w:val="both"/>
+        <w:rPr>
+          <w:sz w:val="24"/>
+          <w:szCs w:val="24"/>
+        </w:rPr>
+      </w:pPr>
+    </w:p>
+    <w:p>
+      <w:pPr>
+        <w:jc w:val="both"/>
+        <w:rPr>
+          <w:sz w:val="24"/>
+          <w:szCs w:val="24"/>
+          <w:lang w:val="en-US"/>
+        </w:rPr>
+      </w:pPr>
+      <w:r>
+        <w:rPr>
+          <w:sz w:val="24"/>
+          <w:szCs w:val="24"/>
+          <w:lang w:val="en-US"/>
+        </w:rPr>
+        <w:lastRenderedPageBreak/>
+        <w:t xml:space="preserve">But we use some bit level operations to read data from DHT22 sensor </w:t>
+      </w:r>
+      <w:r>
+        <w:rPr>
+          <w:sz w:val="24"/>
+          <w:szCs w:val="24"/>
+          <w:lang w:val="en-US"/>
+        </w:rPr>
+        <w:t>and output in digital format.</w:t>
+      </w:r>
+    </w:p>
+    <w:p>
+      <w:pPr>
+        <w:pStyle w:val="ListParagraph"/>
+        <w:numPr>
+          <w:ilvl w:val="0"/>
+          <w:numId w:val="30"/>
+        </w:numPr>
+        <w:jc w:val="both"/>
+        <w:rPr>
+          <w:sz w:val="24"/>
+          <w:szCs w:val="24"/>
+          <w:lang w:val="en-US"/>
+        </w:rPr>
+      </w:pPr>
+      <w:r>
+        <w:rPr>
+          <w:b/>
+          <w:bCs/>
+          <w:sz w:val="24"/>
+          <w:szCs w:val="24"/>
+          <w:lang w:val="en-US"/>
+        </w:rPr>
+        <w:t>Humidity</w:t>
+      </w:r>
+      <w:r>
+        <w:rPr>
+          <w:sz w:val="24"/>
+          <w:szCs w:val="24"/>
+          <w:lang w:val="en-US"/>
+        </w:rPr>
+        <w:t>=</w:t>
+      </w:r>
+      <w:r>
+        <w:t xml:space="preserve"> </w:t>
+      </w:r>
+      <w:r>
+        <w:rPr>
+          <w:sz w:val="24"/>
+          <w:szCs w:val="24"/>
+        </w:rPr>
+        <w:t>((Byte1 &lt;&lt; 8) | Byte2) / 10.0</w:t>
+      </w:r>
+    </w:p>
+    <w:p>
+      <w:pPr>
+        <w:pStyle w:val="ListParagraph"/>
+        <w:numPr>
+          <w:ilvl w:val="0"/>
+          <w:numId w:val="30"/>
+        </w:numPr>
+        <w:jc w:val="both"/>
+        <w:rPr>
+          <w:sz w:val="24"/>
+          <w:szCs w:val="24"/>
+          <w:lang w:val="en-US"/>
+        </w:rPr>
+      </w:pPr>
+      <w:r>
+        <w:rPr>
+          <w:b/>
+          <w:bCs/>
+          <w:sz w:val="24"/>
+          <w:szCs w:val="24"/>
+        </w:rPr>
+        <w:t>Temperature</w:t>
+      </w:r>
+      <w:r>
+        <w:rPr>
+          <w:sz w:val="24"/>
+          <w:szCs w:val="24"/>
+        </w:rPr>
+        <w:t>=</w:t>
+      </w:r>
+      <w:r>
+        <w:t xml:space="preserve"> </w:t>
+      </w:r>
+      <w:r>
+        <w:rPr>
+          <w:sz w:val="24"/>
+          <w:szCs w:val="24"/>
+        </w:rPr>
+        <w:t>((Byte3 &lt;&lt; 8) | Byte4) / 10.0</w:t>
+      </w:r>
+    </w:p>
+    <w:p>
+      <w:pPr>
+        <w:pStyle w:val="ListParagraph"/>
+        <w:numPr>
+          <w:ilvl w:val="0"/>
+          <w:numId w:val="30"/>
+        </w:numPr>
+        <w:jc w:val="both"/>
+        <w:rPr>
+          <w:sz w:val="24"/>
+          <w:szCs w:val="24"/>
+          <w:lang w:val="en-US"/>
+        </w:rPr>
+      </w:pPr>
+      <w:r>
+        <w:rPr>
+          <w:sz w:val="24"/>
+          <w:szCs w:val="24"/>
+        </w:rPr>
+        <w:t>If the MSB of Byte3 is set → temperature is negative.</w:t>
+      </w:r>
+    </w:p>
+    <w:p>
+      <w:pPr>
+        <w:pStyle w:val="ListParagraph"/>
+        <w:numPr>
+          <w:ilvl w:val="0"/>
+          <w:numId w:val="30"/>
+        </w:numPr>
+        <w:jc w:val="both"/>
+        <w:rPr>
+          <w:sz w:val="24"/>
+          <w:szCs w:val="24"/>
+          <w:lang w:val="en-US"/>
+        </w:rPr>
+      </w:pPr>
+      <w:r>
+        <w:rPr>
+          <w:b/>
+          <w:bCs/>
+          <w:sz w:val="24"/>
+          <w:szCs w:val="24"/>
+        </w:rPr>
+        <w:t>Checksum</w:t>
+      </w:r>
+      <w:r>
+        <w:rPr>
+          <w:sz w:val="24"/>
+          <w:szCs w:val="24"/>
+        </w:rPr>
+        <w:t xml:space="preserve"> = (Byte1 + Byte2 + Byte3 + Byte4) &amp; 0xFF</w:t>
+      </w:r>
+    </w:p>
+    <w:p>
+      <w:pPr>
+        <w:pStyle w:val="ListParagraph"/>
+        <w:numPr>
+          <w:ilvl w:val="0"/>
+          <w:numId w:val="30"/>
+        </w:numPr>
+        <w:jc w:val="both"/>
+        <w:rPr>
+          <w:b/>
+          <w:bCs/>
+          <w:sz w:val="24"/>
+          <w:szCs w:val="24"/>
+          <w:lang w:val="en-US"/>
+        </w:rPr>
+      </w:pPr>
+      <w:r>
+        <w:rPr>
+          <w:sz w:val="24"/>
+          <w:szCs w:val="24"/>
+        </w:rPr>
+        <w:t>Note that checksum m</w:t>
+      </w:r>
+      <w:r>
+        <w:rPr>
+          <w:sz w:val="24"/>
+          <w:szCs w:val="24"/>
+        </w:rPr>
+        <w:t>ust equal Byte5, otherwise reading is invalid</w:t>
+      </w:r>
+      <w:r>
+        <w:rPr>
+          <w:b/>
+          <w:bCs/>
+          <w:sz w:val="24"/>
+          <w:szCs w:val="24"/>
+        </w:rPr>
+        <w:t>.</w:t>
+      </w:r>
+    </w:p>
+    <w:p>
+      <w:pPr>
+        <w:pStyle w:val="ListParagraph"/>
+        <w:numPr>
+          <w:ilvl w:val="0"/>
+          <w:numId w:val="30"/>
+        </w:numPr>
+        <w:jc w:val="both"/>
+      </w:pPr>
+      <w:r>
+        <w:rPr>
+          <w:sz w:val="24"/>
+          <w:szCs w:val="24"/>
+        </w:rPr>
+        <w:t xml:space="preserve">The left shift operation is done because, </w:t>
+      </w:r>
+      <w:r>
+        <w:rPr>
+          <w:sz w:val="24"/>
+          <w:szCs w:val="24"/>
+        </w:rPr>
+        <w:t>t</w:t>
+      </w:r>
+      <w:r>
+        <w:rPr>
+          <w:sz w:val="24"/>
+          <w:szCs w:val="24"/>
+        </w:rPr>
+        <w:t>he DHT22 sends humidity and temperature as 16</w:t>
+      </w:r>
+      <w:r>
+        <w:rPr>
+          <w:sz w:val="24"/>
+          <w:szCs w:val="24"/>
+        </w:rPr>
+        <w:noBreakHyphen/>
+        <w:t>bit numbers split into two 8</w:t>
+      </w:r>
+      <w:r>
+        <w:rPr>
+          <w:sz w:val="24"/>
+          <w:szCs w:val="24"/>
+        </w:rPr>
+        <w:noBreakHyphen/>
+        <w:t>bit bytes.</w:t>
+      </w:r>
+      <w:r>
+        <w:rPr>
+          <w:sz w:val="24"/>
+          <w:szCs w:val="24"/>
+        </w:rPr>
+        <w:t xml:space="preserve"> </w:t>
+      </w:r>
+      <w:r>
+        <w:rPr>
+          <w:sz w:val="24"/>
+          <w:szCs w:val="24"/>
+        </w:rPr>
+        <w:t>Byte1 is the high byte, Byte2 is the low byte.</w:t>
+      </w:r>
+      <w:r>
+        <w:rPr>
+          <w:sz w:val="24"/>
+          <w:szCs w:val="24"/>
+        </w:rPr>
+        <w:t xml:space="preserve"> </w:t>
+      </w:r>
+      <w:r>
+        <w:rPr>
+          <w:sz w:val="24"/>
+          <w:szCs w:val="24"/>
+        </w:rPr>
+        <w:t>To reconstruct the full 16</w:t>
+      </w:r>
+      <w:r>
+        <w:rPr>
+          <w:sz w:val="24"/>
+          <w:szCs w:val="24"/>
+        </w:rPr>
+        <w:noBreakHyphen/>
+        <w:t>bit value, you shift the high byte left by 8 bits and OR it with the low byte.</w:t>
+      </w:r>
+    </w:p>
+    <w:p>
+      <w:pPr>
+        <w:pStyle w:val="ListParagraph"/>
+        <w:numPr>
+          <w:ilvl w:val="0"/>
+          <w:numId w:val="30"/>
+        </w:numPr>
+        <w:jc w:val="both"/>
+        <w:rPr>
+          <w:sz w:val="24"/>
+          <w:szCs w:val="24"/>
+          <w:lang w:val="en-US"/>
+        </w:rPr>
+      </w:pPr>
+      <w:r>
+        <w:rPr>
+          <w:sz w:val="24"/>
+          <w:szCs w:val="24"/>
+        </w:rPr>
+        <w:t xml:space="preserve">In other words, </w:t>
+      </w:r>
+      <w:r>
+        <w:rPr>
+          <w:sz w:val="24"/>
+          <w:szCs w:val="24"/>
+        </w:rPr>
+        <w:t>(Byte1 &lt;&lt; 8) | Byte2 is how you combine two 8</w:t>
+      </w:r>
+      <w:r>
+        <w:rPr>
+          <w:sz w:val="24"/>
+          <w:szCs w:val="24"/>
+        </w:rPr>
+        <w:noBreakHyphen/>
+        <w:t>bit pieces into one 16</w:t>
+      </w:r>
+      <w:r>
+        <w:rPr>
+          <w:sz w:val="24"/>
+          <w:szCs w:val="24"/>
+        </w:rPr>
+        <w:noBreakHyphen/>
+        <w:t>bit number. The left shift moves the high byte into the upper half, and the OR adds the low byte into the lower half.</w:t>
+      </w:r>
+    </w:p>
+    <w:p>
+      <w:pPr>
+        <w:pStyle w:val="ListParagraph"/>
+        <w:numPr>
+          <w:ilvl w:val="0"/>
+          <w:numId w:val="30"/>
+        </w:numPr>
+        <w:jc w:val="both"/>
+        <w:rPr>
+          <w:rFonts w:cstheme="minorHAnsi"/>
+          <w:sz w:val="24"/>
+          <w:szCs w:val="24"/>
+          <w:lang w:val="en-US"/>
+        </w:rPr>
+      </w:pPr>
+      <w:r>
+        <w:rPr>
+          <w:sz w:val="24"/>
+          <w:szCs w:val="24"/>
+        </w:rPr>
+        <w:t xml:space="preserve">In the checksum calculation </w:t>
+      </w:r>
+      <w:r>
+        <w:rPr>
+          <w:sz w:val="24"/>
+          <w:szCs w:val="24"/>
+        </w:rPr>
+        <w:t xml:space="preserve">0xFF is a hexadecimal constant that represents the binary </w:t>
+      </w:r>
+      <w:r>
+        <w:rPr>
+          <w:rFonts w:cstheme="minorHAnsi"/>
+          <w:sz w:val="24"/>
+          <w:szCs w:val="24"/>
+        </w:rPr>
+        <w:t>value</w:t>
+      </w:r>
+      <w:r>
+        <w:rPr>
+          <w:rFonts w:cstheme="minorHAnsi"/>
+          <w:sz w:val="24"/>
+          <w:szCs w:val="24"/>
+        </w:rPr>
+        <w:t xml:space="preserve">, </w:t>
+      </w:r>
+      <w:r>
+        <w:rPr>
+          <w:rFonts w:cstheme="minorHAnsi"/>
+          <w:sz w:val="24"/>
+          <w:szCs w:val="24"/>
+        </w:rPr>
+        <w:t>0xFF = 11111111 (binary) = 255 (decimal)</w:t>
+      </w:r>
+      <w:r>
+        <w:rPr>
+          <w:rFonts w:cstheme="minorHAnsi"/>
+          <w:sz w:val="24"/>
+          <w:szCs w:val="24"/>
+        </w:rPr>
+        <w:t>.</w:t>
+      </w:r>
+    </w:p>
+    <w:p>
+      <w:pPr>
+        <w:pStyle w:val="NormalWeb"/>
+        <w:numPr>
+          <w:ilvl w:val="0"/>
+          <w:numId w:val="30"/>
+        </w:numPr>
+        <w:rPr>
+          <w:rFonts w:asciiTheme="minorHAnsi" w:hAnsiTheme="minorHAnsi" w:cstheme="minorHAnsi"/>
+        </w:rPr>
+      </w:pPr>
+      <w:r>
+        <w:rPr>
+          <w:rFonts w:asciiTheme="minorHAnsi" w:hAnsiTheme="minorHAnsi" w:cstheme="minorHAnsi"/>
+        </w:rPr>
+        <w:t>The sum of the first 4 bytes could be larger than 255 (since each byte can be up to 255).</w:t>
+      </w:r>
+    </w:p>
+    <w:p>
+      <w:pPr>
+        <w:pStyle w:val="NormalWeb"/>
+        <w:numPr>
+          <w:ilvl w:val="0"/>
+          <w:numId w:val="30"/>
+        </w:numPr>
+        <w:rPr>
+          <w:rFonts w:asciiTheme="minorHAnsi" w:hAnsiTheme="minorHAnsi" w:cstheme="minorHAnsi"/>
+        </w:rPr>
+      </w:pPr>
+      <w:r>
+        <w:rPr>
+          <w:rFonts w:asciiTheme="minorHAnsi" w:hAnsiTheme="minorHAnsi" w:cstheme="minorHAnsi"/>
+        </w:rPr>
+        <w:t xml:space="preserve"> But the checksum is only </w:t>
+      </w:r>
+      <w:r>
+        <w:rPr>
+          <w:rStyle w:val="Strong"/>
+          <w:rFonts w:asciiTheme="minorHAnsi" w:hAnsiTheme="minorHAnsi" w:cstheme="minorHAnsi"/>
+          <w:b w:val="0"/>
+          <w:bCs w:val="0"/>
+        </w:rPr>
+        <w:t>1 byte (8 bits)</w:t>
+      </w:r>
+      <w:r>
+        <w:rPr>
+          <w:rFonts w:asciiTheme="minorHAnsi" w:hAnsiTheme="minorHAnsi" w:cstheme="minorHAnsi"/>
+          <w:b/>
+          <w:bCs/>
+        </w:rPr>
+        <w:t>.</w:t>
+      </w:r>
+    </w:p>
+    <w:p>
+      <w:pPr>
+        <w:pStyle w:val="NormalWeb"/>
+        <w:numPr>
+          <w:ilvl w:val="0"/>
+          <w:numId w:val="30"/>
+        </w:numPr>
+        <w:rPr>
+          <w:rFonts w:asciiTheme="minorHAnsi" w:hAnsiTheme="minorHAnsi" w:cstheme="minorHAnsi"/>
+        </w:rPr>
+      </w:pPr>
+      <w:r>
+        <w:rPr>
+          <w:rFonts w:asciiTheme="minorHAnsi" w:hAnsiTheme="minorHAnsi" w:cstheme="minorHAnsi"/>
+        </w:rPr>
+        <w:t xml:space="preserve"> </w:t>
+      </w:r>
+      <w:r>
+        <w:rPr>
+          <w:rFonts w:asciiTheme="minorHAnsi" w:hAnsiTheme="minorHAnsi" w:cstheme="minorHAnsi"/>
+        </w:rPr>
+        <w:t xml:space="preserve">0xFF </w:t>
+      </w:r>
+      <w:r>
+        <w:rPr>
+          <w:rFonts w:asciiTheme="minorHAnsi" w:hAnsiTheme="minorHAnsi" w:cstheme="minorHAnsi"/>
+        </w:rPr>
+        <w:t xml:space="preserve">masks the result so only the </w:t>
+      </w:r>
+      <w:r>
+        <w:rPr>
+          <w:rStyle w:val="Strong"/>
+          <w:rFonts w:asciiTheme="minorHAnsi" w:hAnsiTheme="minorHAnsi" w:cstheme="minorHAnsi"/>
+          <w:b w:val="0"/>
+          <w:bCs w:val="0"/>
+        </w:rPr>
+        <w:t>lowest 8 bits</w:t>
+      </w:r>
+      <w:r>
+        <w:rPr>
+          <w:rFonts w:asciiTheme="minorHAnsi" w:hAnsiTheme="minorHAnsi" w:cstheme="minorHAnsi"/>
+        </w:rPr>
+        <w:t xml:space="preserve"> are kept.</w:t>
+      </w:r>
+    </w:p>
+    <w:p>
+      <w:pPr>
+        <w:jc w:val="both"/>
+        <w:rPr>
+          <w:b/>
+          <w:bCs/>
+          <w:sz w:val="24"/>
+          <w:szCs w:val="24"/>
+          <w:lang w:val="en-US"/>
+        </w:rPr>
+      </w:pPr>
+    </w:p>
+    <w:p>
+      <w:pPr>
+        <w:jc w:val="both"/>
+        <w:rPr>
+          <w:b/>
+          <w:bCs/>
+          <w:sz w:val="24"/>
+          <w:szCs w:val="24"/>
+          <w:lang w:val="en-US"/>
+        </w:rPr>
+      </w:pPr>
+      <w:r>
+        <w:rPr>
+          <w:b/>
+          <w:bCs/>
+          <w:sz w:val="24"/>
+          <w:szCs w:val="24"/>
+          <w:lang w:val="en-US"/>
+        </w:rPr>
+        <w:t>Interfacing DHT22 with STM32</w:t>
+      </w:r>
+    </w:p>
+    <w:p>
+      <w:pPr>
+        <w:pStyle w:val="ListParagraph"/>
+        <w:numPr>
+          <w:ilvl w:val="0"/>
+          <w:numId w:val="21"/>
+        </w:numPr>
+        <w:jc w:val="both"/>
+        <w:rPr>
+          <w:sz w:val="24"/>
+          <w:szCs w:val="24"/>
+          <w:lang w:val="en-US"/>
+        </w:rPr>
+      </w:pPr>
+      <w:r>
+        <w:rPr>
+          <w:sz w:val="24"/>
+          <w:szCs w:val="24"/>
+          <w:lang w:val="en-US"/>
+        </w:rPr>
+        <w:t>Connect the sensor with STM32 board. There are only three pins Vcc,</w:t>
+      </w:r>
+      <w:r>
+        <w:rPr>
+          <w:sz w:val="24"/>
+          <w:szCs w:val="24"/>
+          <w:lang w:val="en-US"/>
+        </w:rPr>
+        <w:t xml:space="preserve"> </w:t>
+      </w:r>
+      <w:r>
+        <w:rPr>
+          <w:sz w:val="24"/>
+          <w:szCs w:val="24"/>
+          <w:lang w:val="en-US"/>
+        </w:rPr>
+        <w:t>GND and data. Connect Vcc with 3.3V supply from CN8,</w:t>
+      </w:r>
+      <w:r>
+        <w:rPr>
+          <w:sz w:val="24"/>
+          <w:szCs w:val="24"/>
+          <w:lang w:val="en-US"/>
+        </w:rPr>
+        <w:t xml:space="preserve"> </w:t>
+      </w:r>
+      <w:r>
+        <w:rPr>
+          <w:sz w:val="24"/>
+          <w:szCs w:val="24"/>
+          <w:lang w:val="en-US"/>
+        </w:rPr>
+        <w:t>GND from CN8 and data pin is connected to PA0 in CN10 using jumper wires.</w:t>
+      </w:r>
+    </w:p>
+    <w:p>
+      <w:pPr>
+        <w:pStyle w:val="ListParagraph"/>
+        <w:numPr>
+          <w:ilvl w:val="0"/>
+          <w:numId w:val="21"/>
+        </w:numPr>
+        <w:jc w:val="both"/>
+        <w:rPr>
+          <w:sz w:val="24"/>
+          <w:szCs w:val="24"/>
+          <w:lang w:val="en-US"/>
+        </w:rPr>
+      </w:pPr>
+      <w:r>
+        <w:rPr>
+          <w:sz w:val="24"/>
+          <w:szCs w:val="24"/>
+          <w:lang w:val="en-US"/>
+        </w:rPr>
+        <w:t>The DHT22 sensor does not have any LED indication to identify whether it is powered ON when connected to STM32.To ensure that the sensor module works fine, measure the voltage between Vcc and GND pin using a multimeter.</w:t>
+      </w:r>
+    </w:p>
+    <w:p>
+      <w:pPr>
+        <w:pStyle w:val="ListParagraph"/>
+        <w:numPr>
+          <w:ilvl w:val="0"/>
+          <w:numId w:val="21"/>
+        </w:numPr>
+        <w:jc w:val="both"/>
+        <w:rPr>
+          <w:sz w:val="24"/>
+          <w:szCs w:val="24"/>
+          <w:lang w:val="en-US"/>
+        </w:rPr>
+      </w:pPr>
+      <w:r>
+        <w:rPr>
+          <w:sz w:val="24"/>
+          <w:szCs w:val="24"/>
+          <w:lang w:val="en-US"/>
+        </w:rPr>
+        <w:t>In the .ioc file configure PA0 as gpio input with pull-up option enabled. This is because DHT22 sensor require a 4.7K pull up resistor between Vcc and data pin.</w:t>
+      </w:r>
+    </w:p>
+    <w:p>
+      <w:pPr>
+        <w:pStyle w:val="ListParagraph"/>
+        <w:numPr>
+          <w:ilvl w:val="0"/>
+          <w:numId w:val="21"/>
+        </w:numPr>
+        <w:jc w:val="both"/>
+        <w:rPr>
+          <w:sz w:val="24"/>
+          <w:szCs w:val="24"/>
+          <w:lang w:val="en-US"/>
+        </w:rPr>
+      </w:pPr>
+      <w:r>
+        <w:rPr>
+          <w:sz w:val="24"/>
+          <w:szCs w:val="24"/>
+        </w:rPr>
+        <w:t>When the bus is idle, it is in high state condition. This is because of the pull up resistor</w:t>
+      </w:r>
+      <w:r>
+        <w:rPr>
+          <w:sz w:val="24"/>
+          <w:szCs w:val="24"/>
+        </w:rPr>
+        <w:t>.</w:t>
+      </w:r>
+    </w:p>
+    <w:p>
+      <w:pPr>
+        <w:pStyle w:val="NormalWeb"/>
+        <w:numPr>
+          <w:ilvl w:val="0"/>
+          <w:numId w:val="21"/>
+        </w:numPr>
+        <w:jc w:val="both"/>
+        <w:rPr>
+          <w:rFonts w:asciiTheme="minorHAnsi" w:hAnsiTheme="minorHAnsi" w:cstheme="minorHAnsi"/>
+        </w:rPr>
+      </w:pPr>
+      <w:r>
+        <w:rPr>
+          <w:rFonts w:asciiTheme="minorHAnsi" w:hAnsiTheme="minorHAnsi" w:cstheme="minorHAnsi"/>
+        </w:rPr>
+        <w:t xml:space="preserve">The DHT22 uses a </w:t>
+      </w:r>
+      <w:r>
+        <w:rPr>
+          <w:rStyle w:val="Strong"/>
+          <w:rFonts w:asciiTheme="minorHAnsi" w:hAnsiTheme="minorHAnsi" w:cstheme="minorHAnsi"/>
+          <w:b w:val="0"/>
+          <w:bCs w:val="0"/>
+        </w:rPr>
+        <w:t>single</w:t>
+      </w:r>
+      <w:r>
+        <w:rPr>
+          <w:rStyle w:val="Strong"/>
+          <w:rFonts w:asciiTheme="minorHAnsi" w:hAnsiTheme="minorHAnsi" w:cstheme="minorHAnsi"/>
+          <w:b w:val="0"/>
+          <w:bCs w:val="0"/>
+        </w:rPr>
+        <w:noBreakHyphen/>
+        <w:t>wire bus</w:t>
+      </w:r>
+      <w:r>
+        <w:rPr>
+          <w:rFonts w:asciiTheme="minorHAnsi" w:hAnsiTheme="minorHAnsi" w:cstheme="minorHAnsi"/>
+        </w:rPr>
+        <w:t>.</w:t>
+      </w:r>
+    </w:p>
+    <w:p>
+      <w:pPr>
+        <w:pStyle w:val="NormalWeb"/>
+        <w:numPr>
+          <w:ilvl w:val="0"/>
+          <w:numId w:val="21"/>
+        </w:numPr>
+        <w:jc w:val="both"/>
+        <w:rPr>
+          <w:rFonts w:asciiTheme="minorHAnsi" w:hAnsiTheme="minorHAnsi" w:cstheme="minorHAnsi"/>
+        </w:rPr>
+      </w:pPr>
+      <w:r>
+        <w:rPr>
+          <w:rFonts w:asciiTheme="minorHAnsi" w:hAnsiTheme="minorHAnsi" w:cstheme="minorHAnsi"/>
+        </w:rPr>
+        <w:t xml:space="preserve">That means neither the MCU nor the sensor actively drives the line high. They only pull it </w:t>
+      </w:r>
+      <w:r>
+        <w:rPr>
+          <w:rStyle w:val="Strong"/>
+          <w:rFonts w:asciiTheme="minorHAnsi" w:hAnsiTheme="minorHAnsi" w:cstheme="minorHAnsi"/>
+          <w:b w:val="0"/>
+          <w:bCs w:val="0"/>
+        </w:rPr>
+        <w:t>low</w:t>
+      </w:r>
+      <w:r>
+        <w:rPr>
+          <w:rFonts w:asciiTheme="minorHAnsi" w:hAnsiTheme="minorHAnsi" w:cstheme="minorHAnsi"/>
+        </w:rPr>
+        <w:t xml:space="preserve"> when sending bits.</w:t>
+      </w:r>
+    </w:p>
+    <w:p>
+      <w:pPr>
+        <w:pStyle w:val="NormalWeb"/>
+        <w:numPr>
+          <w:ilvl w:val="0"/>
+          <w:numId w:val="21"/>
+        </w:numPr>
+        <w:jc w:val="both"/>
+        <w:rPr>
+          <w:rFonts w:asciiTheme="minorHAnsi" w:hAnsiTheme="minorHAnsi" w:cstheme="minorHAnsi"/>
+        </w:rPr>
+      </w:pPr>
+      <w:r>
+        <w:rPr>
+          <w:rFonts w:asciiTheme="minorHAnsi" w:hAnsiTheme="minorHAnsi" w:cstheme="minorHAnsi"/>
+        </w:rPr>
+        <w:t>To get a valid “high” level, you need a resistor that ties the line up to VCC. Without it, the line floats and the MCU reads random or stuck values.</w:t>
+      </w:r>
+    </w:p>
+    <w:p>
+      <w:pPr>
+        <w:pStyle w:val="NormalWeb"/>
+        <w:numPr>
+          <w:ilvl w:val="0"/>
+          <w:numId w:val="21"/>
+        </w:numPr>
+        <w:jc w:val="both"/>
+        <w:rPr>
+          <w:rFonts w:asciiTheme="minorHAnsi" w:hAnsiTheme="minorHAnsi" w:cstheme="minorHAnsi"/>
+        </w:rPr>
+      </w:pPr>
+      <w:r>
+        <w:rPr>
+          <w:rFonts w:asciiTheme="minorHAnsi" w:hAnsiTheme="minorHAnsi" w:cstheme="minorHAnsi"/>
+        </w:rPr>
+        <w:t>STM32 has internal pull</w:t>
+      </w:r>
+      <w:r>
+        <w:rPr>
+          <w:rFonts w:asciiTheme="minorHAnsi" w:hAnsiTheme="minorHAnsi" w:cstheme="minorHAnsi"/>
+        </w:rPr>
+        <w:noBreakHyphen/>
+        <w:t xml:space="preserve">ups (~30–50 kΩ). These are </w:t>
+      </w:r>
+      <w:r>
+        <w:rPr>
+          <w:rStyle w:val="Strong"/>
+          <w:rFonts w:asciiTheme="minorHAnsi" w:hAnsiTheme="minorHAnsi" w:cstheme="minorHAnsi"/>
+          <w:b w:val="0"/>
+          <w:bCs w:val="0"/>
+        </w:rPr>
+        <w:t>too weak</w:t>
+      </w:r>
+      <w:r>
+        <w:rPr>
+          <w:rFonts w:asciiTheme="minorHAnsi" w:hAnsiTheme="minorHAnsi" w:cstheme="minorHAnsi"/>
+        </w:rPr>
+        <w:t xml:space="preserve"> for reliable fast transitions.</w:t>
+      </w:r>
+    </w:p>
+    <w:p>
+      <w:pPr>
+        <w:pStyle w:val="NormalWeb"/>
+        <w:numPr>
+          <w:ilvl w:val="0"/>
+          <w:numId w:val="21"/>
+        </w:numPr>
+        <w:jc w:val="both"/>
+        <w:rPr>
+          <w:rFonts w:asciiTheme="minorHAnsi" w:hAnsiTheme="minorHAnsi" w:cstheme="minorHAnsi"/>
+        </w:rPr>
+      </w:pPr>
+      <w:r>
+        <w:rPr>
+          <w:rFonts w:asciiTheme="minorHAnsi" w:hAnsiTheme="minorHAnsi" w:cstheme="minorHAnsi"/>
+        </w:rPr>
+        <w:t xml:space="preserve"> The DHT22 requires a stronger pull</w:t>
+      </w:r>
+      <w:r>
+        <w:rPr>
+          <w:rFonts w:asciiTheme="minorHAnsi" w:hAnsiTheme="minorHAnsi" w:cstheme="minorHAnsi"/>
+        </w:rPr>
+        <w:noBreakHyphen/>
+        <w:t xml:space="preserve">up (typically </w:t>
+      </w:r>
+      <w:r>
+        <w:rPr>
+          <w:rStyle w:val="Strong"/>
+          <w:rFonts w:asciiTheme="minorHAnsi" w:hAnsiTheme="minorHAnsi" w:cstheme="minorHAnsi"/>
+          <w:b w:val="0"/>
+          <w:bCs w:val="0"/>
+        </w:rPr>
+        <w:t>4.7 kΩ to 10 kΩ</w:t>
+      </w:r>
+      <w:r>
+        <w:rPr>
+          <w:rFonts w:asciiTheme="minorHAnsi" w:hAnsiTheme="minorHAnsi" w:cstheme="minorHAnsi"/>
+        </w:rPr>
+        <w:t>) to ensure clean rising edges within the microsecond timing window.</w:t>
+      </w:r>
+    </w:p>
+    <w:p>
+      <w:pPr>
+        <w:pStyle w:val="NormalWeb"/>
+        <w:numPr>
+          <w:ilvl w:val="0"/>
+          <w:numId w:val="21"/>
+        </w:numPr>
+        <w:jc w:val="both"/>
+        <w:rPr>
+          <w:rFonts w:asciiTheme="minorHAnsi" w:hAnsiTheme="minorHAnsi" w:cstheme="minorHAnsi"/>
+        </w:rPr>
+      </w:pPr>
+      <w:r>
+        <w:rPr>
+          <w:rFonts w:asciiTheme="minorHAnsi" w:hAnsiTheme="minorHAnsi" w:cstheme="minorHAnsi"/>
+        </w:rPr>
+        <w:lastRenderedPageBreak/>
+        <w:t xml:space="preserve">That’s why you add an </w:t>
+      </w:r>
+      <w:r>
+        <w:rPr>
+          <w:rStyle w:val="Strong"/>
+          <w:rFonts w:asciiTheme="minorHAnsi" w:hAnsiTheme="minorHAnsi" w:cstheme="minorHAnsi"/>
+          <w:b w:val="0"/>
+          <w:bCs w:val="0"/>
+        </w:rPr>
+        <w:t>external 4.7 kΩ resistor</w:t>
+      </w:r>
+      <w:r>
+        <w:rPr>
+          <w:rFonts w:asciiTheme="minorHAnsi" w:hAnsiTheme="minorHAnsi" w:cstheme="minorHAnsi"/>
+        </w:rPr>
+        <w:t xml:space="preserve"> between PA0 and 3.3 V.</w:t>
+      </w:r>
+    </w:p>
+    <w:p>
+      <w:pPr>
+        <w:pStyle w:val="ListParagraph"/>
+        <w:numPr>
+          <w:ilvl w:val="0"/>
+          <w:numId w:val="21"/>
+        </w:numPr>
+        <w:jc w:val="both"/>
+        <w:rPr>
+          <w:rFonts w:cstheme="minorHAnsi"/>
+          <w:sz w:val="24"/>
+          <w:szCs w:val="24"/>
+          <w:lang w:val="en-US"/>
+        </w:rPr>
+      </w:pPr>
+      <w:r>
+        <w:rPr>
+          <w:rFonts w:cstheme="minorHAnsi"/>
+          <w:sz w:val="24"/>
+          <w:szCs w:val="24"/>
+          <w:lang w:val="en-US"/>
+        </w:rPr>
+        <w:t>Figure below shows the output reading of DHT22 sensor.</w:t>
+      </w:r>
+    </w:p>
+    <w:p>
+      <w:pPr>
+        <w:jc w:val="both"/>
+        <w:rPr>
+          <w:sz w:val="24"/>
+          <w:szCs w:val="24"/>
+          <w:lang w:val="en-US"/>
+        </w:rPr>
+      </w:pPr>
+      <w:r>
+        <w:rPr>
+          <w:sz w:val="24"/>
+          <w:szCs w:val="24"/>
+          <w:lang w:val="en-US"/>
+        </w:rPr>
+        <w:drawing>
+          <wp:inline distT="0" distB="0" distL="0" distR="0" wp14:anchorId="238CF9E4" wp14:editId="7F793A10">
+            <wp:extent cx="5731510" cy="2287617"/>
+            <wp:effectExtent l="0" t="0" r="0" b="0"/>
+            <wp:docPr id="1914532706" name="Picture 1"/>
+            <wp:cNvGraphicFramePr>
+              <a:graphicFrameLocks xmlns:a="http://schemas.openxmlformats.org/drawingml/2006/main" noChangeAspect="1"/>
+            </wp:cNvGraphicFramePr>
+            <a:graphic xmlns:a="http://schemas.openxmlformats.org/drawingml/2006/main">
+              <a:graphicData uri="http://schemas.openxmlformats.org/drawingml/2006/picture">
+                <pic:pic xmlns:pic="http://schemas.openxmlformats.org/drawingml/2006/picture">
+                  <pic:nvPicPr>
+                    <pic:cNvPr id="1914532706" name=""/>
+                    <pic:cNvPicPr/>
+                  </pic:nvPicPr>
+                  <pic:blipFill rotWithShape="1">
+                    <a:blip r:embed="rId15"/>
+                    <a:srcRect l="-494" t="1784" r="-1512"/>
+                    <a:stretch>
+                      <a:fillRect/>
+                    </a:stretch>
+                  </pic:blipFill>
+                  <pic:spPr bwMode="auto">
+                    <a:xfrm>
+                      <a:off x="0" y="0"/>
+                      <a:ext cx="5731510" cy="2287617"/>
+                    </a:xfrm>
+                    <a:prstGeom prst="rect">
+                      <a:avLst/>
+                    </a:prstGeom>
+                    <a:ln>
+                      <a:noFill/>
+                    </a:ln>
+                    <a:extLst>
+                      <a:ext uri="{53640926-AAD7-44D8-BBD7-CCE9431645EC}">
+                        <a14:shadowObscured xmlns:a14="http://schemas.microsoft.com/office/drawing/2010/main"/>
+                      </a:ext>
+                    </a:extLst>
+                  </pic:spPr>
+                </pic:pic>
+              </a:graphicData>
+            </a:graphic>
+          </wp:inline>
+        </w:drawing>
+      </w:r>
+    </w:p>
+    <w:p>
+      <w:pPr>
+        <w:pStyle w:val="ListParagraph"/>
+        <w:numPr>
+          <w:ilvl w:val="0"/>
+          <w:numId w:val="31"/>
+        </w:numPr>
+        <w:jc w:val="both"/>
+        <w:rPr>
+          <w:sz w:val="24"/>
+          <w:szCs w:val="24"/>
+          <w:lang w:val="en-US"/>
+        </w:rPr>
+      </w:pPr>
+      <w:r>
+        <w:rPr>
+          <w:sz w:val="24"/>
+          <w:szCs w:val="24"/>
+          <w:lang w:val="en-US"/>
+        </w:rPr>
+        <w:t>Figure below shows the timing diagram of DHT22 communication:</w:t>
+      </w:r>
+    </w:p>
+    <w:p>
+      <w:pPr>
+        <w:jc w:val="both"/>
+        <w:rPr>
+          <w:sz w:val="24"/>
+          <w:szCs w:val="24"/>
+          <w:lang w:val="en-US"/>
+        </w:rPr>
+      </w:pPr>
+      <w:r>
+        <w:rPr>
+          <w:sz w:val="24"/>
+          <w:szCs w:val="24"/>
+          <w:lang w:val="en-US"/>
+        </w:rPr>
+        <w:drawing>
+          <wp:inline distT="0" distB="0" distL="0" distR="0" wp14:anchorId="22D40113" wp14:editId="281BD26B">
+            <wp:extent cx="5731510" cy="2411095"/>
+            <wp:effectExtent l="0" t="0" r="2540" b="8255"/>
+            <wp:docPr id="475446045" name="Picture 1"/>
+            <wp:cNvGraphicFramePr>
+              <a:graphicFrameLocks xmlns:a="http://schemas.openxmlformats.org/drawingml/2006/main" noChangeAspect="1"/>
+            </wp:cNvGraphicFramePr>
+            <a:graphic xmlns:a="http://schemas.openxmlformats.org/drawingml/2006/main">
+              <a:graphicData uri="http://schemas.openxmlformats.org/drawingml/2006/picture">
+                <pic:pic xmlns:pic="http://schemas.openxmlformats.org/drawingml/2006/picture">
+                  <pic:nvPicPr>
+                    <pic:cNvPr id="475446045" name=""/>
+                    <pic:cNvPicPr/>
+                  </pic:nvPicPr>
+                  <pic:blipFill>
+                    <a:blip r:embed="rId16"/>
+                    <a:stretch>
+                      <a:fillRect/>
+                    </a:stretch>
+                  </pic:blipFill>
+                  <pic:spPr>
+                    <a:xfrm>
+                      <a:off x="0" y="0"/>
+                      <a:ext cx="5731510" cy="2411095"/>
+                    </a:xfrm>
+                    <a:prstGeom prst="rect">
+                      <a:avLst/>
+                    </a:prstGeom>
+                  </pic:spPr>
+                </pic:pic>
+              </a:graphicData>
+            </a:graphic>
+          </wp:inline>
+        </w:drawing>
+      </w:r>
+    </w:p>
+    <w:p>
+      <w:pPr>
+        <w:jc w:val="both"/>
+        <w:rPr>
+          <w:sz w:val="24"/>
+          <w:szCs w:val="24"/>
+          <w:lang w:val="en-US"/>
+        </w:rPr>
+      </w:pPr>
+    </w:p>
+    <w:p>
+      <w:pPr>
+        <w:jc w:val="both"/>
+        <w:rPr>
+          <w:sz w:val="24"/>
+          <w:szCs w:val="24"/>
+          <w:lang w:val="en-US"/>
+        </w:rPr>
+      </w:pPr>
+      <w:r>
+        <w:rPr>
+          <w:sz w:val="24"/>
+          <w:szCs w:val="24"/>
+          <w:lang w:val="en-US"/>
+        </w:rPr>
+        <w:drawing>
+          <wp:inline distT="0" distB="0" distL="0" distR="0" wp14:anchorId="2DD4AFD0" wp14:editId="2318D5A0">
+            <wp:extent cx="5731510" cy="1078230"/>
+            <wp:effectExtent l="0" t="0" r="2540" b="7620"/>
+            <wp:docPr id="209743461" name="Picture 1"/>
+            <wp:cNvGraphicFramePr>
+              <a:graphicFrameLocks xmlns:a="http://schemas.openxmlformats.org/drawingml/2006/main" noChangeAspect="1"/>
+            </wp:cNvGraphicFramePr>
+            <a:graphic xmlns:a="http://schemas.openxmlformats.org/drawingml/2006/main">
+              <a:graphicData uri="http://schemas.openxmlformats.org/drawingml/2006/picture">
+                <pic:pic xmlns:pic="http://schemas.openxmlformats.org/drawingml/2006/picture">
+                  <pic:nvPicPr>
+                    <pic:cNvPr id="209743461" name=""/>
+                    <pic:cNvPicPr/>
+                  </pic:nvPicPr>
+                  <pic:blipFill>
+                    <a:blip r:embed="rId17"/>
+                    <a:stretch>
+                      <a:fillRect/>
+                    </a:stretch>
+                  </pic:blipFill>
+                  <pic:spPr>
+                    <a:xfrm>
+                      <a:off x="0" y="0"/>
+                      <a:ext cx="5731510" cy="1078230"/>
+                    </a:xfrm>
+                    <a:prstGeom prst="rect">
+                      <a:avLst/>
+                    </a:prstGeom>
+                  </pic:spPr>
+                </pic:pic>
+              </a:graphicData>
+            </a:graphic>
+          </wp:inline>
+        </w:drawing>
+      </w:r>
+    </w:p>
+    <w:p>
+      <w:pPr>
+        <w:jc w:val="both"/>
+        <w:rPr>
+          <w:sz w:val="24"/>
+          <w:szCs w:val="24"/>
+          <w:lang w:val="en-US"/>
+        </w:rPr>
+      </w:pPr>
+    </w:p>
+    <w:p>
+      <w:pPr>
+        <w:jc w:val="both"/>
+        <w:rPr>
+          <w:b/>
+          <w:bCs/>
+          <w:sz w:val="24"/>
+          <w:szCs w:val="24"/>
+          <w:lang w:val="en-US"/>
+        </w:rPr>
+      </w:pPr>
+    </w:p>
+    <w:p>
+      <w:pPr>
+        <w:jc w:val="both"/>
+        <w:rPr>
+          <w:b/>
+          <w:bCs/>
+          <w:sz w:val="24"/>
+          <w:szCs w:val="24"/>
+          <w:lang w:val="en-US"/>
+        </w:rPr>
+      </w:pPr>
+    </w:p>
+    <w:p>
+      <w:pPr>
+        <w:jc w:val="both"/>
+        <w:rPr>
+          <w:b/>
+          <w:bCs/>
+          <w:sz w:val="24"/>
+          <w:szCs w:val="24"/>
+          <w:lang w:val="en-US"/>
+        </w:rPr>
+      </w:pPr>
+    </w:p>
+    <w:p>
+      <w:pPr>
+        <w:jc w:val="both"/>
+        <w:rPr>
+          <w:b/>
+          <w:bCs/>
+          <w:sz w:val="24"/>
+          <w:szCs w:val="24"/>
+          <w:lang w:val="en-US"/>
+        </w:rPr>
+      </w:pPr>
+    </w:p>
+    <w:p>
+      <w:pPr>
+        <w:jc w:val="both"/>
+        <w:rPr>
+          <w:b/>
+          <w:bCs/>
+          <w:sz w:val="24"/>
+          <w:szCs w:val="24"/>
+          <w:lang w:val="en-US"/>
+        </w:rPr>
+      </w:pPr>
+    </w:p>
+    <w:p>
+      <w:pPr>
+        <w:jc w:val="both"/>
+        <w:rPr>
+          <w:b/>
+          <w:bCs/>
+          <w:sz w:val="24"/>
+          <w:szCs w:val="24"/>
+          <w:lang w:val="en-US"/>
+        </w:rPr>
+      </w:pPr>
+    </w:p>
+    <w:p>
+      <w:pPr>
+        <w:jc w:val="both"/>
+        <w:rPr>
+          <w:b/>
+          <w:bCs/>
+          <w:sz w:val="24"/>
+          <w:szCs w:val="24"/>
+          <w:lang w:val="en-US"/>
+        </w:rPr>
+      </w:pPr>
+      <w:r>
+        <w:rPr>
+          <w:b/>
+          <w:bCs/>
+          <w:sz w:val="24"/>
+          <w:szCs w:val="24"/>
+          <w:lang w:val="en-US"/>
+        </w:rPr>
+        <w:t>Interfacing HX711+load cell with STM32</w:t>
+      </w:r>
     </w:p>
     <w:sectPr>
       <w:pgSz w:w="11906" w:h="16838"/>
@@ -3509,6 +6542,268 @@
     </w:lvl>
   </w:abstractNum>
   <w:abstractNum w:abstractNumId="2" w15:restartNumberingAfterBreak="0">
+    <w:nsid w:val="07A855FB"/>
+    <w:multiLevelType w:val="hybridMultilevel"/>
+    <w:tmpl w:val="FFE45CC6"/>
+    <w:lvl w:ilvl="0" w:tplc="40090001">
+      <w:start w:val="1"/>
+      <w:numFmt w:val="bullet"/>
+      <w:lvlText w:val=""/>
+      <w:lvlJc w:val="left"/>
+      <w:pPr>
+        <w:ind w:left="720" w:hanging="360"/>
+      </w:pPr>
+      <w:rPr>
+        <w:rFonts w:ascii="Symbol" w:hAnsi="Symbol" w:hint="default"/>
+      </w:rPr>
+    </w:lvl>
+    <w:lvl w:ilvl="1" w:tplc="40090003" w:tentative="1">
+      <w:start w:val="1"/>
+      <w:numFmt w:val="bullet"/>
+      <w:lvlText w:val="o"/>
+      <w:lvlJc w:val="left"/>
+      <w:pPr>
+        <w:ind w:left="1440" w:hanging="360"/>
+      </w:pPr>
+      <w:rPr>
+        <w:rFonts w:ascii="Courier New" w:hAnsi="Courier New" w:cs="Courier New" w:hint="default"/>
+      </w:rPr>
+    </w:lvl>
+    <w:lvl w:ilvl="2" w:tplc="40090005" w:tentative="1">
+      <w:start w:val="1"/>
+      <w:numFmt w:val="bullet"/>
+      <w:lvlText w:val=""/>
+      <w:lvlJc w:val="left"/>
+      <w:pPr>
+        <w:ind w:left="2160" w:hanging="360"/>
+      </w:pPr>
+      <w:rPr>
+        <w:rFonts w:ascii="Wingdings" w:hAnsi="Wingdings" w:hint="default"/>
+      </w:rPr>
+    </w:lvl>
+    <w:lvl w:ilvl="3" w:tplc="40090001" w:tentative="1">
+      <w:start w:val="1"/>
+      <w:numFmt w:val="bullet"/>
+      <w:lvlText w:val=""/>
+      <w:lvlJc w:val="left"/>
+      <w:pPr>
+        <w:ind w:left="2880" w:hanging="360"/>
+      </w:pPr>
+      <w:rPr>
+        <w:rFonts w:ascii="Symbol" w:hAnsi="Symbol" w:hint="default"/>
+      </w:rPr>
+    </w:lvl>
+    <w:lvl w:ilvl="4" w:tplc="40090003" w:tentative="1">
+      <w:start w:val="1"/>
+      <w:numFmt w:val="bullet"/>
+      <w:lvlText w:val="o"/>
+      <w:lvlJc w:val="left"/>
+      <w:pPr>
+        <w:ind w:left="3600" w:hanging="360"/>
+      </w:pPr>
+      <w:rPr>
+        <w:rFonts w:ascii="Courier New" w:hAnsi="Courier New" w:cs="Courier New" w:hint="default"/>
+      </w:rPr>
+    </w:lvl>
+    <w:lvl w:ilvl="5" w:tplc="40090005" w:tentative="1">
+      <w:start w:val="1"/>
+      <w:numFmt w:val="bullet"/>
+      <w:lvlText w:val=""/>
+      <w:lvlJc w:val="left"/>
+      <w:pPr>
+        <w:ind w:left="4320" w:hanging="360"/>
+      </w:pPr>
+      <w:rPr>
+        <w:rFonts w:ascii="Wingdings" w:hAnsi="Wingdings" w:hint="default"/>
+      </w:rPr>
+    </w:lvl>
+    <w:lvl w:ilvl="6" w:tplc="40090001" w:tentative="1">
+      <w:start w:val="1"/>
+      <w:numFmt w:val="bullet"/>
+      <w:lvlText w:val=""/>
+      <w:lvlJc w:val="left"/>
+      <w:pPr>
+        <w:ind w:left="5040" w:hanging="360"/>
+      </w:pPr>
+      <w:rPr>
+        <w:rFonts w:ascii="Symbol" w:hAnsi="Symbol" w:hint="default"/>
+      </w:rPr>
+    </w:lvl>
+    <w:lvl w:ilvl="7" w:tplc="40090003" w:tentative="1">
+      <w:start w:val="1"/>
+      <w:numFmt w:val="bullet"/>
+      <w:lvlText w:val="o"/>
+      <w:lvlJc w:val="left"/>
+      <w:pPr>
+        <w:ind w:left="5760" w:hanging="360"/>
+      </w:pPr>
+      <w:rPr>
+        <w:rFonts w:ascii="Courier New" w:hAnsi="Courier New" w:cs="Courier New" w:hint="default"/>
+      </w:rPr>
+    </w:lvl>
+    <w:lvl w:ilvl="8" w:tplc="40090005" w:tentative="1">
+      <w:start w:val="1"/>
+      <w:numFmt w:val="bullet"/>
+      <w:lvlText w:val=""/>
+      <w:lvlJc w:val="left"/>
+      <w:pPr>
+        <w:ind w:left="6480" w:hanging="360"/>
+      </w:pPr>
+      <w:rPr>
+        <w:rFonts w:ascii="Wingdings" w:hAnsi="Wingdings" w:hint="default"/>
+      </w:rPr>
+    </w:lvl>
+  </w:abstractNum>
+  <w:abstractNum w:abstractNumId="3" w15:restartNumberingAfterBreak="0">
+    <w:nsid w:val="08A02530"/>
+    <w:multiLevelType w:val="multilevel"/>
+    <w:tmpl w:val="915E31F4"/>
+    <w:lvl w:ilvl="0">
+      <w:start w:val="1"/>
+      <w:numFmt w:val="bullet"/>
+      <w:lvlText w:val=""/>
+      <w:lvlJc w:val="left"/>
+      <w:pPr>
+        <w:tabs>
+          <w:tab w:val="num" w:pos="720"/>
+        </w:tabs>
+        <w:ind w:left="720" w:hanging="360"/>
+      </w:pPr>
+      <w:rPr>
+        <w:rFonts w:ascii="Symbol" w:hAnsi="Symbol" w:hint="default"/>
+        <w:sz w:val="20"/>
+      </w:rPr>
+    </w:lvl>
+    <w:lvl w:ilvl="1" w:tentative="1">
+      <w:start w:val="1"/>
+      <w:numFmt w:val="bullet"/>
+      <w:lvlText w:val="o"/>
+      <w:lvlJc w:val="left"/>
+      <w:pPr>
+        <w:tabs>
+          <w:tab w:val="num" w:pos="1440"/>
+        </w:tabs>
+        <w:ind w:left="1440" w:hanging="360"/>
+      </w:pPr>
+      <w:rPr>
+        <w:rFonts w:ascii="Courier New" w:hAnsi="Courier New" w:hint="default"/>
+        <w:sz w:val="20"/>
+      </w:rPr>
+    </w:lvl>
+    <w:lvl w:ilvl="2" w:tentative="1">
+      <w:start w:val="1"/>
+      <w:numFmt w:val="bullet"/>
+      <w:lvlText w:val=""/>
+      <w:lvlJc w:val="left"/>
+      <w:pPr>
+        <w:tabs>
+          <w:tab w:val="num" w:pos="2160"/>
+        </w:tabs>
+        <w:ind w:left="2160" w:hanging="360"/>
+      </w:pPr>
+      <w:rPr>
+        <w:rFonts w:ascii="Wingdings" w:hAnsi="Wingdings" w:hint="default"/>
+        <w:sz w:val="20"/>
+      </w:rPr>
+    </w:lvl>
+    <w:lvl w:ilvl="3" w:tentative="1">
+      <w:start w:val="1"/>
+      <w:numFmt w:val="bullet"/>
+      <w:lvlText w:val=""/>
+      <w:lvlJc w:val="left"/>
+      <w:pPr>
+        <w:tabs>
+          <w:tab w:val="num" w:pos="2880"/>
+        </w:tabs>
+        <w:ind w:left="2880" w:hanging="360"/>
+      </w:pPr>
+      <w:rPr>
+        <w:rFonts w:ascii="Wingdings" w:hAnsi="Wingdings" w:hint="default"/>
+        <w:sz w:val="20"/>
+      </w:rPr>
+    </w:lvl>
+    <w:lvl w:ilvl="4" w:tentative="1">
+      <w:start w:val="1"/>
+      <w:numFmt w:val="bullet"/>
+      <w:lvlText w:val=""/>
+      <w:lvlJc w:val="left"/>
+      <w:pPr>
+        <w:tabs>
+          <w:tab w:val="num" w:pos="3600"/>
+        </w:tabs>
+        <w:ind w:left="3600" w:hanging="360"/>
+      </w:pPr>
+      <w:rPr>
+        <w:rFonts w:ascii="Wingdings" w:hAnsi="Wingdings" w:hint="default"/>
+        <w:sz w:val="20"/>
+      </w:rPr>
+    </w:lvl>
+    <w:lvl w:ilvl="5" w:tentative="1">
+      <w:start w:val="1"/>
+      <w:numFmt w:val="bullet"/>
+      <w:lvlText w:val=""/>
+      <w:lvlJc w:val="left"/>
+      <w:pPr>
+        <w:tabs>
+          <w:tab w:val="num" w:pos="4320"/>
+        </w:tabs>
+        <w:ind w:left="4320" w:hanging="360"/>
+      </w:pPr>
+      <w:rPr>
+        <w:rFonts w:ascii="Wingdings" w:hAnsi="Wingdings" w:hint="default"/>
+        <w:sz w:val="20"/>
+      </w:rPr>
+    </w:lvl>
+    <w:lvl w:ilvl="6" w:tentative="1">
+      <w:start w:val="1"/>
+      <w:numFmt w:val="bullet"/>
+      <w:lvlText w:val=""/>
+      <w:lvlJc w:val="left"/>
+      <w:pPr>
+        <w:tabs>
+          <w:tab w:val="num" w:pos="5040"/>
+        </w:tabs>
+        <w:ind w:left="5040" w:hanging="360"/>
+      </w:pPr>
+      <w:rPr>
+        <w:rFonts w:ascii="Wingdings" w:hAnsi="Wingdings" w:hint="default"/>
+        <w:sz w:val="20"/>
+      </w:rPr>
+    </w:lvl>
+    <w:lvl w:ilvl="7" w:tentative="1">
+      <w:start w:val="1"/>
+      <w:numFmt w:val="bullet"/>
+      <w:lvlText w:val=""/>
+      <w:lvlJc w:val="left"/>
+      <w:pPr>
+        <w:tabs>
+          <w:tab w:val="num" w:pos="5760"/>
+        </w:tabs>
+        <w:ind w:left="5760" w:hanging="360"/>
+      </w:pPr>
+      <w:rPr>
+        <w:rFonts w:ascii="Wingdings" w:hAnsi="Wingdings" w:hint="default"/>
+        <w:sz w:val="20"/>
+      </w:rPr>
+    </w:lvl>
+    <w:lvl w:ilvl="8" w:tentative="1">
+      <w:start w:val="1"/>
+      <w:numFmt w:val="bullet"/>
+      <w:lvlText w:val=""/>
+      <w:lvlJc w:val="left"/>
+      <w:pPr>
+        <w:tabs>
+          <w:tab w:val="num" w:pos="6480"/>
+        </w:tabs>
+        <w:ind w:left="6480" w:hanging="360"/>
+      </w:pPr>
+      <w:rPr>
+        <w:rFonts w:ascii="Wingdings" w:hAnsi="Wingdings" w:hint="default"/>
+        <w:sz w:val="20"/>
+      </w:rPr>
+    </w:lvl>
+  </w:abstractNum>
+  <w:abstractNum w:abstractNumId="4" w15:restartNumberingAfterBreak="0">
     <w:nsid w:val="0AAF7EEC"/>
     <w:multiLevelType w:val="hybridMultilevel"/>
     <w:tmpl w:val="E70E850C"/>
@@ -3648,7 +6943,7 @@
       </w:rPr>
     </w:lvl>
   </w:abstractNum>
-  <w:abstractNum w:abstractNumId="3" w15:restartNumberingAfterBreak="0">
+  <w:abstractNum w:abstractNumId="5" w15:restartNumberingAfterBreak="0">
     <w:nsid w:val="1485760C"/>
     <w:multiLevelType w:val="hybridMultilevel"/>
     <w:tmpl w:val="DED07786"/>
@@ -3788,7 +7083,7 @@
       </w:rPr>
     </w:lvl>
   </w:abstractNum>
-  <w:abstractNum w:abstractNumId="4" w15:restartNumberingAfterBreak="0">
+  <w:abstractNum w:abstractNumId="6" w15:restartNumberingAfterBreak="0">
     <w:nsid w:val="22391C15"/>
     <w:multiLevelType w:val="hybridMultilevel"/>
     <w:tmpl w:val="2660756C"/>
@@ -3901,7 +7196,7 @@
       </w:rPr>
     </w:lvl>
   </w:abstractNum>
-  <w:abstractNum w:abstractNumId="5" w15:restartNumberingAfterBreak="0">
+  <w:abstractNum w:abstractNumId="7" w15:restartNumberingAfterBreak="0">
     <w:nsid w:val="2517284B"/>
     <w:multiLevelType w:val="hybridMultilevel"/>
     <w:tmpl w:val="1832A934"/>
@@ -4041,7 +7336,269 @@
       </w:rPr>
     </w:lvl>
   </w:abstractNum>
-  <w:abstractNum w:abstractNumId="6" w15:restartNumberingAfterBreak="0">
+  <w:abstractNum w:abstractNumId="8" w15:restartNumberingAfterBreak="0">
+    <w:nsid w:val="26FA764D"/>
+    <w:multiLevelType w:val="multilevel"/>
+    <w:tmpl w:val="56009C4E"/>
+    <w:lvl w:ilvl="0">
+      <w:start w:val="1"/>
+      <w:numFmt w:val="decimal"/>
+      <w:lvlText w:val="%1."/>
+      <w:lvlJc w:val="left"/>
+      <w:pPr>
+        <w:tabs>
+          <w:tab w:val="num" w:pos="720"/>
+        </w:tabs>
+        <w:ind w:left="720" w:hanging="360"/>
+      </w:pPr>
+    </w:lvl>
+    <w:lvl w:ilvl="1" w:tentative="1">
+      <w:start w:val="1"/>
+      <w:numFmt w:val="decimal"/>
+      <w:lvlText w:val="%2."/>
+      <w:lvlJc w:val="left"/>
+      <w:pPr>
+        <w:tabs>
+          <w:tab w:val="num" w:pos="1440"/>
+        </w:tabs>
+        <w:ind w:left="1440" w:hanging="360"/>
+      </w:pPr>
+    </w:lvl>
+    <w:lvl w:ilvl="2" w:tentative="1">
+      <w:start w:val="1"/>
+      <w:numFmt w:val="decimal"/>
+      <w:lvlText w:val="%3."/>
+      <w:lvlJc w:val="left"/>
+      <w:pPr>
+        <w:tabs>
+          <w:tab w:val="num" w:pos="2160"/>
+        </w:tabs>
+        <w:ind w:left="2160" w:hanging="360"/>
+      </w:pPr>
+    </w:lvl>
+    <w:lvl w:ilvl="3" w:tentative="1">
+      <w:start w:val="1"/>
+      <w:numFmt w:val="decimal"/>
+      <w:lvlText w:val="%4."/>
+      <w:lvlJc w:val="left"/>
+      <w:pPr>
+        <w:tabs>
+          <w:tab w:val="num" w:pos="2880"/>
+        </w:tabs>
+        <w:ind w:left="2880" w:hanging="360"/>
+      </w:pPr>
+    </w:lvl>
+    <w:lvl w:ilvl="4" w:tentative="1">
+      <w:start w:val="1"/>
+      <w:numFmt w:val="decimal"/>
+      <w:lvlText w:val="%5."/>
+      <w:lvlJc w:val="left"/>
+      <w:pPr>
+        <w:tabs>
+          <w:tab w:val="num" w:pos="3600"/>
+        </w:tabs>
+        <w:ind w:left="3600" w:hanging="360"/>
+      </w:pPr>
+    </w:lvl>
+    <w:lvl w:ilvl="5" w:tentative="1">
+      <w:start w:val="1"/>
+      <w:numFmt w:val="decimal"/>
+      <w:lvlText w:val="%6."/>
+      <w:lvlJc w:val="left"/>
+      <w:pPr>
+        <w:tabs>
+          <w:tab w:val="num" w:pos="4320"/>
+        </w:tabs>
+        <w:ind w:left="4320" w:hanging="360"/>
+      </w:pPr>
+    </w:lvl>
+    <w:lvl w:ilvl="6" w:tentative="1">
+      <w:start w:val="1"/>
+      <w:numFmt w:val="decimal"/>
+      <w:lvlText w:val="%7."/>
+      <w:lvlJc w:val="left"/>
+      <w:pPr>
+        <w:tabs>
+          <w:tab w:val="num" w:pos="5040"/>
+        </w:tabs>
+        <w:ind w:left="5040" w:hanging="360"/>
+      </w:pPr>
+    </w:lvl>
+    <w:lvl w:ilvl="7" w:tentative="1">
+      <w:start w:val="1"/>
+      <w:numFmt w:val="decimal"/>
+      <w:lvlText w:val="%8."/>
+      <w:lvlJc w:val="left"/>
+      <w:pPr>
+        <w:tabs>
+          <w:tab w:val="num" w:pos="5760"/>
+        </w:tabs>
+        <w:ind w:left="5760" w:hanging="360"/>
+      </w:pPr>
+    </w:lvl>
+    <w:lvl w:ilvl="8" w:tentative="1">
+      <w:start w:val="1"/>
+      <w:numFmt w:val="decimal"/>
+      <w:lvlText w:val="%9."/>
+      <w:lvlJc w:val="left"/>
+      <w:pPr>
+        <w:tabs>
+          <w:tab w:val="num" w:pos="6480"/>
+        </w:tabs>
+        <w:ind w:left="6480" w:hanging="360"/>
+      </w:pPr>
+    </w:lvl>
+  </w:abstractNum>
+  <w:abstractNum w:abstractNumId="9" w15:restartNumberingAfterBreak="0">
+    <w:nsid w:val="358149EA"/>
+    <w:multiLevelType w:val="multilevel"/>
+    <w:tmpl w:val="93B4ECF8"/>
+    <w:lvl w:ilvl="0">
+      <w:start w:val="1"/>
+      <w:numFmt w:val="bullet"/>
+      <w:lvlText w:val=""/>
+      <w:lvlJc w:val="left"/>
+      <w:pPr>
+        <w:tabs>
+          <w:tab w:val="num" w:pos="720"/>
+        </w:tabs>
+        <w:ind w:left="720" w:hanging="360"/>
+      </w:pPr>
+      <w:rPr>
+        <w:rFonts w:ascii="Symbol" w:hAnsi="Symbol" w:hint="default"/>
+        <w:sz w:val="20"/>
+      </w:rPr>
+    </w:lvl>
+    <w:lvl w:ilvl="1" w:tentative="1">
+      <w:start w:val="1"/>
+      <w:numFmt w:val="bullet"/>
+      <w:lvlText w:val="o"/>
+      <w:lvlJc w:val="left"/>
+      <w:pPr>
+        <w:tabs>
+          <w:tab w:val="num" w:pos="1440"/>
+        </w:tabs>
+        <w:ind w:left="1440" w:hanging="360"/>
+      </w:pPr>
+      <w:rPr>
+        <w:rFonts w:ascii="Courier New" w:hAnsi="Courier New" w:hint="default"/>
+        <w:sz w:val="20"/>
+      </w:rPr>
+    </w:lvl>
+    <w:lvl w:ilvl="2" w:tentative="1">
+      <w:start w:val="1"/>
+      <w:numFmt w:val="bullet"/>
+      <w:lvlText w:val=""/>
+      <w:lvlJc w:val="left"/>
+      <w:pPr>
+        <w:tabs>
+          <w:tab w:val="num" w:pos="2160"/>
+        </w:tabs>
+        <w:ind w:left="2160" w:hanging="360"/>
+      </w:pPr>
+      <w:rPr>
+        <w:rFonts w:ascii="Wingdings" w:hAnsi="Wingdings" w:hint="default"/>
+        <w:sz w:val="20"/>
+      </w:rPr>
+    </w:lvl>
+    <w:lvl w:ilvl="3" w:tentative="1">
+      <w:start w:val="1"/>
+      <w:numFmt w:val="bullet"/>
+      <w:lvlText w:val=""/>
+      <w:lvlJc w:val="left"/>
+      <w:pPr>
+        <w:tabs>
+          <w:tab w:val="num" w:pos="2880"/>
+        </w:tabs>
+        <w:ind w:left="2880" w:hanging="360"/>
+      </w:pPr>
+      <w:rPr>
+        <w:rFonts w:ascii="Wingdings" w:hAnsi="Wingdings" w:hint="default"/>
+        <w:sz w:val="20"/>
+      </w:rPr>
+    </w:lvl>
+    <w:lvl w:ilvl="4" w:tentative="1">
+      <w:start w:val="1"/>
+      <w:numFmt w:val="bullet"/>
+      <w:lvlText w:val=""/>
+      <w:lvlJc w:val="left"/>
+      <w:pPr>
+        <w:tabs>
+          <w:tab w:val="num" w:pos="3600"/>
+        </w:tabs>
+        <w:ind w:left="3600" w:hanging="360"/>
+      </w:pPr>
+      <w:rPr>
+        <w:rFonts w:ascii="Wingdings" w:hAnsi="Wingdings" w:hint="default"/>
+        <w:sz w:val="20"/>
+      </w:rPr>
+    </w:lvl>
+    <w:lvl w:ilvl="5" w:tentative="1">
+      <w:start w:val="1"/>
+      <w:numFmt w:val="bullet"/>
+      <w:lvlText w:val=""/>
+      <w:lvlJc w:val="left"/>
+      <w:pPr>
+        <w:tabs>
+          <w:tab w:val="num" w:pos="4320"/>
+        </w:tabs>
+        <w:ind w:left="4320" w:hanging="360"/>
+      </w:pPr>
+      <w:rPr>
+        <w:rFonts w:ascii="Wingdings" w:hAnsi="Wingdings" w:hint="default"/>
+        <w:sz w:val="20"/>
+      </w:rPr>
+    </w:lvl>
+    <w:lvl w:ilvl="6" w:tentative="1">
+      <w:start w:val="1"/>
+      <w:numFmt w:val="bullet"/>
+      <w:lvlText w:val=""/>
+      <w:lvlJc w:val="left"/>
+      <w:pPr>
+        <w:tabs>
+          <w:tab w:val="num" w:pos="5040"/>
+        </w:tabs>
+        <w:ind w:left="5040" w:hanging="360"/>
+      </w:pPr>
+      <w:rPr>
+        <w:rFonts w:ascii="Wingdings" w:hAnsi="Wingdings" w:hint="default"/>
+        <w:sz w:val="20"/>
+      </w:rPr>
+    </w:lvl>
+    <w:lvl w:ilvl="7" w:tentative="1">
+      <w:start w:val="1"/>
+      <w:numFmt w:val="bullet"/>
+      <w:lvlText w:val=""/>
+      <w:lvlJc w:val="left"/>
+      <w:pPr>
+        <w:tabs>
+          <w:tab w:val="num" w:pos="5760"/>
+        </w:tabs>
+        <w:ind w:left="5760" w:hanging="360"/>
+      </w:pPr>
+      <w:rPr>
+        <w:rFonts w:ascii="Wingdings" w:hAnsi="Wingdings" w:hint="default"/>
+        <w:sz w:val="20"/>
+      </w:rPr>
+    </w:lvl>
+    <w:lvl w:ilvl="8" w:tentative="1">
+      <w:start w:val="1"/>
+      <w:numFmt w:val="bullet"/>
+      <w:lvlText w:val=""/>
+      <w:lvlJc w:val="left"/>
+      <w:pPr>
+        <w:tabs>
+          <w:tab w:val="num" w:pos="6480"/>
+        </w:tabs>
+        <w:ind w:left="6480" w:hanging="360"/>
+      </w:pPr>
+      <w:rPr>
+        <w:rFonts w:ascii="Wingdings" w:hAnsi="Wingdings" w:hint="default"/>
+        <w:sz w:val="20"/>
+      </w:rPr>
+    </w:lvl>
+  </w:abstractNum>
+  <w:abstractNum w:abstractNumId="10" w15:restartNumberingAfterBreak="0">
     <w:nsid w:val="36D95C30"/>
     <w:multiLevelType w:val="hybridMultilevel"/>
     <w:tmpl w:val="C7D003F2"/>
@@ -4181,7 +7738,7 @@
       </w:rPr>
     </w:lvl>
   </w:abstractNum>
-  <w:abstractNum w:abstractNumId="7" w15:restartNumberingAfterBreak="0">
+  <w:abstractNum w:abstractNumId="11" w15:restartNumberingAfterBreak="0">
     <w:nsid w:val="45F517DB"/>
     <w:multiLevelType w:val="hybridMultilevel"/>
     <w:tmpl w:val="CE8EB636"/>
@@ -4294,7 +7851,156 @@
       </w:rPr>
     </w:lvl>
   </w:abstractNum>
-  <w:abstractNum w:abstractNumId="8" w15:restartNumberingAfterBreak="0">
+  <w:abstractNum w:abstractNumId="12" w15:restartNumberingAfterBreak="0">
+    <w:nsid w:val="49EB7ADD"/>
+    <w:multiLevelType w:val="multilevel"/>
+    <w:tmpl w:val="AB58E030"/>
+    <w:lvl w:ilvl="0">
+      <w:start w:val="1"/>
+      <w:numFmt w:val="bullet"/>
+      <w:lvlText w:val=""/>
+      <w:lvlJc w:val="left"/>
+      <w:pPr>
+        <w:tabs>
+          <w:tab w:val="num" w:pos="720"/>
+        </w:tabs>
+        <w:ind w:left="720" w:hanging="360"/>
+      </w:pPr>
+      <w:rPr>
+        <w:rFonts w:ascii="Symbol" w:hAnsi="Symbol" w:hint="default"/>
+        <w:sz w:val="20"/>
+      </w:rPr>
+    </w:lvl>
+    <w:lvl w:ilvl="1" w:tentative="1">
+      <w:start w:val="1"/>
+      <w:numFmt w:val="bullet"/>
+      <w:lvlText w:val="o"/>
+      <w:lvlJc w:val="left"/>
+      <w:pPr>
+        <w:tabs>
+          <w:tab w:val="num" w:pos="1440"/>
+        </w:tabs>
+        <w:ind w:left="1440" w:hanging="360"/>
+      </w:pPr>
+      <w:rPr>
+        <w:rFonts w:ascii="Courier New" w:hAnsi="Courier New" w:hint="default"/>
+        <w:sz w:val="20"/>
+      </w:rPr>
+    </w:lvl>
+    <w:lvl w:ilvl="2" w:tentative="1">
+      <w:start w:val="1"/>
+      <w:numFmt w:val="bullet"/>
+      <w:lvlText w:val=""/>
+      <w:lvlJc w:val="left"/>
+      <w:pPr>
+        <w:tabs>
+          <w:tab w:val="num" w:pos="2160"/>
+        </w:tabs>
+        <w:ind w:left="2160" w:hanging="360"/>
+      </w:pPr>
+      <w:rPr>
+        <w:rFonts w:ascii="Wingdings" w:hAnsi="Wingdings" w:hint="default"/>
+        <w:sz w:val="20"/>
+      </w:rPr>
+    </w:lvl>
+    <w:lvl w:ilvl="3" w:tentative="1">
+      <w:start w:val="1"/>
+      <w:numFmt w:val="bullet"/>
+      <w:lvlText w:val=""/>
+      <w:lvlJc w:val="left"/>
+      <w:pPr>
+        <w:tabs>
+          <w:tab w:val="num" w:pos="2880"/>
+        </w:tabs>
+        <w:ind w:left="2880" w:hanging="360"/>
+      </w:pPr>
+      <w:rPr>
+        <w:rFonts w:ascii="Wingdings" w:hAnsi="Wingdings" w:hint="default"/>
+        <w:sz w:val="20"/>
+      </w:rPr>
+    </w:lvl>
+    <w:lvl w:ilvl="4" w:tentative="1">
+      <w:start w:val="1"/>
+      <w:numFmt w:val="bullet"/>
+      <w:lvlText w:val=""/>
+      <w:lvlJc w:val="left"/>
+      <w:pPr>
+        <w:tabs>
+          <w:tab w:val="num" w:pos="3600"/>
+        </w:tabs>
+        <w:ind w:left="3600" w:hanging="360"/>
+      </w:pPr>
+      <w:rPr>
+        <w:rFonts w:ascii="Wingdings" w:hAnsi="Wingdings" w:hint="default"/>
+        <w:sz w:val="20"/>
+      </w:rPr>
+    </w:lvl>
+    <w:lvl w:ilvl="5" w:tentative="1">
+      <w:start w:val="1"/>
+      <w:numFmt w:val="bullet"/>
+      <w:lvlText w:val=""/>
+      <w:lvlJc w:val="left"/>
+      <w:pPr>
+        <w:tabs>
+          <w:tab w:val="num" w:pos="4320"/>
+        </w:tabs>
+        <w:ind w:left="4320" w:hanging="360"/>
+      </w:pPr>
+      <w:rPr>
+        <w:rFonts w:ascii="Wingdings" w:hAnsi="Wingdings" w:hint="default"/>
+        <w:sz w:val="20"/>
+      </w:rPr>
+    </w:lvl>
+    <w:lvl w:ilvl="6" w:tentative="1">
+      <w:start w:val="1"/>
+      <w:numFmt w:val="bullet"/>
+      <w:lvlText w:val=""/>
+      <w:lvlJc w:val="left"/>
+      <w:pPr>
+        <w:tabs>
+          <w:tab w:val="num" w:pos="5040"/>
+        </w:tabs>
+        <w:ind w:left="5040" w:hanging="360"/>
+      </w:pPr>
+      <w:rPr>
+        <w:rFonts w:ascii="Wingdings" w:hAnsi="Wingdings" w:hint="default"/>
+        <w:sz w:val="20"/>
+      </w:rPr>
+    </w:lvl>
+    <w:lvl w:ilvl="7" w:tentative="1">
+      <w:start w:val="1"/>
+      <w:numFmt w:val="bullet"/>
+      <w:lvlText w:val=""/>
+      <w:lvlJc w:val="left"/>
+      <w:pPr>
+        <w:tabs>
+          <w:tab w:val="num" w:pos="5760"/>
+        </w:tabs>
+        <w:ind w:left="5760" w:hanging="360"/>
+      </w:pPr>
+      <w:rPr>
+        <w:rFonts w:ascii="Wingdings" w:hAnsi="Wingdings" w:hint="default"/>
+        <w:sz w:val="20"/>
+      </w:rPr>
+    </w:lvl>
+    <w:lvl w:ilvl="8" w:tentative="1">
+      <w:start w:val="1"/>
+      <w:numFmt w:val="bullet"/>
+      <w:lvlText w:val=""/>
+      <w:lvlJc w:val="left"/>
+      <w:pPr>
+        <w:tabs>
+          <w:tab w:val="num" w:pos="6480"/>
+        </w:tabs>
+        <w:ind w:left="6480" w:hanging="360"/>
+      </w:pPr>
+      <w:rPr>
+        <w:rFonts w:ascii="Wingdings" w:hAnsi="Wingdings" w:hint="default"/>
+        <w:sz w:val="20"/>
+      </w:rPr>
+    </w:lvl>
+  </w:abstractNum>
+  <w:abstractNum w:abstractNumId="13" w15:restartNumberingAfterBreak="0">
     <w:nsid w:val="4B302BD4"/>
     <w:multiLevelType w:val="hybridMultilevel"/>
     <w:tmpl w:val="9D36AA86"/>
@@ -4383,7 +8089,7 @@
       </w:pPr>
     </w:lvl>
   </w:abstractNum>
-  <w:abstractNum w:abstractNumId="9" w15:restartNumberingAfterBreak="0">
+  <w:abstractNum w:abstractNumId="14" w15:restartNumberingAfterBreak="0">
     <w:nsid w:val="56CE5A07"/>
     <w:multiLevelType w:val="hybridMultilevel"/>
     <w:tmpl w:val="305460F4"/>
@@ -4523,7 +8229,7 @@
       </w:rPr>
     </w:lvl>
   </w:abstractNum>
-  <w:abstractNum w:abstractNumId="10" w15:restartNumberingAfterBreak="0">
+  <w:abstractNum w:abstractNumId="15" w15:restartNumberingAfterBreak="0">
     <w:nsid w:val="57E41D64"/>
     <w:multiLevelType w:val="hybridMultilevel"/>
     <w:tmpl w:val="9F0ACD00"/>
@@ -4663,7 +8369,7 @@
       </w:rPr>
     </w:lvl>
   </w:abstractNum>
-  <w:abstractNum w:abstractNumId="11" w15:restartNumberingAfterBreak="0">
+  <w:abstractNum w:abstractNumId="16" w15:restartNumberingAfterBreak="0">
     <w:nsid w:val="5A303293"/>
     <w:multiLevelType w:val="hybridMultilevel"/>
     <w:tmpl w:val="D7184CF6"/>
@@ -4803,7 +8509,305 @@
       </w:rPr>
     </w:lvl>
   </w:abstractNum>
-  <w:abstractNum w:abstractNumId="12" w15:restartNumberingAfterBreak="0">
+  <w:abstractNum w:abstractNumId="17" w15:restartNumberingAfterBreak="0">
+    <w:nsid w:val="5C6315DD"/>
+    <w:multiLevelType w:val="multilevel"/>
+    <w:tmpl w:val="E4728940"/>
+    <w:lvl w:ilvl="0">
+      <w:start w:val="1"/>
+      <w:numFmt w:val="bullet"/>
+      <w:lvlText w:val=""/>
+      <w:lvlJc w:val="left"/>
+      <w:pPr>
+        <w:tabs>
+          <w:tab w:val="num" w:pos="720"/>
+        </w:tabs>
+        <w:ind w:left="720" w:hanging="360"/>
+      </w:pPr>
+      <w:rPr>
+        <w:rFonts w:ascii="Symbol" w:hAnsi="Symbol" w:hint="default"/>
+        <w:sz w:val="20"/>
+      </w:rPr>
+    </w:lvl>
+    <w:lvl w:ilvl="1" w:tentative="1">
+      <w:start w:val="1"/>
+      <w:numFmt w:val="bullet"/>
+      <w:lvlText w:val="o"/>
+      <w:lvlJc w:val="left"/>
+      <w:pPr>
+        <w:tabs>
+          <w:tab w:val="num" w:pos="1440"/>
+        </w:tabs>
+        <w:ind w:left="1440" w:hanging="360"/>
+      </w:pPr>
+      <w:rPr>
+        <w:rFonts w:ascii="Courier New" w:hAnsi="Courier New" w:hint="default"/>
+        <w:sz w:val="20"/>
+      </w:rPr>
+    </w:lvl>
+    <w:lvl w:ilvl="2" w:tentative="1">
+      <w:start w:val="1"/>
+      <w:numFmt w:val="bullet"/>
+      <w:lvlText w:val=""/>
+      <w:lvlJc w:val="left"/>
+      <w:pPr>
+        <w:tabs>
+          <w:tab w:val="num" w:pos="2160"/>
+        </w:tabs>
+        <w:ind w:left="2160" w:hanging="360"/>
+      </w:pPr>
+      <w:rPr>
+        <w:rFonts w:ascii="Wingdings" w:hAnsi="Wingdings" w:hint="default"/>
+        <w:sz w:val="20"/>
+      </w:rPr>
+    </w:lvl>
+    <w:lvl w:ilvl="3" w:tentative="1">
+      <w:start w:val="1"/>
+      <w:numFmt w:val="bullet"/>
+      <w:lvlText w:val=""/>
+      <w:lvlJc w:val="left"/>
+      <w:pPr>
+        <w:tabs>
+          <w:tab w:val="num" w:pos="2880"/>
+        </w:tabs>
+        <w:ind w:left="2880" w:hanging="360"/>
+      </w:pPr>
+      <w:rPr>
+        <w:rFonts w:ascii="Wingdings" w:hAnsi="Wingdings" w:hint="default"/>
+        <w:sz w:val="20"/>
+      </w:rPr>
+    </w:lvl>
+    <w:lvl w:ilvl="4" w:tentative="1">
+      <w:start w:val="1"/>
+      <w:numFmt w:val="bullet"/>
+      <w:lvlText w:val=""/>
+      <w:lvlJc w:val="left"/>
+      <w:pPr>
+        <w:tabs>
+          <w:tab w:val="num" w:pos="3600"/>
+        </w:tabs>
+        <w:ind w:left="3600" w:hanging="360"/>
+      </w:pPr>
+      <w:rPr>
+        <w:rFonts w:ascii="Wingdings" w:hAnsi="Wingdings" w:hint="default"/>
+        <w:sz w:val="20"/>
+      </w:rPr>
+    </w:lvl>
+    <w:lvl w:ilvl="5" w:tentative="1">
+      <w:start w:val="1"/>
+      <w:numFmt w:val="bullet"/>
+      <w:lvlText w:val=""/>
+      <w:lvlJc w:val="left"/>
+      <w:pPr>
+        <w:tabs>
+          <w:tab w:val="num" w:pos="4320"/>
+        </w:tabs>
+        <w:ind w:left="4320" w:hanging="360"/>
+      </w:pPr>
+      <w:rPr>
+        <w:rFonts w:ascii="Wingdings" w:hAnsi="Wingdings" w:hint="default"/>
+        <w:sz w:val="20"/>
+      </w:rPr>
+    </w:lvl>
+    <w:lvl w:ilvl="6" w:tentative="1">
+      <w:start w:val="1"/>
+      <w:numFmt w:val="bullet"/>
+      <w:lvlText w:val=""/>
+      <w:lvlJc w:val="left"/>
+      <w:pPr>
+        <w:tabs>
+          <w:tab w:val="num" w:pos="5040"/>
+        </w:tabs>
+        <w:ind w:left="5040" w:hanging="360"/>
+      </w:pPr>
+      <w:rPr>
+        <w:rFonts w:ascii="Wingdings" w:hAnsi="Wingdings" w:hint="default"/>
+        <w:sz w:val="20"/>
+      </w:rPr>
+    </w:lvl>
+    <w:lvl w:ilvl="7" w:tentative="1">
+      <w:start w:val="1"/>
+      <w:numFmt w:val="bullet"/>
+      <w:lvlText w:val=""/>
+      <w:lvlJc w:val="left"/>
+      <w:pPr>
+        <w:tabs>
+          <w:tab w:val="num" w:pos="5760"/>
+        </w:tabs>
+        <w:ind w:left="5760" w:hanging="360"/>
+      </w:pPr>
+      <w:rPr>
+        <w:rFonts w:ascii="Wingdings" w:hAnsi="Wingdings" w:hint="default"/>
+        <w:sz w:val="20"/>
+      </w:rPr>
+    </w:lvl>
+    <w:lvl w:ilvl="8" w:tentative="1">
+      <w:start w:val="1"/>
+      <w:numFmt w:val="bullet"/>
+      <w:lvlText w:val=""/>
+      <w:lvlJc w:val="left"/>
+      <w:pPr>
+        <w:tabs>
+          <w:tab w:val="num" w:pos="6480"/>
+        </w:tabs>
+        <w:ind w:left="6480" w:hanging="360"/>
+      </w:pPr>
+      <w:rPr>
+        <w:rFonts w:ascii="Wingdings" w:hAnsi="Wingdings" w:hint="default"/>
+        <w:sz w:val="20"/>
+      </w:rPr>
+    </w:lvl>
+  </w:abstractNum>
+  <w:abstractNum w:abstractNumId="18" w15:restartNumberingAfterBreak="0">
+    <w:nsid w:val="606C69CB"/>
+    <w:multiLevelType w:val="multilevel"/>
+    <w:tmpl w:val="C9FC62F8"/>
+    <w:lvl w:ilvl="0">
+      <w:start w:val="1"/>
+      <w:numFmt w:val="bullet"/>
+      <w:lvlText w:val=""/>
+      <w:lvlJc w:val="left"/>
+      <w:pPr>
+        <w:tabs>
+          <w:tab w:val="num" w:pos="720"/>
+        </w:tabs>
+        <w:ind w:left="720" w:hanging="360"/>
+      </w:pPr>
+      <w:rPr>
+        <w:rFonts w:ascii="Symbol" w:hAnsi="Symbol" w:hint="default"/>
+        <w:sz w:val="20"/>
+      </w:rPr>
+    </w:lvl>
+    <w:lvl w:ilvl="1" w:tentative="1">
+      <w:start w:val="1"/>
+      <w:numFmt w:val="bullet"/>
+      <w:lvlText w:val="o"/>
+      <w:lvlJc w:val="left"/>
+      <w:pPr>
+        <w:tabs>
+          <w:tab w:val="num" w:pos="1440"/>
+        </w:tabs>
+        <w:ind w:left="1440" w:hanging="360"/>
+      </w:pPr>
+      <w:rPr>
+        <w:rFonts w:ascii="Courier New" w:hAnsi="Courier New" w:hint="default"/>
+        <w:sz w:val="20"/>
+      </w:rPr>
+    </w:lvl>
+    <w:lvl w:ilvl="2" w:tentative="1">
+      <w:start w:val="1"/>
+      <w:numFmt w:val="bullet"/>
+      <w:lvlText w:val=""/>
+      <w:lvlJc w:val="left"/>
+      <w:pPr>
+        <w:tabs>
+          <w:tab w:val="num" w:pos="2160"/>
+        </w:tabs>
+        <w:ind w:left="2160" w:hanging="360"/>
+      </w:pPr>
+      <w:rPr>
+        <w:rFonts w:ascii="Wingdings" w:hAnsi="Wingdings" w:hint="default"/>
+        <w:sz w:val="20"/>
+      </w:rPr>
+    </w:lvl>
+    <w:lvl w:ilvl="3" w:tentative="1">
+      <w:start w:val="1"/>
+      <w:numFmt w:val="bullet"/>
+      <w:lvlText w:val=""/>
+      <w:lvlJc w:val="left"/>
+      <w:pPr>
+        <w:tabs>
+          <w:tab w:val="num" w:pos="2880"/>
+        </w:tabs>
+        <w:ind w:left="2880" w:hanging="360"/>
+      </w:pPr>
+      <w:rPr>
+        <w:rFonts w:ascii="Wingdings" w:hAnsi="Wingdings" w:hint="default"/>
+        <w:sz w:val="20"/>
+      </w:rPr>
+    </w:lvl>
+    <w:lvl w:ilvl="4" w:tentative="1">
+      <w:start w:val="1"/>
+      <w:numFmt w:val="bullet"/>
+      <w:lvlText w:val=""/>
+      <w:lvlJc w:val="left"/>
+      <w:pPr>
+        <w:tabs>
+          <w:tab w:val="num" w:pos="3600"/>
+        </w:tabs>
+        <w:ind w:left="3600" w:hanging="360"/>
+      </w:pPr>
+      <w:rPr>
+        <w:rFonts w:ascii="Wingdings" w:hAnsi="Wingdings" w:hint="default"/>
+        <w:sz w:val="20"/>
+      </w:rPr>
+    </w:lvl>
+    <w:lvl w:ilvl="5" w:tentative="1">
+      <w:start w:val="1"/>
+      <w:numFmt w:val="bullet"/>
+      <w:lvlText w:val=""/>
+      <w:lvlJc w:val="left"/>
+      <w:pPr>
+        <w:tabs>
+          <w:tab w:val="num" w:pos="4320"/>
+        </w:tabs>
+        <w:ind w:left="4320" w:hanging="360"/>
+      </w:pPr>
+      <w:rPr>
+        <w:rFonts w:ascii="Wingdings" w:hAnsi="Wingdings" w:hint="default"/>
+        <w:sz w:val="20"/>
+      </w:rPr>
+    </w:lvl>
+    <w:lvl w:ilvl="6" w:tentative="1">
+      <w:start w:val="1"/>
+      <w:numFmt w:val="bullet"/>
+      <w:lvlText w:val=""/>
+      <w:lvlJc w:val="left"/>
+      <w:pPr>
+        <w:tabs>
+          <w:tab w:val="num" w:pos="5040"/>
+        </w:tabs>
+        <w:ind w:left="5040" w:hanging="360"/>
+      </w:pPr>
+      <w:rPr>
+        <w:rFonts w:ascii="Wingdings" w:hAnsi="Wingdings" w:hint="default"/>
+        <w:sz w:val="20"/>
+      </w:rPr>
+    </w:lvl>
+    <w:lvl w:ilvl="7" w:tentative="1">
+      <w:start w:val="1"/>
+      <w:numFmt w:val="bullet"/>
+      <w:lvlText w:val=""/>
+      <w:lvlJc w:val="left"/>
+      <w:pPr>
+        <w:tabs>
+          <w:tab w:val="num" w:pos="5760"/>
+        </w:tabs>
+        <w:ind w:left="5760" w:hanging="360"/>
+      </w:pPr>
+      <w:rPr>
+        <w:rFonts w:ascii="Wingdings" w:hAnsi="Wingdings" w:hint="default"/>
+        <w:sz w:val="20"/>
+      </w:rPr>
+    </w:lvl>
+    <w:lvl w:ilvl="8" w:tentative="1">
+      <w:start w:val="1"/>
+      <w:numFmt w:val="bullet"/>
+      <w:lvlText w:val=""/>
+      <w:lvlJc w:val="left"/>
+      <w:pPr>
+        <w:tabs>
+          <w:tab w:val="num" w:pos="6480"/>
+        </w:tabs>
+        <w:ind w:left="6480" w:hanging="360"/>
+      </w:pPr>
+      <w:rPr>
+        <w:rFonts w:ascii="Wingdings" w:hAnsi="Wingdings" w:hint="default"/>
+        <w:sz w:val="20"/>
+      </w:rPr>
+    </w:lvl>
+  </w:abstractNum>
+  <w:abstractNum w:abstractNumId="19" w15:restartNumberingAfterBreak="0">
     <w:nsid w:val="69BB0BE0"/>
     <w:multiLevelType w:val="hybridMultilevel"/>
     <w:tmpl w:val="617EB404"/>
@@ -4943,7 +8947,120 @@
       </w:rPr>
     </w:lvl>
   </w:abstractNum>
-  <w:abstractNum w:abstractNumId="13" w15:restartNumberingAfterBreak="0">
+  <w:abstractNum w:abstractNumId="20" w15:restartNumberingAfterBreak="0">
+    <w:nsid w:val="6AB030F7"/>
+    <w:multiLevelType w:val="hybridMultilevel"/>
+    <w:tmpl w:val="46EEA212"/>
+    <w:lvl w:ilvl="0" w:tplc="40090001">
+      <w:start w:val="1"/>
+      <w:numFmt w:val="bullet"/>
+      <w:lvlText w:val=""/>
+      <w:lvlJc w:val="left"/>
+      <w:pPr>
+        <w:ind w:left="720" w:hanging="360"/>
+      </w:pPr>
+      <w:rPr>
+        <w:rFonts w:ascii="Symbol" w:hAnsi="Symbol" w:hint="default"/>
+      </w:rPr>
+    </w:lvl>
+    <w:lvl w:ilvl="1" w:tplc="40090003" w:tentative="1">
+      <w:start w:val="1"/>
+      <w:numFmt w:val="bullet"/>
+      <w:lvlText w:val="o"/>
+      <w:lvlJc w:val="left"/>
+      <w:pPr>
+        <w:ind w:left="1440" w:hanging="360"/>
+      </w:pPr>
+      <w:rPr>
+        <w:rFonts w:ascii="Courier New" w:hAnsi="Courier New" w:cs="Courier New" w:hint="default"/>
+      </w:rPr>
+    </w:lvl>
+    <w:lvl w:ilvl="2" w:tplc="40090005" w:tentative="1">
+      <w:start w:val="1"/>
+      <w:numFmt w:val="bullet"/>
+      <w:lvlText w:val=""/>
+      <w:lvlJc w:val="left"/>
+      <w:pPr>
+        <w:ind w:left="2160" w:hanging="360"/>
+      </w:pPr>
+      <w:rPr>
+        <w:rFonts w:ascii="Wingdings" w:hAnsi="Wingdings" w:hint="default"/>
+      </w:rPr>
+    </w:lvl>
+    <w:lvl w:ilvl="3" w:tplc="40090001" w:tentative="1">
+      <w:start w:val="1"/>
+      <w:numFmt w:val="bullet"/>
+      <w:lvlText w:val=""/>
+      <w:lvlJc w:val="left"/>
+      <w:pPr>
+        <w:ind w:left="2880" w:hanging="360"/>
+      </w:pPr>
+      <w:rPr>
+        <w:rFonts w:ascii="Symbol" w:hAnsi="Symbol" w:hint="default"/>
+      </w:rPr>
+    </w:lvl>
+    <w:lvl w:ilvl="4" w:tplc="40090003" w:tentative="1">
+      <w:start w:val="1"/>
+      <w:numFmt w:val="bullet"/>
+      <w:lvlText w:val="o"/>
+      <w:lvlJc w:val="left"/>
+      <w:pPr>
+        <w:ind w:left="3600" w:hanging="360"/>
+      </w:pPr>
+      <w:rPr>
+        <w:rFonts w:ascii="Courier New" w:hAnsi="Courier New" w:cs="Courier New" w:hint="default"/>
+      </w:rPr>
+    </w:lvl>
+    <w:lvl w:ilvl="5" w:tplc="40090005" w:tentative="1">
+      <w:start w:val="1"/>
+      <w:numFmt w:val="bullet"/>
+      <w:lvlText w:val=""/>
+      <w:lvlJc w:val="left"/>
+      <w:pPr>
+        <w:ind w:left="4320" w:hanging="360"/>
+      </w:pPr>
+      <w:rPr>
+        <w:rFonts w:ascii="Wingdings" w:hAnsi="Wingdings" w:hint="default"/>
+      </w:rPr>
+    </w:lvl>
+    <w:lvl w:ilvl="6" w:tplc="40090001" w:tentative="1">
+      <w:start w:val="1"/>
+      <w:numFmt w:val="bullet"/>
+      <w:lvlText w:val=""/>
+      <w:lvlJc w:val="left"/>
+      <w:pPr>
+        <w:ind w:left="5040" w:hanging="360"/>
+      </w:pPr>
+      <w:rPr>
+        <w:rFonts w:ascii="Symbol" w:hAnsi="Symbol" w:hint="default"/>
+      </w:rPr>
+    </w:lvl>
+    <w:lvl w:ilvl="7" w:tplc="40090003" w:tentative="1">
+      <w:start w:val="1"/>
+      <w:numFmt w:val="bullet"/>
+      <w:lvlText w:val="o"/>
+      <w:lvlJc w:val="left"/>
+      <w:pPr>
+        <w:ind w:left="5760" w:hanging="360"/>
+      </w:pPr>
+      <w:rPr>
+        <w:rFonts w:ascii="Courier New" w:hAnsi="Courier New" w:cs="Courier New" w:hint="default"/>
+      </w:rPr>
+    </w:lvl>
+    <w:lvl w:ilvl="8" w:tplc="40090005" w:tentative="1">
+      <w:start w:val="1"/>
+      <w:numFmt w:val="bullet"/>
+      <w:lvlText w:val=""/>
+      <w:lvlJc w:val="left"/>
+      <w:pPr>
+        <w:ind w:left="6480" w:hanging="360"/>
+      </w:pPr>
+      <w:rPr>
+        <w:rFonts w:ascii="Wingdings" w:hAnsi="Wingdings" w:hint="default"/>
+      </w:rPr>
+    </w:lvl>
+  </w:abstractNum>
+  <w:abstractNum w:abstractNumId="21" w15:restartNumberingAfterBreak="0">
     <w:nsid w:val="6B962F89"/>
     <w:multiLevelType w:val="hybridMultilevel"/>
     <w:tmpl w:val="BACCB840"/>
@@ -5083,7 +9200,7 @@
       </w:rPr>
     </w:lvl>
   </w:abstractNum>
-  <w:abstractNum w:abstractNumId="14" w15:restartNumberingAfterBreak="0">
+  <w:abstractNum w:abstractNumId="22" w15:restartNumberingAfterBreak="0">
     <w:nsid w:val="6CDA336A"/>
     <w:multiLevelType w:val="hybridMultilevel"/>
     <w:tmpl w:val="4E7670AE"/>
@@ -5223,7 +9340,120 @@
       </w:rPr>
     </w:lvl>
   </w:abstractNum>
-  <w:abstractNum w:abstractNumId="15" w15:restartNumberingAfterBreak="0">
+  <w:abstractNum w:abstractNumId="23" w15:restartNumberingAfterBreak="0">
+    <w:nsid w:val="6F2B0C99"/>
+    <w:multiLevelType w:val="hybridMultilevel"/>
+    <w:tmpl w:val="01F8D37E"/>
+    <w:lvl w:ilvl="0" w:tplc="40090001">
+      <w:start w:val="1"/>
+      <w:numFmt w:val="bullet"/>
+      <w:lvlText w:val=""/>
+      <w:lvlJc w:val="left"/>
+      <w:pPr>
+        <w:ind w:left="720" w:hanging="360"/>
+      </w:pPr>
+      <w:rPr>
+        <w:rFonts w:ascii="Symbol" w:hAnsi="Symbol" w:hint="default"/>
+      </w:rPr>
+    </w:lvl>
+    <w:lvl w:ilvl="1" w:tplc="40090003" w:tentative="1">
+      <w:start w:val="1"/>
+      <w:numFmt w:val="bullet"/>
+      <w:lvlText w:val="o"/>
+      <w:lvlJc w:val="left"/>
+      <w:pPr>
+        <w:ind w:left="1440" w:hanging="360"/>
+      </w:pPr>
+      <w:rPr>
+        <w:rFonts w:ascii="Courier New" w:hAnsi="Courier New" w:cs="Courier New" w:hint="default"/>
+      </w:rPr>
+    </w:lvl>
+    <w:lvl w:ilvl="2" w:tplc="40090005" w:tentative="1">
+      <w:start w:val="1"/>
+      <w:numFmt w:val="bullet"/>
+      <w:lvlText w:val=""/>
+      <w:lvlJc w:val="left"/>
+      <w:pPr>
+        <w:ind w:left="2160" w:hanging="360"/>
+      </w:pPr>
+      <w:rPr>
+        <w:rFonts w:ascii="Wingdings" w:hAnsi="Wingdings" w:hint="default"/>
+      </w:rPr>
+    </w:lvl>
+    <w:lvl w:ilvl="3" w:tplc="40090001" w:tentative="1">
+      <w:start w:val="1"/>
+      <w:numFmt w:val="bullet"/>
+      <w:lvlText w:val=""/>
+      <w:lvlJc w:val="left"/>
+      <w:pPr>
+        <w:ind w:left="2880" w:hanging="360"/>
+      </w:pPr>
+      <w:rPr>
+        <w:rFonts w:ascii="Symbol" w:hAnsi="Symbol" w:hint="default"/>
+      </w:rPr>
+    </w:lvl>
+    <w:lvl w:ilvl="4" w:tplc="40090003" w:tentative="1">
+      <w:start w:val="1"/>
+      <w:numFmt w:val="bullet"/>
+      <w:lvlText w:val="o"/>
+      <w:lvlJc w:val="left"/>
+      <w:pPr>
+        <w:ind w:left="3600" w:hanging="360"/>
+      </w:pPr>
+      <w:rPr>
+        <w:rFonts w:ascii="Courier New" w:hAnsi="Courier New" w:cs="Courier New" w:hint="default"/>
+      </w:rPr>
+    </w:lvl>
+    <w:lvl w:ilvl="5" w:tplc="40090005" w:tentative="1">
+      <w:start w:val="1"/>
+      <w:numFmt w:val="bullet"/>
+      <w:lvlText w:val=""/>
+      <w:lvlJc w:val="left"/>
+      <w:pPr>
+        <w:ind w:left="4320" w:hanging="360"/>
+      </w:pPr>
+      <w:rPr>
+        <w:rFonts w:ascii="Wingdings" w:hAnsi="Wingdings" w:hint="default"/>
+      </w:rPr>
+    </w:lvl>
+    <w:lvl w:ilvl="6" w:tplc="40090001" w:tentative="1">
+      <w:start w:val="1"/>
+      <w:numFmt w:val="bullet"/>
+      <w:lvlText w:val=""/>
+      <w:lvlJc w:val="left"/>
+      <w:pPr>
+        <w:ind w:left="5040" w:hanging="360"/>
+      </w:pPr>
+      <w:rPr>
+        <w:rFonts w:ascii="Symbol" w:hAnsi="Symbol" w:hint="default"/>
+      </w:rPr>
+    </w:lvl>
+    <w:lvl w:ilvl="7" w:tplc="40090003" w:tentative="1">
+      <w:start w:val="1"/>
+      <w:numFmt w:val="bullet"/>
+      <w:lvlText w:val="o"/>
+      <w:lvlJc w:val="left"/>
+      <w:pPr>
+        <w:ind w:left="5760" w:hanging="360"/>
+      </w:pPr>
+      <w:rPr>
+        <w:rFonts w:ascii="Courier New" w:hAnsi="Courier New" w:cs="Courier New" w:hint="default"/>
+      </w:rPr>
+    </w:lvl>
+    <w:lvl w:ilvl="8" w:tplc="40090005" w:tentative="1">
+      <w:start w:val="1"/>
+      <w:numFmt w:val="bullet"/>
+      <w:lvlText w:val=""/>
+      <w:lvlJc w:val="left"/>
+      <w:pPr>
+        <w:ind w:left="6480" w:hanging="360"/>
+      </w:pPr>
+      <w:rPr>
+        <w:rFonts w:ascii="Wingdings" w:hAnsi="Wingdings" w:hint="default"/>
+      </w:rPr>
+    </w:lvl>
+  </w:abstractNum>
+  <w:abstractNum w:abstractNumId="24" w15:restartNumberingAfterBreak="0">
     <w:nsid w:val="6F6E201E"/>
     <w:multiLevelType w:val="hybridMultilevel"/>
     <w:tmpl w:val="8E980682"/>
@@ -5363,7 +9593,7 @@
       </w:rPr>
     </w:lvl>
   </w:abstractNum>
-  <w:abstractNum w:abstractNumId="16" w15:restartNumberingAfterBreak="0">
+  <w:abstractNum w:abstractNumId="25" w15:restartNumberingAfterBreak="0">
     <w:nsid w:val="70CD4AED"/>
     <w:multiLevelType w:val="hybridMultilevel"/>
     <w:tmpl w:val="4B1274F0"/>
@@ -5503,7 +9733,7 @@
       </w:rPr>
     </w:lvl>
   </w:abstractNum>
-  <w:abstractNum w:abstractNumId="17" w15:restartNumberingAfterBreak="0">
+  <w:abstractNum w:abstractNumId="26" w15:restartNumberingAfterBreak="0">
     <w:nsid w:val="783B3D5F"/>
     <w:multiLevelType w:val="hybridMultilevel"/>
     <w:tmpl w:val="5ED474B2"/>
@@ -5643,7 +9873,269 @@
       </w:rPr>
     </w:lvl>
   </w:abstractNum>
-  <w:abstractNum w:abstractNumId="18" w15:restartNumberingAfterBreak="0">
+  <w:abstractNum w:abstractNumId="27" w15:restartNumberingAfterBreak="0">
+    <w:nsid w:val="79A91BB6"/>
+    <w:multiLevelType w:val="multilevel"/>
+    <w:tmpl w:val="A36A922A"/>
+    <w:lvl w:ilvl="0">
+      <w:start w:val="1"/>
+      <w:numFmt w:val="bullet"/>
+      <w:lvlText w:val=""/>
+      <w:lvlJc w:val="left"/>
+      <w:pPr>
+        <w:tabs>
+          <w:tab w:val="num" w:pos="720"/>
+        </w:tabs>
+        <w:ind w:left="720" w:hanging="360"/>
+      </w:pPr>
+      <w:rPr>
+        <w:rFonts w:ascii="Symbol" w:hAnsi="Symbol" w:hint="default"/>
+        <w:sz w:val="20"/>
+      </w:rPr>
+    </w:lvl>
+    <w:lvl w:ilvl="1" w:tentative="1">
+      <w:start w:val="1"/>
+      <w:numFmt w:val="bullet"/>
+      <w:lvlText w:val="o"/>
+      <w:lvlJc w:val="left"/>
+      <w:pPr>
+        <w:tabs>
+          <w:tab w:val="num" w:pos="1440"/>
+        </w:tabs>
+        <w:ind w:left="1440" w:hanging="360"/>
+      </w:pPr>
+      <w:rPr>
+        <w:rFonts w:ascii="Courier New" w:hAnsi="Courier New" w:hint="default"/>
+        <w:sz w:val="20"/>
+      </w:rPr>
+    </w:lvl>
+    <w:lvl w:ilvl="2" w:tentative="1">
+      <w:start w:val="1"/>
+      <w:numFmt w:val="bullet"/>
+      <w:lvlText w:val=""/>
+      <w:lvlJc w:val="left"/>
+      <w:pPr>
+        <w:tabs>
+          <w:tab w:val="num" w:pos="2160"/>
+        </w:tabs>
+        <w:ind w:left="2160" w:hanging="360"/>
+      </w:pPr>
+      <w:rPr>
+        <w:rFonts w:ascii="Wingdings" w:hAnsi="Wingdings" w:hint="default"/>
+        <w:sz w:val="20"/>
+      </w:rPr>
+    </w:lvl>
+    <w:lvl w:ilvl="3" w:tentative="1">
+      <w:start w:val="1"/>
+      <w:numFmt w:val="bullet"/>
+      <w:lvlText w:val=""/>
+      <w:lvlJc w:val="left"/>
+      <w:pPr>
+        <w:tabs>
+          <w:tab w:val="num" w:pos="2880"/>
+        </w:tabs>
+        <w:ind w:left="2880" w:hanging="360"/>
+      </w:pPr>
+      <w:rPr>
+        <w:rFonts w:ascii="Wingdings" w:hAnsi="Wingdings" w:hint="default"/>
+        <w:sz w:val="20"/>
+      </w:rPr>
+    </w:lvl>
+    <w:lvl w:ilvl="4" w:tentative="1">
+      <w:start w:val="1"/>
+      <w:numFmt w:val="bullet"/>
+      <w:lvlText w:val=""/>
+      <w:lvlJc w:val="left"/>
+      <w:pPr>
+        <w:tabs>
+          <w:tab w:val="num" w:pos="3600"/>
+        </w:tabs>
+        <w:ind w:left="3600" w:hanging="360"/>
+      </w:pPr>
+      <w:rPr>
+        <w:rFonts w:ascii="Wingdings" w:hAnsi="Wingdings" w:hint="default"/>
+        <w:sz w:val="20"/>
+      </w:rPr>
+    </w:lvl>
+    <w:lvl w:ilvl="5" w:tentative="1">
+      <w:start w:val="1"/>
+      <w:numFmt w:val="bullet"/>
+      <w:lvlText w:val=""/>
+      <w:lvlJc w:val="left"/>
+      <w:pPr>
+        <w:tabs>
+          <w:tab w:val="num" w:pos="4320"/>
+        </w:tabs>
+        <w:ind w:left="4320" w:hanging="360"/>
+      </w:pPr>
+      <w:rPr>
+        <w:rFonts w:ascii="Wingdings" w:hAnsi="Wingdings" w:hint="default"/>
+        <w:sz w:val="20"/>
+      </w:rPr>
+    </w:lvl>
+    <w:lvl w:ilvl="6" w:tentative="1">
+      <w:start w:val="1"/>
+      <w:numFmt w:val="bullet"/>
+      <w:lvlText w:val=""/>
+      <w:lvlJc w:val="left"/>
+      <w:pPr>
+        <w:tabs>
+          <w:tab w:val="num" w:pos="5040"/>
+        </w:tabs>
+        <w:ind w:left="5040" w:hanging="360"/>
+      </w:pPr>
+      <w:rPr>
+        <w:rFonts w:ascii="Wingdings" w:hAnsi="Wingdings" w:hint="default"/>
+        <w:sz w:val="20"/>
+      </w:rPr>
+    </w:lvl>
+    <w:lvl w:ilvl="7" w:tentative="1">
+      <w:start w:val="1"/>
+      <w:numFmt w:val="bullet"/>
+      <w:lvlText w:val=""/>
+      <w:lvlJc w:val="left"/>
+      <w:pPr>
+        <w:tabs>
+          <w:tab w:val="num" w:pos="5760"/>
+        </w:tabs>
+        <w:ind w:left="5760" w:hanging="360"/>
+      </w:pPr>
+      <w:rPr>
+        <w:rFonts w:ascii="Wingdings" w:hAnsi="Wingdings" w:hint="default"/>
+        <w:sz w:val="20"/>
+      </w:rPr>
+    </w:lvl>
+    <w:lvl w:ilvl="8" w:tentative="1">
+      <w:start w:val="1"/>
+      <w:numFmt w:val="bullet"/>
+      <w:lvlText w:val=""/>
+      <w:lvlJc w:val="left"/>
+      <w:pPr>
+        <w:tabs>
+          <w:tab w:val="num" w:pos="6480"/>
+        </w:tabs>
+        <w:ind w:left="6480" w:hanging="360"/>
+      </w:pPr>
+      <w:rPr>
+        <w:rFonts w:ascii="Wingdings" w:hAnsi="Wingdings" w:hint="default"/>
+        <w:sz w:val="20"/>
+      </w:rPr>
+    </w:lvl>
+  </w:abstractNum>
+  <w:abstractNum w:abstractNumId="28" w15:restartNumberingAfterBreak="0">
+    <w:nsid w:val="7EBD6CE2"/>
+    <w:multiLevelType w:val="hybridMultilevel"/>
+    <w:tmpl w:val="EE1A1C06"/>
+    <w:lvl w:ilvl="0" w:tplc="40090001">
+      <w:start w:val="1"/>
+      <w:numFmt w:val="bullet"/>
+      <w:lvlText w:val=""/>
+      <w:lvlJc w:val="left"/>
+      <w:pPr>
+        <w:ind w:left="720" w:hanging="360"/>
+      </w:pPr>
+      <w:rPr>
+        <w:rFonts w:ascii="Symbol" w:hAnsi="Symbol" w:hint="default"/>
+      </w:rPr>
+    </w:lvl>
+    <w:lvl w:ilvl="1" w:tplc="40090003" w:tentative="1">
+      <w:start w:val="1"/>
+      <w:numFmt w:val="bullet"/>
+      <w:lvlText w:val="o"/>
+      <w:lvlJc w:val="left"/>
+      <w:pPr>
+        <w:ind w:left="1440" w:hanging="360"/>
+      </w:pPr>
+      <w:rPr>
+        <w:rFonts w:ascii="Courier New" w:hAnsi="Courier New" w:cs="Courier New" w:hint="default"/>
+      </w:rPr>
+    </w:lvl>
+    <w:lvl w:ilvl="2" w:tplc="40090005" w:tentative="1">
+      <w:start w:val="1"/>
+      <w:numFmt w:val="bullet"/>
+      <w:lvlText w:val=""/>
+      <w:lvlJc w:val="left"/>
+      <w:pPr>
+        <w:ind w:left="2160" w:hanging="360"/>
+      </w:pPr>
+      <w:rPr>
+        <w:rFonts w:ascii="Wingdings" w:hAnsi="Wingdings" w:hint="default"/>
+      </w:rPr>
+    </w:lvl>
+    <w:lvl w:ilvl="3" w:tplc="40090001" w:tentative="1">
+      <w:start w:val="1"/>
+      <w:numFmt w:val="bullet"/>
+      <w:lvlText w:val=""/>
+      <w:lvlJc w:val="left"/>
+      <w:pPr>
+        <w:ind w:left="2880" w:hanging="360"/>
+      </w:pPr>
+      <w:rPr>
+        <w:rFonts w:ascii="Symbol" w:hAnsi="Symbol" w:hint="default"/>
+      </w:rPr>
+    </w:lvl>
+    <w:lvl w:ilvl="4" w:tplc="40090003" w:tentative="1">
+      <w:start w:val="1"/>
+      <w:numFmt w:val="bullet"/>
+      <w:lvlText w:val="o"/>
+      <w:lvlJc w:val="left"/>
+      <w:pPr>
+        <w:ind w:left="3600" w:hanging="360"/>
+      </w:pPr>
+      <w:rPr>
+        <w:rFonts w:ascii="Courier New" w:hAnsi="Courier New" w:cs="Courier New" w:hint="default"/>
+      </w:rPr>
+    </w:lvl>
+    <w:lvl w:ilvl="5" w:tplc="40090005" w:tentative="1">
+      <w:start w:val="1"/>
+      <w:numFmt w:val="bullet"/>
+      <w:lvlText w:val=""/>
+      <w:lvlJc w:val="left"/>
+      <w:pPr>
+        <w:ind w:left="4320" w:hanging="360"/>
+      </w:pPr>
+      <w:rPr>
+        <w:rFonts w:ascii="Wingdings" w:hAnsi="Wingdings" w:hint="default"/>
+      </w:rPr>
+    </w:lvl>
+    <w:lvl w:ilvl="6" w:tplc="40090001" w:tentative="1">
+      <w:start w:val="1"/>
+      <w:numFmt w:val="bullet"/>
+      <w:lvlText w:val=""/>
+      <w:lvlJc w:val="left"/>
+      <w:pPr>
+        <w:ind w:left="5040" w:hanging="360"/>
+      </w:pPr>
+      <w:rPr>
+        <w:rFonts w:ascii="Symbol" w:hAnsi="Symbol" w:hint="default"/>
+      </w:rPr>
+    </w:lvl>
+    <w:lvl w:ilvl="7" w:tplc="40090003" w:tentative="1">
+      <w:start w:val="1"/>
+      <w:numFmt w:val="bullet"/>
+      <w:lvlText w:val="o"/>
+      <w:lvlJc w:val="left"/>
+      <w:pPr>
+        <w:ind w:left="5760" w:hanging="360"/>
+      </w:pPr>
+      <w:rPr>
+        <w:rFonts w:ascii="Courier New" w:hAnsi="Courier New" w:cs="Courier New" w:hint="default"/>
+      </w:rPr>
+    </w:lvl>
+    <w:lvl w:ilvl="8" w:tplc="40090005" w:tentative="1">
+      <w:start w:val="1"/>
+      <w:numFmt w:val="bullet"/>
+      <w:lvlText w:val=""/>
+      <w:lvlJc w:val="left"/>
+      <w:pPr>
+        <w:ind w:left="6480" w:hanging="360"/>
+      </w:pPr>
+      <w:rPr>
+        <w:rFonts w:ascii="Wingdings" w:hAnsi="Wingdings" w:hint="default"/>
+      </w:rPr>
+    </w:lvl>
+  </w:abstractNum>
+  <w:abstractNum w:abstractNumId="29" w15:restartNumberingAfterBreak="0">
     <w:nsid w:val="7F3555A1"/>
     <w:multiLevelType w:val="hybridMultilevel"/>
     <w:tmpl w:val="ABEE4F4C"/>
@@ -5783,7 +10275,7 @@
       </w:rPr>
     </w:lvl>
   </w:abstractNum>
-  <w:abstractNum w:abstractNumId="19" w15:restartNumberingAfterBreak="0">
+  <w:abstractNum w:abstractNumId="30" w15:restartNumberingAfterBreak="0">
     <w:nsid w:val="7FA946F7"/>
     <w:multiLevelType w:val="hybridMultilevel"/>
     <w:tmpl w:val="5B0C56C4"/>
@@ -5927,61 +10419,94 @@
     <w:abstractNumId w:val="1"/>
   </w:num>
   <w:num w:numId="2" w16cid:durableId="207378518">
-    <w:abstractNumId w:val="15"/>
+    <w:abstractNumId w:val="24"/>
   </w:num>
   <w:num w:numId="3" w16cid:durableId="1622959244">
-    <w:abstractNumId w:val="2"/>
+    <w:abstractNumId w:val="4"/>
   </w:num>
   <w:num w:numId="4" w16cid:durableId="1830710149">
-    <w:abstractNumId w:val="13"/>
+    <w:abstractNumId w:val="21"/>
   </w:num>
   <w:num w:numId="5" w16cid:durableId="6491571">
-    <w:abstractNumId w:val="6"/>
+    <w:abstractNumId w:val="10"/>
   </w:num>
   <w:num w:numId="6" w16cid:durableId="1906722806">
     <w:abstractNumId w:val="0"/>
   </w:num>
   <w:num w:numId="7" w16cid:durableId="227495081">
+    <w:abstractNumId w:val="14"/>
+  </w:num>
+  <w:num w:numId="8" w16cid:durableId="1906182019">
+    <w:abstractNumId w:val="7"/>
+  </w:num>
+  <w:num w:numId="9" w16cid:durableId="1467157761">
+    <w:abstractNumId w:val="22"/>
+  </w:num>
+  <w:num w:numId="10" w16cid:durableId="957296911">
+    <w:abstractNumId w:val="26"/>
+  </w:num>
+  <w:num w:numId="11" w16cid:durableId="1743676954">
+    <w:abstractNumId w:val="5"/>
+  </w:num>
+  <w:num w:numId="12" w16cid:durableId="1858158302">
+    <w:abstractNumId w:val="30"/>
+  </w:num>
+  <w:num w:numId="13" w16cid:durableId="1601644658">
+    <w:abstractNumId w:val="16"/>
+  </w:num>
+  <w:num w:numId="14" w16cid:durableId="928393718">
+    <w:abstractNumId w:val="19"/>
+  </w:num>
+  <w:num w:numId="15" w16cid:durableId="1925803085">
+    <w:abstractNumId w:val="29"/>
+  </w:num>
+  <w:num w:numId="16" w16cid:durableId="807935079">
+    <w:abstractNumId w:val="15"/>
+  </w:num>
+  <w:num w:numId="17" w16cid:durableId="1368674603">
+    <w:abstractNumId w:val="25"/>
+  </w:num>
+  <w:num w:numId="18" w16cid:durableId="5452043">
+    <w:abstractNumId w:val="6"/>
+  </w:num>
+  <w:num w:numId="19" w16cid:durableId="1854493569">
+    <w:abstractNumId w:val="11"/>
+  </w:num>
+  <w:num w:numId="20" w16cid:durableId="950207302">
+    <w:abstractNumId w:val="13"/>
+  </w:num>
+  <w:num w:numId="21" w16cid:durableId="834228262">
+    <w:abstractNumId w:val="28"/>
+  </w:num>
+  <w:num w:numId="22" w16cid:durableId="1137603474">
     <w:abstractNumId w:val="9"/>
   </w:num>
-  <w:num w:numId="8" w16cid:durableId="1906182019">
-    <w:abstractNumId w:val="5"/>
+  <w:num w:numId="23" w16cid:durableId="1406420481">
+    <w:abstractNumId w:val="3"/>
   </w:num>
-  <w:num w:numId="9" w16cid:durableId="1467157761">
-    <w:abstractNumId w:val="14"/>
+  <w:num w:numId="24" w16cid:durableId="1953979480">
+    <w:abstractNumId w:val="27"/>
   </w:num>
-  <w:num w:numId="10" w16cid:durableId="957296911">
+  <w:num w:numId="25" w16cid:durableId="2111732095">
+    <w:abstractNumId w:val="8"/>
+  </w:num>
+  <w:num w:numId="26" w16cid:durableId="1644651298">
     <w:abstractNumId w:val="17"/>
   </w:num>
-  <w:num w:numId="11" w16cid:durableId="1743676954">
-    <w:abstractNumId w:val="3"/>
-  </w:num>
-  <w:num w:numId="12" w16cid:durableId="1858158302">
-    <w:abstractNumId w:val="19"/>
-  </w:num>
-  <w:num w:numId="13" w16cid:durableId="1601644658">
-    <w:abstractNumId w:val="11"/>
-  </w:num>
-  <w:num w:numId="14" w16cid:durableId="928393718">
+  <w:num w:numId="27" w16cid:durableId="731387957">
     <w:abstractNumId w:val="12"/>
   </w:num>
-  <w:num w:numId="15" w16cid:durableId="1925803085">
+  <w:num w:numId="28" w16cid:durableId="245845369">
     <w:abstractNumId w:val="18"/>
   </w:num>
-  <w:num w:numId="16" w16cid:durableId="807935079">
-    <w:abstractNumId w:val="10"/>
+  <w:num w:numId="29" w16cid:durableId="1140420511">
+    <w:abstractNumId w:val="2"/>
   </w:num>
-  <w:num w:numId="17" w16cid:durableId="1368674603">
-    <w:abstractNumId w:val="16"/>
+  <w:num w:numId="30" w16cid:durableId="1112359595">
+    <w:abstractNumId w:val="23"/>
   </w:num>
-  <w:num w:numId="18" w16cid:durableId="5452043">
-    <w:abstractNumId w:val="4"/>
-  </w:num>
-  <w:num w:numId="19" w16cid:durableId="1854493569">
-    <w:abstractNumId w:val="7"/>
-  </w:num>
-  <w:num w:numId="20" w16cid:durableId="950207302">
-    <w:abstractNumId w:val="8"/>
+  <w:num w:numId="31" w16cid:durableId="1308851327">
+    <w:abstractNumId w:val="20"/>
   </w:num>
 </w:numbering>
 </file>
@@ -6589,7 +11114,6 @@
   <w:style w:type="character" w:default="1" w:styleId="DefaultParagraphFont">
     <w:name w:val="Default Paragraph Font"/>
     <w:uiPriority w:val="1"/>
-    <w:semiHidden/>
     <w:unhideWhenUsed/>
   </w:style>
   <w:style w:type="table" w:default="1" w:styleId="TableNormal">
@@ -6922,6 +11446,49 @@
       </w:tblBorders>
     </w:tblPr>
   </w:style>
+  <w:style w:type="paragraph" w:styleId="NormalWeb">
+    <w:name w:val="Normal (Web)"/>
+    <w:basedOn w:val="Normal"/>
+    <w:uiPriority w:val="99"/>
+    <w:semiHidden/>
+    <w:unhideWhenUsed/>
+    <w:rsid w:val="007A77BB"/>
+    <w:pPr>
+      <w:spacing w:before="100" w:beforeAutospacing="1" w:after="100" w:afterAutospacing="1" w:line="240" w:lineRule="auto"/>
+    </w:pPr>
+    <w:rPr>
+      <w:rFonts w:ascii="Times New Roman" w:eastAsia="Times New Roman" w:hAnsi="Times New Roman" w:cs="Times New Roman"/>
+      <w:kern w:val="0"/>
+      <w:sz w:val="24"/>
+      <w:szCs w:val="24"/>
+      <w:lang w:eastAsia="en-IN"/>
+      <w14:ligatures w14:val="none"/>
+    </w:rPr>
+  </w:style>
+  <w:style w:type="character" w:styleId="Strong">
+    <w:name w:val="Strong"/>
+    <w:basedOn w:val="DefaultParagraphFont"/>
+    <w:uiPriority w:val="22"/>
+    <w:qFormat/>
+    <w:rsid w:val="007A77BB"/>
+    <w:rPr>
+      <w:b/>
+      <w:bCs/>
+    </w:rPr>
+  </w:style>
+  <w:style w:type="character" w:styleId="HTMLCode">
+    <w:name w:val="HTML Code"/>
+    <w:basedOn w:val="DefaultParagraphFont"/>
+    <w:uiPriority w:val="99"/>
+    <w:semiHidden/>
+    <w:unhideWhenUsed/>
+    <w:rsid w:val="00DA5FEB"/>
+    <w:rPr>
+      <w:rFonts w:ascii="Courier New" w:eastAsia="Times New Roman" w:hAnsi="Courier New" w:cs="Courier New"/>
+      <w:sz w:val="20"/>
+      <w:szCs w:val="20"/>
+    </w:rPr>
+  </w:style>
 </w:styles>
 </file>
 

</xml_diff>

<commit_message>
HX711+load cell configuration details updated
</commit_message>
<xml_diff>
--- a/Documents/Safe Flame_V1.docx
+++ b/Documents/Safe Flame_V1.docx
@@ -2991,13 +2991,23 @@
           <w:lang w:val="en-US"/>
         </w:rPr>
       </w:pPr>
-      <w:r>
-        <w:rPr>
-          <w:sz w:val="24"/>
-          <w:szCs w:val="24"/>
-          <w:lang w:val="en-US"/>
-        </w:rPr>
-        <w:t>Vout= (ADC value/</w:t>
+      <w:proofErr w:type="spellStart"/>
+      <w:r>
+        <w:rPr>
+          <w:sz w:val="24"/>
+          <w:szCs w:val="24"/>
+          <w:lang w:val="en-US"/>
+        </w:rPr>
+        <w:t>Vout</w:t>
+      </w:r>
+      <w:proofErr w:type="spellEnd"/>
+      <w:r>
+        <w:rPr>
+          <w:sz w:val="24"/>
+          <w:szCs w:val="24"/>
+          <w:lang w:val="en-US"/>
+        </w:rPr>
+        <w:t>= (ADC value/</w:t>
       </w:r>
       <w:r>
         <w:rPr>
@@ -3013,8 +3023,18 @@
           <w:szCs w:val="24"/>
           <w:lang w:val="en-US"/>
         </w:rPr>
-        <w:t xml:space="preserve"> Vref</w:t>
-      </w:r>
+        <w:t xml:space="preserve"> </w:t>
+      </w:r>
+      <w:proofErr w:type="spellStart"/>
+      <w:r>
+        <w:rPr>
+          <w:sz w:val="24"/>
+          <w:szCs w:val="24"/>
+          <w:lang w:val="en-US"/>
+        </w:rPr>
+        <w:t>Vref</w:t>
+      </w:r>
+      <w:proofErr w:type="spellEnd"/>
     </w:p>
     <w:p>
       <w:pPr>
@@ -3055,7 +3075,43 @@
           <w:szCs w:val="24"/>
           <w:lang w:val="en-US"/>
         </w:rPr>
-        <w:t>Rs=((Vref-Vout)/Vout)</w:t>
+        <w:t>Rs=((</w:t>
+      </w:r>
+      <w:proofErr w:type="spellStart"/>
+      <w:r>
+        <w:rPr>
+          <w:sz w:val="24"/>
+          <w:szCs w:val="24"/>
+          <w:lang w:val="en-US"/>
+        </w:rPr>
+        <w:t>Vref-Vout</w:t>
+      </w:r>
+      <w:proofErr w:type="spellEnd"/>
+      <w:r>
+        <w:rPr>
+          <w:sz w:val="24"/>
+          <w:szCs w:val="24"/>
+          <w:lang w:val="en-US"/>
+        </w:rPr>
+        <w:t>)/</w:t>
+      </w:r>
+      <w:proofErr w:type="spellStart"/>
+      <w:r>
+        <w:rPr>
+          <w:sz w:val="24"/>
+          <w:szCs w:val="24"/>
+          <w:lang w:val="en-US"/>
+        </w:rPr>
+        <w:t>Vout</w:t>
+      </w:r>
+      <w:proofErr w:type="spellEnd"/>
+      <w:r>
+        <w:rPr>
+          <w:sz w:val="24"/>
+          <w:szCs w:val="24"/>
+          <w:lang w:val="en-US"/>
+        </w:rPr>
+        <w:t>)</w:t>
       </w:r>
       <w:r>
         <w:rPr>
@@ -3081,6 +3137,7 @@
         </w:rPr>
         <w:t xml:space="preserve"> </w:t>
       </w:r>
+      <w:proofErr w:type="spellStart"/>
       <w:r>
         <w:rPr>
           <w:sz w:val="24"/>
@@ -3089,6 +3146,7 @@
         </w:rPr>
         <w:t>Rl</w:t>
       </w:r>
+      <w:proofErr w:type="spellEnd"/>
       <w:r>
         <w:rPr>
           <w:sz w:val="24"/>
@@ -3689,7 +3747,23 @@
           <w:sz w:val="24"/>
           <w:szCs w:val="24"/>
         </w:rPr>
-        <w:t xml:space="preserve">Converts analog values into digital form </w:t>
+        <w:t xml:space="preserve">Converts </w:t>
+      </w:r>
+      <w:proofErr w:type="spellStart"/>
+      <w:r>
+        <w:rPr>
+          <w:sz w:val="24"/>
+          <w:szCs w:val="24"/>
+        </w:rPr>
+        <w:t>analog</w:t>
+      </w:r>
+      <w:proofErr w:type="spellEnd"/>
+      <w:r>
+        <w:rPr>
+          <w:sz w:val="24"/>
+          <w:szCs w:val="24"/>
+        </w:rPr>
+        <w:t xml:space="preserve"> values into digital form </w:t>
       </w:r>
     </w:p>
     <w:p>
@@ -3850,7 +3924,23 @@
           <w:sz w:val="24"/>
           <w:szCs w:val="24"/>
         </w:rPr>
-        <w:t xml:space="preserve">&gt;1 ms </w:t>
+        <w:t xml:space="preserve">&gt;1 </w:t>
+      </w:r>
+      <w:proofErr w:type="spellStart"/>
+      <w:r>
+        <w:rPr>
+          <w:sz w:val="24"/>
+          <w:szCs w:val="24"/>
+        </w:rPr>
+        <w:t>ms</w:t>
+      </w:r>
+      <w:proofErr w:type="spellEnd"/>
+      <w:r>
+        <w:rPr>
+          <w:sz w:val="24"/>
+          <w:szCs w:val="24"/>
+        </w:rPr>
+        <w:t xml:space="preserve"> </w:t>
       </w:r>
     </w:p>
     <w:p>
@@ -3972,7 +4062,23 @@
           <w:sz w:val="24"/>
           <w:szCs w:val="24"/>
         </w:rPr>
-        <w:t>This means:"I am ready to transmit."</w:t>
+        <w:t xml:space="preserve">This </w:t>
+      </w:r>
+      <w:proofErr w:type="spellStart"/>
+      <w:r>
+        <w:rPr>
+          <w:sz w:val="24"/>
+          <w:szCs w:val="24"/>
+        </w:rPr>
+        <w:t>means:"I</w:t>
+      </w:r>
+      <w:proofErr w:type="spellEnd"/>
+      <w:r>
+        <w:rPr>
+          <w:sz w:val="24"/>
+          <w:szCs w:val="24"/>
+        </w:rPr>
+        <w:t xml:space="preserve"> am ready to transmit."</w:t>
       </w:r>
     </w:p>
     <w:p>
@@ -5625,7 +5731,25 @@
           <w:szCs w:val="24"/>
           <w:lang w:val="en-US"/>
         </w:rPr>
-        <w:t>Connect the sensor with STM32 board. There are only three pins Vcc,</w:t>
+        <w:t xml:space="preserve">Connect the sensor with STM32 board. There are only three pins </w:t>
+      </w:r>
+      <w:proofErr w:type="spellStart"/>
+      <w:r>
+        <w:rPr>
+          <w:sz w:val="24"/>
+          <w:szCs w:val="24"/>
+          <w:lang w:val="en-US"/>
+        </w:rPr>
+        <w:t>Vcc</w:t>
+      </w:r>
+      <w:proofErr w:type="spellEnd"/>
+      <w:r>
+        <w:rPr>
+          <w:sz w:val="24"/>
+          <w:szCs w:val="24"/>
+          <w:lang w:val="en-US"/>
+        </w:rPr>
+        <w:t>,</w:t>
       </w:r>
       <w:r>
         <w:rPr>
@@ -5641,7 +5765,25 @@
           <w:szCs w:val="24"/>
           <w:lang w:val="en-US"/>
         </w:rPr>
-        <w:t>GND and data. Connect Vcc with 3.3V supply from CN8,</w:t>
+        <w:t xml:space="preserve">GND and data. Connect </w:t>
+      </w:r>
+      <w:proofErr w:type="spellStart"/>
+      <w:r>
+        <w:rPr>
+          <w:sz w:val="24"/>
+          <w:szCs w:val="24"/>
+          <w:lang w:val="en-US"/>
+        </w:rPr>
+        <w:t>Vcc</w:t>
+      </w:r>
+      <w:proofErr w:type="spellEnd"/>
+      <w:r>
+        <w:rPr>
+          <w:sz w:val="24"/>
+          <w:szCs w:val="24"/>
+          <w:lang w:val="en-US"/>
+        </w:rPr>
+        <w:t xml:space="preserve"> with 3.3V supply from CN8,</w:t>
       </w:r>
       <w:r>
         <w:rPr>
@@ -5680,7 +5822,25 @@
           <w:szCs w:val="24"/>
           <w:lang w:val="en-US"/>
         </w:rPr>
-        <w:t>The DHT22 sensor does not have any LED indication to identify whether it is powered ON when connected to STM32.To ensure that the sensor module works fine, measure the voltage between Vcc and GND pin using a multimeter.</w:t>
+        <w:t xml:space="preserve">The DHT22 sensor does not have any LED indication to identify whether it is powered ON when connected to STM32.To ensure that the sensor module works fine, measure the voltage between </w:t>
+      </w:r>
+      <w:proofErr w:type="spellStart"/>
+      <w:r>
+        <w:rPr>
+          <w:sz w:val="24"/>
+          <w:szCs w:val="24"/>
+          <w:lang w:val="en-US"/>
+        </w:rPr>
+        <w:t>Vcc</w:t>
+      </w:r>
+      <w:proofErr w:type="spellEnd"/>
+      <w:r>
+        <w:rPr>
+          <w:sz w:val="24"/>
+          <w:szCs w:val="24"/>
+          <w:lang w:val="en-US"/>
+        </w:rPr>
+        <w:t xml:space="preserve"> and GND pin using a multimeter.</w:t>
       </w:r>
     </w:p>
     <w:p>
@@ -5703,7 +5863,61 @@
           <w:szCs w:val="24"/>
           <w:lang w:val="en-US"/>
         </w:rPr>
-        <w:t>In the .ioc file configure PA0 as gpio input with pull-up option enabled. This is because DHT22 sensor require a 4.7K pull up resistor between Vcc and data pin.</w:t>
+        <w:t>In the .</w:t>
+      </w:r>
+      <w:proofErr w:type="spellStart"/>
+      <w:r>
+        <w:rPr>
+          <w:sz w:val="24"/>
+          <w:szCs w:val="24"/>
+          <w:lang w:val="en-US"/>
+        </w:rPr>
+        <w:t>ioc</w:t>
+      </w:r>
+      <w:proofErr w:type="spellEnd"/>
+      <w:r>
+        <w:rPr>
+          <w:sz w:val="24"/>
+          <w:szCs w:val="24"/>
+          <w:lang w:val="en-US"/>
+        </w:rPr>
+        <w:t xml:space="preserve"> file configure PA0 as </w:t>
+      </w:r>
+      <w:proofErr w:type="spellStart"/>
+      <w:r>
+        <w:rPr>
+          <w:sz w:val="24"/>
+          <w:szCs w:val="24"/>
+          <w:lang w:val="en-US"/>
+        </w:rPr>
+        <w:t>gpio</w:t>
+      </w:r>
+      <w:proofErr w:type="spellEnd"/>
+      <w:r>
+        <w:rPr>
+          <w:sz w:val="24"/>
+          <w:szCs w:val="24"/>
+          <w:lang w:val="en-US"/>
+        </w:rPr>
+        <w:t xml:space="preserve"> input with pull-up option enabled. This is because DHT22 sensor require a 4.7K pull up resistor between </w:t>
+      </w:r>
+      <w:proofErr w:type="spellStart"/>
+      <w:r>
+        <w:rPr>
+          <w:sz w:val="24"/>
+          <w:szCs w:val="24"/>
+          <w:lang w:val="en-US"/>
+        </w:rPr>
+        <w:t>Vcc</w:t>
+      </w:r>
+      <w:proofErr w:type="spellEnd"/>
+      <w:r>
+        <w:rPr>
+          <w:sz w:val="24"/>
+          <w:szCs w:val="24"/>
+          <w:lang w:val="en-US"/>
+        </w:rPr>
+        <w:t xml:space="preserve"> and data pin.</w:t>
       </w:r>
     </w:p>
     <w:p>
@@ -5734,6 +5948,13 @@
         </w:rPr>
         <w:t>.</w:t>
       </w:r>
+      <w:r>
+        <w:rPr>
+          <w:sz w:val="24"/>
+          <w:szCs w:val="24"/>
+        </w:rPr>
+        <w:t>9</w:t>
+      </w:r>
     </w:p>
     <w:p>
       <w:pPr>
@@ -5855,7 +6076,21 @@
           <w:rFonts w:asciiTheme="minorHAnsi" w:hAnsiTheme="minorHAnsi" w:cstheme="minorHAnsi"/>
         </w:rPr>
         <w:noBreakHyphen/>
-        <w:t xml:space="preserve">ups (~30–50 kΩ). These are </w:t>
+        <w:t>ups (~30–50 </w:t>
+      </w:r>
+      <w:proofErr w:type="spellStart"/>
+      <w:r>
+        <w:rPr>
+          <w:rFonts w:asciiTheme="minorHAnsi" w:hAnsiTheme="minorHAnsi" w:cstheme="minorHAnsi"/>
+        </w:rPr>
+        <w:t>kΩ</w:t>
+      </w:r>
+      <w:proofErr w:type="spellEnd"/>
+      <w:r>
+        <w:rPr>
+          <w:rFonts w:asciiTheme="minorHAnsi" w:hAnsiTheme="minorHAnsi" w:cstheme="minorHAnsi"/>
+        </w:rPr>
+        <w:t xml:space="preserve">). These are </w:t>
       </w:r>
       <w:r>
         <w:rPr>
@@ -5905,8 +6140,39 @@
           <w:b w:val="0"/>
           <w:bCs w:val="0"/>
         </w:rPr>
-        <w:t>4.7 kΩ to 10 kΩ</w:t>
-      </w:r>
+        <w:t>4.7 </w:t>
+      </w:r>
+      <w:proofErr w:type="spellStart"/>
+      <w:r>
+        <w:rPr>
+          <w:rStyle w:val="Strong"/>
+          <w:rFonts w:asciiTheme="minorHAnsi" w:hAnsiTheme="minorHAnsi" w:cstheme="minorHAnsi"/>
+          <w:b w:val="0"/>
+          <w:bCs w:val="0"/>
+        </w:rPr>
+        <w:t>kΩ</w:t>
+      </w:r>
+      <w:proofErr w:type="spellEnd"/>
+      <w:r>
+        <w:rPr>
+          <w:rStyle w:val="Strong"/>
+          <w:rFonts w:asciiTheme="minorHAnsi" w:hAnsiTheme="minorHAnsi" w:cstheme="minorHAnsi"/>
+          <w:b w:val="0"/>
+          <w:bCs w:val="0"/>
+        </w:rPr>
+        <w:t xml:space="preserve"> to 10 </w:t>
+      </w:r>
+      <w:proofErr w:type="spellStart"/>
+      <w:r>
+        <w:rPr>
+          <w:rStyle w:val="Strong"/>
+          <w:rFonts w:asciiTheme="minorHAnsi" w:hAnsiTheme="minorHAnsi" w:cstheme="minorHAnsi"/>
+          <w:b w:val="0"/>
+          <w:bCs w:val="0"/>
+        </w:rPr>
+        <w:t>kΩ</w:t>
+      </w:r>
+      <w:proofErr w:type="spellEnd"/>
       <w:r>
         <w:rPr>
           <w:rFonts w:asciiTheme="minorHAnsi" w:hAnsiTheme="minorHAnsi" w:cstheme="minorHAnsi"/>
@@ -5940,7 +6206,27 @@
           <w:b w:val="0"/>
           <w:bCs w:val="0"/>
         </w:rPr>
-        <w:t>external 4.7 kΩ resistor</w:t>
+        <w:t>external 4.7 </w:t>
+      </w:r>
+      <w:proofErr w:type="spellStart"/>
+      <w:r>
+        <w:rPr>
+          <w:rStyle w:val="Strong"/>
+          <w:rFonts w:asciiTheme="minorHAnsi" w:hAnsiTheme="minorHAnsi" w:cstheme="minorHAnsi"/>
+          <w:b w:val="0"/>
+          <w:bCs w:val="0"/>
+        </w:rPr>
+        <w:t>kΩ</w:t>
+      </w:r>
+      <w:proofErr w:type="spellEnd"/>
+      <w:r>
+        <w:rPr>
+          <w:rStyle w:val="Strong"/>
+          <w:rFonts w:asciiTheme="minorHAnsi" w:hAnsiTheme="minorHAnsi" w:cstheme="minorHAnsi"/>
+          <w:b w:val="0"/>
+          <w:bCs w:val="0"/>
+        </w:rPr>
+        <w:t xml:space="preserve"> resistor</w:t>
       </w:r>
       <w:r>
         <w:rPr>
@@ -6241,10 +6527,7 @@
           <w:lang w:val="en-US"/>
         </w:rPr>
       </w:pPr>
-    </w:p>
-    <w:p>
-      <w:pPr>
-        <w:jc w:val="both"/>
+      <w:r>
         <w:rPr>
           <w:b/>
           <w:bCs/>
@@ -6252,29 +6535,233 @@
           <w:szCs w:val="24"/>
           <w:lang w:val="en-US"/>
         </w:rPr>
-      </w:pPr>
-    </w:p>
-    <w:p>
-      <w:pPr>
-        <w:jc w:val="both"/>
-        <w:rPr>
-          <w:b/>
-          <w:bCs/>
-          <w:sz w:val="24"/>
-          <w:szCs w:val="24"/>
-          <w:lang w:val="en-US"/>
-        </w:rPr>
-      </w:pPr>
-      <w:r>
-        <w:rPr>
-          <w:b/>
-          <w:bCs/>
-          <w:sz w:val="24"/>
-          <w:szCs w:val="24"/>
-          <w:lang w:val="en-US"/>
-        </w:rPr>
+        <w:lastRenderedPageBreak/>
         <w:t>Interfacing HX711+load cell with STM32</w:t>
       </w:r>
+    </w:p>
+    <w:p>
+      <w:pPr>
+        <w:jc w:val="both"/>
+        <w:rPr>
+          <w:sz w:val="24"/>
+          <w:szCs w:val="24"/>
+          <w:lang w:val="en-US"/>
+        </w:rPr>
+      </w:pPr>
+      <w:r>
+        <w:rPr>
+          <w:sz w:val="24"/>
+          <w:szCs w:val="24"/>
+          <w:lang w:val="en-US"/>
+        </w:rPr>
+        <w:t>A three</w:t>
+      </w:r>
+      <w:r>
+        <w:rPr>
+          <w:sz w:val="24"/>
+          <w:szCs w:val="24"/>
+          <w:lang w:val="en-US"/>
+        </w:rPr>
+        <w:t>-</w:t>
+      </w:r>
+      <w:r>
+        <w:rPr>
+          <w:sz w:val="24"/>
+          <w:szCs w:val="24"/>
+          <w:lang w:val="en-US"/>
+        </w:rPr>
+        <w:t xml:space="preserve">wire load cell </w:t>
+      </w:r>
+      <w:r>
+        <w:rPr>
+          <w:sz w:val="24"/>
+          <w:szCs w:val="24"/>
+          <w:lang w:val="en-US"/>
+        </w:rPr>
+        <w:t>with HX711 amplifier module is connected with STM32.The hardware connection is as follows:</w:t>
+      </w:r>
+    </w:p>
+    <w:p>
+      <w:pPr>
+        <w:jc w:val="both"/>
+        <w:rPr>
+          <w:sz w:val="24"/>
+          <w:szCs w:val="24"/>
+          <w:lang w:val="en-US"/>
+        </w:rPr>
+      </w:pPr>
+      <w:r>
+        <w:rPr>
+          <w:sz w:val="24"/>
+          <w:szCs w:val="24"/>
+          <w:lang w:val="en-US"/>
+        </w:rPr>
+        <w:t>HX711 DT: -GPIO input- STM32 PB0-CN10</w:t>
+      </w:r>
+    </w:p>
+    <w:p>
+      <w:pPr>
+        <w:jc w:val="both"/>
+        <w:rPr>
+          <w:sz w:val="24"/>
+          <w:szCs w:val="24"/>
+          <w:lang w:val="en-US"/>
+        </w:rPr>
+      </w:pPr>
+      <w:r>
+        <w:rPr>
+          <w:sz w:val="24"/>
+          <w:szCs w:val="24"/>
+          <w:lang w:val="en-US"/>
+        </w:rPr>
+        <w:t>HX711 SCK: -GPIO output-STM32 PB1-CN10</w:t>
+      </w:r>
+    </w:p>
+    <w:p>
+      <w:pPr>
+        <w:jc w:val="both"/>
+        <w:rPr>
+          <w:sz w:val="24"/>
+          <w:szCs w:val="24"/>
+          <w:lang w:val="en-US"/>
+        </w:rPr>
+      </w:pPr>
+      <w:r>
+        <w:rPr>
+          <w:sz w:val="24"/>
+          <w:szCs w:val="24"/>
+          <w:lang w:val="en-US"/>
+        </w:rPr>
+        <w:t xml:space="preserve">HX711 </w:t>
+      </w:r>
+      <w:proofErr w:type="spellStart"/>
+      <w:proofErr w:type="gramStart"/>
+      <w:r>
+        <w:rPr>
+          <w:sz w:val="24"/>
+          <w:szCs w:val="24"/>
+          <w:lang w:val="en-US"/>
+        </w:rPr>
+        <w:t>Vcc</w:t>
+      </w:r>
+      <w:proofErr w:type="spellEnd"/>
+      <w:r>
+        <w:rPr>
+          <w:sz w:val="24"/>
+          <w:szCs w:val="24"/>
+          <w:lang w:val="en-US"/>
+        </w:rPr>
+        <w:t xml:space="preserve"> :</w:t>
+      </w:r>
+      <w:proofErr w:type="gramEnd"/>
+      <w:r>
+        <w:rPr>
+          <w:sz w:val="24"/>
+          <w:szCs w:val="24"/>
+          <w:lang w:val="en-US"/>
+        </w:rPr>
+        <w:t xml:space="preserve"> -3.3V/5V- STM32 CN8</w:t>
+      </w:r>
+    </w:p>
+    <w:p>
+      <w:pPr>
+        <w:jc w:val="both"/>
+        <w:rPr>
+          <w:sz w:val="24"/>
+          <w:szCs w:val="24"/>
+          <w:lang w:val="en-US"/>
+        </w:rPr>
+      </w:pPr>
+      <w:r>
+        <w:rPr>
+          <w:sz w:val="24"/>
+          <w:szCs w:val="24"/>
+          <w:lang w:val="en-US"/>
+        </w:rPr>
+        <w:t xml:space="preserve">HX711 </w:t>
+      </w:r>
+      <w:r>
+        <w:rPr>
+          <w:sz w:val="24"/>
+          <w:szCs w:val="24"/>
+          <w:lang w:val="en-US"/>
+        </w:rPr>
+        <w:t>GND:</w:t>
+      </w:r>
+      <w:r>
+        <w:rPr>
+          <w:sz w:val="24"/>
+          <w:szCs w:val="24"/>
+          <w:lang w:val="en-US"/>
+        </w:rPr>
+        <w:t xml:space="preserve"> - GND- STM32 GND CN8</w:t>
+      </w:r>
+    </w:p>
+    <w:p>
+      <w:pPr>
+        <w:jc w:val="both"/>
+        <w:rPr>
+          <w:sz w:val="24"/>
+          <w:szCs w:val="24"/>
+          <w:lang w:val="en-US"/>
+        </w:rPr>
+      </w:pPr>
+      <w:r>
+        <w:rPr>
+          <w:sz w:val="24"/>
+          <w:szCs w:val="24"/>
+          <w:lang w:val="en-US"/>
+        </w:rPr>
+        <w:t>HX711 E+: - load cell red wire</w:t>
+      </w:r>
+    </w:p>
+    <w:p>
+      <w:pPr>
+        <w:jc w:val="both"/>
+        <w:rPr>
+          <w:sz w:val="24"/>
+          <w:szCs w:val="24"/>
+          <w:lang w:val="en-US"/>
+        </w:rPr>
+      </w:pPr>
+      <w:r>
+        <w:rPr>
+          <w:sz w:val="24"/>
+          <w:szCs w:val="24"/>
+          <w:lang w:val="en-US"/>
+        </w:rPr>
+        <w:t>HX711 E-: - load cell black wire</w:t>
+      </w:r>
+    </w:p>
+    <w:p>
+      <w:pPr>
+        <w:jc w:val="both"/>
+        <w:rPr>
+          <w:sz w:val="24"/>
+          <w:szCs w:val="24"/>
+          <w:lang w:val="en-US"/>
+        </w:rPr>
+      </w:pPr>
+    </w:p>
+    <w:p>
+      <w:pPr>
+        <w:jc w:val="both"/>
+        <w:rPr>
+          <w:sz w:val="24"/>
+          <w:szCs w:val="24"/>
+          <w:lang w:val="en-US"/>
+        </w:rPr>
+      </w:pPr>
+    </w:p>
+    <w:p>
+      <w:pPr>
+        <w:jc w:val="both"/>
+        <w:rPr>
+          <w:sz w:val="24"/>
+          <w:szCs w:val="24"/>
+          <w:lang w:val="en-US"/>
+        </w:rPr>
+      </w:pPr>
     </w:p>
     <w:sectPr>
       <w:pgSz w:w="11906" w:h="16838"/>
@@ -11785,4 +12272,24 @@
     </a:ext>
   </a:extLst>
 </a:theme>
+</file>
+
+<file path=word/webextensions/taskpanes.xml><?xml version="1.0" encoding="utf-8"?>
+<wetp:taskpanes xmlns:wetp="http://schemas.microsoft.com/office/webextensions/taskpanes/2010/11">
+  <wetp:taskpane dockstate="right" visibility="0" width="438" row="0">
+    <wetp:webextensionref xmlns:r="http://schemas.openxmlformats.org/officeDocument/2006/relationships" r:id="rId1"/>
+  </wetp:taskpane>
+</wetp:taskpanes>
+</file>
+
+<file path=word/webextensions/webextension1.xml><?xml version="1.0" encoding="utf-8"?>
+<we:webextension xmlns:we="http://schemas.microsoft.com/office/webextensions/webextension/2010/11" id="{CF7E0543-4000-4925-8EAF-9852E2BAA9B3}">
+  <we:reference id="wa200000113" version="1.0.0.0" store="en-US" storeType="OMEX"/>
+  <we:alternateReferences>
+    <we:reference id="WA200000113" version="1.0.0.0" store="" storeType="OMEX"/>
+  </we:alternateReferences>
+  <we:properties/>
+  <we:bindings/>
+  <we:snapshot xmlns:r="http://schemas.openxmlformats.org/officeDocument/2006/relationships"/>
+</we:webextension>
 </file>
</xml_diff>

<commit_message>
modified HX711 code for sign extension
</commit_message>
<xml_diff>
--- a/Documents/Safe Flame_V1.docx
+++ b/Documents/Safe Flame_V1.docx
@@ -6417,6 +6417,87 @@
       <w:pPr>
         <w:jc w:val="both"/>
         <w:rPr>
+          <w:sz w:val="24"/>
+          <w:szCs w:val="24"/>
+          <w:lang w:val="en-US"/>
+        </w:rPr>
+      </w:pPr>
+      <w:r>
+        <w:rPr>
+          <w:sz w:val="24"/>
+          <w:szCs w:val="24"/>
+        </w:rPr>
+        <w:t>This DHT22 driver implements the sensor’s single</w:t>
+      </w:r>
+      <w:r>
+        <w:rPr>
+          <w:sz w:val="24"/>
+          <w:szCs w:val="24"/>
+        </w:rPr>
+        <w:noBreakHyphen/>
+        <w:t>wire protocol with precise timing control. The microsecond delay function uses the STM32’s DWT cycle counter to generate accurate delays, while DHT22_WaitForPin ensures transitions occur within a timeout so the MCU never hangs. To start communication, the MCU drives the data pin low for 20 </w:t>
+      </w:r>
+      <w:proofErr w:type="spellStart"/>
+      <w:r>
+        <w:rPr>
+          <w:sz w:val="24"/>
+          <w:szCs w:val="24"/>
+        </w:rPr>
+        <w:t>ms</w:t>
+      </w:r>
+      <w:proofErr w:type="spellEnd"/>
+      <w:r>
+        <w:rPr>
+          <w:sz w:val="24"/>
+          <w:szCs w:val="24"/>
+        </w:rPr>
+        <w:t>, then releases it and switches the pin to input mode; the DHT22 responds with a specific low</w:t>
+      </w:r>
+      <w:r>
+        <w:rPr>
+          <w:sz w:val="24"/>
+          <w:szCs w:val="24"/>
+        </w:rPr>
+        <w:noBreakHyphen/>
+        <w:t xml:space="preserve">high handshake. </w:t>
+      </w:r>
+      <w:r>
+        <w:rPr>
+          <w:sz w:val="24"/>
+          <w:szCs w:val="24"/>
+        </w:rPr>
+        <w:lastRenderedPageBreak/>
+        <w:t>The main read loop then captures 40 bits: each bit begins with a low pulse, followed by a high pulse whose duration encodes 0 or 1. The code samples the line after ~40 µs to decide the bit value and assembles the result into five bytes. A checksum verifies data integrity, and the raw humidity and temperature values are extracted from the first four bytes, scaled by 10 to yield human</w:t>
+      </w:r>
+      <w:r>
+        <w:rPr>
+          <w:sz w:val="24"/>
+          <w:szCs w:val="24"/>
+        </w:rPr>
+        <w:noBreakHyphen/>
+        <w:t>readable floats. In essence, the code handles clock</w:t>
+      </w:r>
+      <w:r>
+        <w:rPr>
+          <w:sz w:val="24"/>
+          <w:szCs w:val="24"/>
+        </w:rPr>
+        <w:noBreakHyphen/>
+        <w:t>like timing generation, protocol framing, error detection, and conversion, turning the DHT22’s pulse</w:t>
+      </w:r>
+      <w:r>
+        <w:rPr>
+          <w:sz w:val="24"/>
+          <w:szCs w:val="24"/>
+        </w:rPr>
+        <w:noBreakHyphen/>
+        <w:t>width encoded signal into stable temperature and humidity readings.</w:t>
+      </w:r>
+    </w:p>
+    <w:p>
+      <w:pPr>
+        <w:jc w:val="both"/>
+        <w:rPr>
           <w:b/>
           <w:bCs/>
           <w:sz w:val="24"/>
@@ -6448,10 +6529,7 @@
           <w:lang w:val="en-US"/>
         </w:rPr>
       </w:pPr>
-    </w:p>
-    <w:p>
-      <w:pPr>
-        <w:jc w:val="both"/>
+      <w:r>
         <w:rPr>
           <w:b/>
           <w:bCs/>
@@ -6459,16 +6537,6 @@
           <w:szCs w:val="24"/>
           <w:lang w:val="en-US"/>
         </w:rPr>
-      </w:pPr>
-      <w:r>
-        <w:rPr>
-          <w:b/>
-          <w:bCs/>
-          <w:sz w:val="24"/>
-          <w:szCs w:val="24"/>
-          <w:lang w:val="en-US"/>
-        </w:rPr>
-        <w:lastRenderedPageBreak/>
         <w:t>Interfacing HX711+load cell with STM32</w:t>
       </w:r>
     </w:p>
@@ -6685,6 +6753,7 @@
       </w:pPr>
       <w:r>
         <w:rPr>
+          <w:noProof/>
           <w:sz w:val="24"/>
           <w:szCs w:val="24"/>
           <w:lang w:val="en-US"/>
@@ -6739,6 +6808,7 @@
           <w:sz w:val="24"/>
           <w:szCs w:val="24"/>
         </w:rPr>
+        <w:lastRenderedPageBreak/>
         <w:t>A load cell is basically a metal bar with strain gauges that change resistance when the bar bends under force. This bending produces a very tiny voltage difference (in the range of millivolts). Because the signal is so small, the HX711 chip amplifies it about 128 times and then converts it into a 24</w:t>
       </w:r>
       <w:r>
@@ -6763,16 +6833,14 @@
           <w:sz w:val="24"/>
           <w:szCs w:val="24"/>
         </w:rPr>
-        <w:t xml:space="preserve">The program first performs a </w:t>
-      </w:r>
-      <w:r>
-        <w:rPr>
-          <w:b/>
-          <w:bCs/>
-          <w:sz w:val="24"/>
-          <w:szCs w:val="24"/>
-        </w:rPr>
-        <w:t>tare</w:t>
+        <w:t xml:space="preserve">The program first performs </w:t>
+      </w:r>
+      <w:r>
+        <w:rPr>
+          <w:sz w:val="24"/>
+          <w:szCs w:val="24"/>
+        </w:rPr>
+        <w:t>a tare</w:t>
       </w:r>
       <w:r>
         <w:rPr>
@@ -6783,8 +6851,6 @@
       </w:r>
       <w:r>
         <w:rPr>
-          <w:b/>
-          <w:bCs/>
           <w:sz w:val="24"/>
           <w:szCs w:val="24"/>
         </w:rPr>
@@ -6795,15 +6861,7 @@
           <w:sz w:val="24"/>
           <w:szCs w:val="24"/>
         </w:rPr>
-        <w:t xml:space="preserve">: you place a known weight (say 5 kg), the program calculates how many counts </w:t>
-      </w:r>
-      <w:r>
-        <w:rPr>
-          <w:sz w:val="24"/>
-          <w:szCs w:val="24"/>
-        </w:rPr>
-        <w:lastRenderedPageBreak/>
-        <w:t>correspond to that weight, and from this it derives a conversion factor (kg per count). After that, every new measurement follows the formula:</w:t>
+        <w:t>: you place a known weight (say 5 kg), the program calculates how many counts correspond to that weight, and from this it derives a conversion factor (kg per count). After that, every new measurement follows the formula:</w:t>
       </w:r>
     </w:p>
     <w:p>
@@ -6905,9 +6963,57 @@
         <w:rPr>
           <w:sz w:val="24"/>
           <w:szCs w:val="24"/>
-          <w:lang w:val="en-US"/>
-        </w:rPr>
-      </w:pPr>
+        </w:rPr>
+      </w:pPr>
+    </w:p>
+    <w:p>
+      <w:pPr>
+        <w:jc w:val="both"/>
+        <w:rPr>
+          <w:sz w:val="24"/>
+          <w:szCs w:val="24"/>
+          <w:lang w:val="en-US"/>
+        </w:rPr>
+      </w:pPr>
+      <w:r>
+        <w:rPr>
+          <w:sz w:val="24"/>
+          <w:szCs w:val="24"/>
+        </w:rPr>
+        <w:t>This HX711 driver works by manually implementing the chip’s custom synchronous protocol through GPIO toggling. At initialization, PB1 (SCK) is set low to establish a stable starting state. During a read, the STM32 first waits until HX711 signals data ready by pulling PB0 (DOUT) low, then generates 24 clock pulses on PB1; each rising edge causes HX711 to shift out one bit of its 24</w:t>
+      </w:r>
+      <w:r>
+        <w:rPr>
+          <w:sz w:val="24"/>
+          <w:szCs w:val="24"/>
+        </w:rPr>
+        <w:noBreakHyphen/>
+        <w:t>bit ADC register, which the code assembles into value. After the 24th bit, the code issues one extra pulse (25th), which is not part of the data but re</w:t>
+      </w:r>
+      <w:r>
+        <w:rPr>
+          <w:sz w:val="24"/>
+          <w:szCs w:val="24"/>
+        </w:rPr>
+        <w:noBreakHyphen/>
+        <w:t>selects the next conversion mode — in this case Channel A with Gain 128, the default configuration. Because HX711 outputs a 24</w:t>
+      </w:r>
+      <w:r>
+        <w:rPr>
+          <w:sz w:val="24"/>
+          <w:szCs w:val="24"/>
+        </w:rPr>
+        <w:noBreakHyphen/>
+        <w:t>bit two’s complement signed value, the MCU must sign</w:t>
+      </w:r>
+      <w:r>
+        <w:rPr>
+          <w:sz w:val="24"/>
+          <w:szCs w:val="24"/>
+        </w:rPr>
+        <w:noBreakHyphen/>
+        <w:t>extend it into 32 bits so negative readings are preserved correctly. The tare routine averages multiple samples to establish a baseline offset, while the weight function subtracts this offset from new raw readings and multiplies by a calibration factor to convert counts into kilograms. In essence, the code handles clock generation, protocol framing, signed data conversion, and calibration, turning the millivolt signal from the load cell into a stable, meaningful weight measurement.</w:t>
+      </w:r>
     </w:p>
     <w:sectPr>
       <w:pgSz w:w="11906" w:h="16838"/>

</xml_diff>

<commit_message>
Document updated with sensor specifications
</commit_message>
<xml_diff>
--- a/Documents/Safe Flame_V1.docx
+++ b/Documents/Safe Flame_V1.docx
@@ -3062,23 +3062,13 @@
           <w:lang w:val="en-US"/>
         </w:rPr>
       </w:pPr>
-      <w:proofErr w:type="spellStart"/>
-      <w:r>
-        <w:rPr>
-          <w:sz w:val="24"/>
-          <w:szCs w:val="24"/>
-          <w:lang w:val="en-US"/>
-        </w:rPr>
-        <w:t>Vout</w:t>
-      </w:r>
-      <w:proofErr w:type="spellEnd"/>
-      <w:r>
-        <w:rPr>
-          <w:sz w:val="24"/>
-          <w:szCs w:val="24"/>
-          <w:lang w:val="en-US"/>
-        </w:rPr>
-        <w:t>= (ADC value/</w:t>
+      <w:r>
+        <w:rPr>
+          <w:sz w:val="24"/>
+          <w:szCs w:val="24"/>
+          <w:lang w:val="en-US"/>
+        </w:rPr>
+        <w:t>Vout= (ADC value/</w:t>
       </w:r>
       <w:r>
         <w:rPr>
@@ -3094,18 +3084,8 @@
           <w:szCs w:val="24"/>
           <w:lang w:val="en-US"/>
         </w:rPr>
-        <w:t xml:space="preserve"> </w:t>
-      </w:r>
-      <w:proofErr w:type="spellStart"/>
-      <w:r>
-        <w:rPr>
-          <w:sz w:val="24"/>
-          <w:szCs w:val="24"/>
-          <w:lang w:val="en-US"/>
-        </w:rPr>
-        <w:t>Vref</w:t>
-      </w:r>
-      <w:proofErr w:type="spellEnd"/>
+        <w:t xml:space="preserve"> Vref</w:t>
+      </w:r>
     </w:p>
     <w:p>
       <w:pPr>
@@ -3146,43 +3126,7 @@
           <w:szCs w:val="24"/>
           <w:lang w:val="en-US"/>
         </w:rPr>
-        <w:t>Rs=((</w:t>
-      </w:r>
-      <w:proofErr w:type="spellStart"/>
-      <w:r>
-        <w:rPr>
-          <w:sz w:val="24"/>
-          <w:szCs w:val="24"/>
-          <w:lang w:val="en-US"/>
-        </w:rPr>
-        <w:t>Vref-Vout</w:t>
-      </w:r>
-      <w:proofErr w:type="spellEnd"/>
-      <w:r>
-        <w:rPr>
-          <w:sz w:val="24"/>
-          <w:szCs w:val="24"/>
-          <w:lang w:val="en-US"/>
-        </w:rPr>
-        <w:t>)/</w:t>
-      </w:r>
-      <w:proofErr w:type="spellStart"/>
-      <w:r>
-        <w:rPr>
-          <w:sz w:val="24"/>
-          <w:szCs w:val="24"/>
-          <w:lang w:val="en-US"/>
-        </w:rPr>
-        <w:t>Vout</w:t>
-      </w:r>
-      <w:proofErr w:type="spellEnd"/>
-      <w:r>
-        <w:rPr>
-          <w:sz w:val="24"/>
-          <w:szCs w:val="24"/>
-          <w:lang w:val="en-US"/>
-        </w:rPr>
-        <w:t>)</w:t>
+        <w:t>Rs=((Vref-Vout)/Vout)</w:t>
       </w:r>
       <w:r>
         <w:rPr>
@@ -3208,7 +3152,6 @@
         </w:rPr>
         <w:t xml:space="preserve"> </w:t>
       </w:r>
-      <w:proofErr w:type="spellStart"/>
       <w:r>
         <w:rPr>
           <w:sz w:val="24"/>
@@ -3217,7 +3160,6 @@
         </w:rPr>
         <w:t>Rl</w:t>
       </w:r>
-      <w:proofErr w:type="spellEnd"/>
       <w:r>
         <w:rPr>
           <w:sz w:val="24"/>
@@ -3776,23 +3718,7 @@
           <w:sz w:val="24"/>
           <w:szCs w:val="24"/>
         </w:rPr>
-        <w:t xml:space="preserve">Converts </w:t>
-      </w:r>
-      <w:proofErr w:type="spellStart"/>
-      <w:r>
-        <w:rPr>
-          <w:sz w:val="24"/>
-          <w:szCs w:val="24"/>
-        </w:rPr>
-        <w:t>analog</w:t>
-      </w:r>
-      <w:proofErr w:type="spellEnd"/>
-      <w:r>
-        <w:rPr>
-          <w:sz w:val="24"/>
-          <w:szCs w:val="24"/>
-        </w:rPr>
-        <w:t xml:space="preserve"> values into digital form </w:t>
+        <w:t xml:space="preserve">Converts analog values into digital form </w:t>
       </w:r>
     </w:p>
     <w:p>
@@ -3954,23 +3880,7 @@
           <w:sz w:val="24"/>
           <w:szCs w:val="24"/>
         </w:rPr>
-        <w:t xml:space="preserve">&gt;1 </w:t>
-      </w:r>
-      <w:proofErr w:type="spellStart"/>
-      <w:r>
-        <w:rPr>
-          <w:sz w:val="24"/>
-          <w:szCs w:val="24"/>
-        </w:rPr>
-        <w:t>ms</w:t>
-      </w:r>
-      <w:proofErr w:type="spellEnd"/>
-      <w:r>
-        <w:rPr>
-          <w:sz w:val="24"/>
-          <w:szCs w:val="24"/>
-        </w:rPr>
-        <w:t xml:space="preserve"> </w:t>
+        <w:t xml:space="preserve">&gt;1 ms </w:t>
       </w:r>
     </w:p>
     <w:p>
@@ -4092,23 +4002,7 @@
           <w:sz w:val="24"/>
           <w:szCs w:val="24"/>
         </w:rPr>
-        <w:t xml:space="preserve">This </w:t>
-      </w:r>
-      <w:proofErr w:type="spellStart"/>
-      <w:r>
-        <w:rPr>
-          <w:sz w:val="24"/>
-          <w:szCs w:val="24"/>
-        </w:rPr>
-        <w:t>means:"I</w:t>
-      </w:r>
-      <w:proofErr w:type="spellEnd"/>
-      <w:r>
-        <w:rPr>
-          <w:sz w:val="24"/>
-          <w:szCs w:val="24"/>
-        </w:rPr>
-        <w:t xml:space="preserve"> am ready to transmit."</w:t>
+        <w:t>This means:"I am ready to transmit."</w:t>
       </w:r>
     </w:p>
     <w:p>
@@ -5661,25 +5555,7 @@
           <w:szCs w:val="24"/>
           <w:lang w:val="en-US"/>
         </w:rPr>
-        <w:t xml:space="preserve">Connect the sensor with STM32 board. There are only three pins </w:t>
-      </w:r>
-      <w:proofErr w:type="spellStart"/>
-      <w:r>
-        <w:rPr>
-          <w:sz w:val="24"/>
-          <w:szCs w:val="24"/>
-          <w:lang w:val="en-US"/>
-        </w:rPr>
-        <w:t>Vcc</w:t>
-      </w:r>
-      <w:proofErr w:type="spellEnd"/>
-      <w:r>
-        <w:rPr>
-          <w:sz w:val="24"/>
-          <w:szCs w:val="24"/>
-          <w:lang w:val="en-US"/>
-        </w:rPr>
-        <w:t>,</w:t>
+        <w:t>Connect the sensor with STM32 board. There are only three pins Vcc,</w:t>
       </w:r>
       <w:r>
         <w:rPr>
@@ -5695,25 +5571,7 @@
           <w:szCs w:val="24"/>
           <w:lang w:val="en-US"/>
         </w:rPr>
-        <w:t xml:space="preserve">GND and data. Connect </w:t>
-      </w:r>
-      <w:proofErr w:type="spellStart"/>
-      <w:r>
-        <w:rPr>
-          <w:sz w:val="24"/>
-          <w:szCs w:val="24"/>
-          <w:lang w:val="en-US"/>
-        </w:rPr>
-        <w:t>Vcc</w:t>
-      </w:r>
-      <w:proofErr w:type="spellEnd"/>
-      <w:r>
-        <w:rPr>
-          <w:sz w:val="24"/>
-          <w:szCs w:val="24"/>
-          <w:lang w:val="en-US"/>
-        </w:rPr>
-        <w:t xml:space="preserve"> with 3.3V supply from CN8,</w:t>
+        <w:t>GND and data. Connect Vcc with 3.3V supply from CN8,</w:t>
       </w:r>
       <w:r>
         <w:rPr>
@@ -5752,25 +5610,7 @@
           <w:szCs w:val="24"/>
           <w:lang w:val="en-US"/>
         </w:rPr>
-        <w:t xml:space="preserve">The DHT22 sensor does not have any LED indication to identify whether it is powered ON when connected to STM32.To ensure that the sensor module works fine, measure the voltage between </w:t>
-      </w:r>
-      <w:proofErr w:type="spellStart"/>
-      <w:r>
-        <w:rPr>
-          <w:sz w:val="24"/>
-          <w:szCs w:val="24"/>
-          <w:lang w:val="en-US"/>
-        </w:rPr>
-        <w:t>Vcc</w:t>
-      </w:r>
-      <w:proofErr w:type="spellEnd"/>
-      <w:r>
-        <w:rPr>
-          <w:sz w:val="24"/>
-          <w:szCs w:val="24"/>
-          <w:lang w:val="en-US"/>
-        </w:rPr>
-        <w:t xml:space="preserve"> and GND pin using a multimeter.</w:t>
+        <w:t>DWT counter is enabled in the main code to enable precision timing in the range of micro seconds.</w:t>
       </w:r>
     </w:p>
     <w:p>
@@ -5793,61 +5633,7 @@
           <w:szCs w:val="24"/>
           <w:lang w:val="en-US"/>
         </w:rPr>
-        <w:t>In the .</w:t>
-      </w:r>
-      <w:proofErr w:type="spellStart"/>
-      <w:r>
-        <w:rPr>
-          <w:sz w:val="24"/>
-          <w:szCs w:val="24"/>
-          <w:lang w:val="en-US"/>
-        </w:rPr>
-        <w:t>ioc</w:t>
-      </w:r>
-      <w:proofErr w:type="spellEnd"/>
-      <w:r>
-        <w:rPr>
-          <w:sz w:val="24"/>
-          <w:szCs w:val="24"/>
-          <w:lang w:val="en-US"/>
-        </w:rPr>
-        <w:t xml:space="preserve"> file configure PA0 as </w:t>
-      </w:r>
-      <w:proofErr w:type="spellStart"/>
-      <w:r>
-        <w:rPr>
-          <w:sz w:val="24"/>
-          <w:szCs w:val="24"/>
-          <w:lang w:val="en-US"/>
-        </w:rPr>
-        <w:t>gpio</w:t>
-      </w:r>
-      <w:proofErr w:type="spellEnd"/>
-      <w:r>
-        <w:rPr>
-          <w:sz w:val="24"/>
-          <w:szCs w:val="24"/>
-          <w:lang w:val="en-US"/>
-        </w:rPr>
-        <w:t xml:space="preserve"> input with pull-up option enabled. This is because DHT22 sensor require a 4.7K pull up resistor between </w:t>
-      </w:r>
-      <w:proofErr w:type="spellStart"/>
-      <w:r>
-        <w:rPr>
-          <w:sz w:val="24"/>
-          <w:szCs w:val="24"/>
-          <w:lang w:val="en-US"/>
-        </w:rPr>
-        <w:t>Vcc</w:t>
-      </w:r>
-      <w:proofErr w:type="spellEnd"/>
-      <w:r>
-        <w:rPr>
-          <w:sz w:val="24"/>
-          <w:szCs w:val="24"/>
-          <w:lang w:val="en-US"/>
-        </w:rPr>
-        <w:t xml:space="preserve"> and data pin.</w:t>
+        <w:t>The DHT22 sensor does not have any LED indication to identify whether it is powered ON when connected to STM32.To ensure that the sensor module works fine, measure the voltage between Vcc and GND pin using a multimeter.</w:t>
       </w:r>
     </w:p>
     <w:p>
@@ -5868,6 +5654,29 @@
         <w:rPr>
           <w:sz w:val="24"/>
           <w:szCs w:val="24"/>
+          <w:lang w:val="en-US"/>
+        </w:rPr>
+        <w:t>In the .ioc file configure PA0 as gpio input with pull-up option enabled. This is because DHT22 sensor require a 4.7K pull up resistor between Vcc and data pin.</w:t>
+      </w:r>
+    </w:p>
+    <w:p>
+      <w:pPr>
+        <w:pStyle w:val="ListParagraph"/>
+        <w:numPr>
+          <w:ilvl w:val="0"/>
+          <w:numId w:val="21"/>
+        </w:numPr>
+        <w:jc w:val="both"/>
+        <w:rPr>
+          <w:sz w:val="24"/>
+          <w:szCs w:val="24"/>
+          <w:lang w:val="en-US"/>
+        </w:rPr>
+      </w:pPr>
+      <w:r>
+        <w:rPr>
+          <w:sz w:val="24"/>
+          <w:szCs w:val="24"/>
         </w:rPr>
         <w:t>When the bus is idle, it is in high state condition. This is because of the pull up resistor</w:t>
       </w:r>
@@ -5877,13 +5686,6 @@
           <w:szCs w:val="24"/>
         </w:rPr>
         <w:t>.</w:t>
-      </w:r>
-      <w:r>
-        <w:rPr>
-          <w:sz w:val="24"/>
-          <w:szCs w:val="24"/>
-        </w:rPr>
-        <w:t>9</w:t>
       </w:r>
     </w:p>
     <w:p>
@@ -5925,6 +5727,15 @@
       </w:r>
       <w:r>
         <w:rPr>
+          <w:rStyle w:val="Strong"/>
+          <w:rFonts w:asciiTheme="minorHAnsi" w:hAnsiTheme="minorHAnsi" w:cstheme="minorHAnsi"/>
+          <w:b w:val="0"/>
+          <w:bCs w:val="0"/>
+        </w:rPr>
+        <w:t xml:space="preserve"> for communication</w:t>
+      </w:r>
+      <w:r>
+        <w:rPr>
           <w:rFonts w:asciiTheme="minorHAnsi" w:hAnsiTheme="minorHAnsi" w:cstheme="minorHAnsi"/>
         </w:rPr>
         <w:t>.</w:t>
@@ -6006,21 +5817,7 @@
           <w:rFonts w:asciiTheme="minorHAnsi" w:hAnsiTheme="minorHAnsi" w:cstheme="minorHAnsi"/>
         </w:rPr>
         <w:noBreakHyphen/>
-        <w:t>ups (~30–50 </w:t>
-      </w:r>
-      <w:proofErr w:type="spellStart"/>
-      <w:r>
-        <w:rPr>
-          <w:rFonts w:asciiTheme="minorHAnsi" w:hAnsiTheme="minorHAnsi" w:cstheme="minorHAnsi"/>
-        </w:rPr>
-        <w:t>kΩ</w:t>
-      </w:r>
-      <w:proofErr w:type="spellEnd"/>
-      <w:r>
-        <w:rPr>
-          <w:rFonts w:asciiTheme="minorHAnsi" w:hAnsiTheme="minorHAnsi" w:cstheme="minorHAnsi"/>
-        </w:rPr>
-        <w:t xml:space="preserve">). These are </w:t>
+        <w:t xml:space="preserve">ups (~30–50 kΩ). These are </w:t>
       </w:r>
       <w:r>
         <w:rPr>
@@ -6054,6 +5851,7 @@
         <w:rPr>
           <w:rFonts w:asciiTheme="minorHAnsi" w:hAnsiTheme="minorHAnsi" w:cstheme="minorHAnsi"/>
         </w:rPr>
+        <w:lastRenderedPageBreak/>
         <w:t xml:space="preserve"> The DHT22 requires a stronger pull</w:t>
       </w:r>
       <w:r>
@@ -6070,39 +5868,8 @@
           <w:b w:val="0"/>
           <w:bCs w:val="0"/>
         </w:rPr>
-        <w:t>4.7 </w:t>
-      </w:r>
-      <w:proofErr w:type="spellStart"/>
-      <w:r>
-        <w:rPr>
-          <w:rStyle w:val="Strong"/>
-          <w:rFonts w:asciiTheme="minorHAnsi" w:hAnsiTheme="minorHAnsi" w:cstheme="minorHAnsi"/>
-          <w:b w:val="0"/>
-          <w:bCs w:val="0"/>
-        </w:rPr>
-        <w:t>kΩ</w:t>
-      </w:r>
-      <w:proofErr w:type="spellEnd"/>
-      <w:r>
-        <w:rPr>
-          <w:rStyle w:val="Strong"/>
-          <w:rFonts w:asciiTheme="minorHAnsi" w:hAnsiTheme="minorHAnsi" w:cstheme="minorHAnsi"/>
-          <w:b w:val="0"/>
-          <w:bCs w:val="0"/>
-        </w:rPr>
-        <w:t xml:space="preserve"> to 10 </w:t>
-      </w:r>
-      <w:proofErr w:type="spellStart"/>
-      <w:r>
-        <w:rPr>
-          <w:rStyle w:val="Strong"/>
-          <w:rFonts w:asciiTheme="minorHAnsi" w:hAnsiTheme="minorHAnsi" w:cstheme="minorHAnsi"/>
-          <w:b w:val="0"/>
-          <w:bCs w:val="0"/>
-        </w:rPr>
-        <w:t>kΩ</w:t>
-      </w:r>
-      <w:proofErr w:type="spellEnd"/>
+        <w:t>4.7 kΩ to 10 kΩ</w:t>
+      </w:r>
       <w:r>
         <w:rPr>
           <w:rFonts w:asciiTheme="minorHAnsi" w:hAnsiTheme="minorHAnsi" w:cstheme="minorHAnsi"/>
@@ -6126,7 +5893,6 @@
         <w:rPr>
           <w:rFonts w:asciiTheme="minorHAnsi" w:hAnsiTheme="minorHAnsi" w:cstheme="minorHAnsi"/>
         </w:rPr>
-        <w:lastRenderedPageBreak/>
         <w:t xml:space="preserve">That’s why you add an </w:t>
       </w:r>
       <w:r>
@@ -6136,27 +5902,7 @@
           <w:b w:val="0"/>
           <w:bCs w:val="0"/>
         </w:rPr>
-        <w:t>external 4.7 </w:t>
-      </w:r>
-      <w:proofErr w:type="spellStart"/>
-      <w:r>
-        <w:rPr>
-          <w:rStyle w:val="Strong"/>
-          <w:rFonts w:asciiTheme="minorHAnsi" w:hAnsiTheme="minorHAnsi" w:cstheme="minorHAnsi"/>
-          <w:b w:val="0"/>
-          <w:bCs w:val="0"/>
-        </w:rPr>
-        <w:t>kΩ</w:t>
-      </w:r>
-      <w:proofErr w:type="spellEnd"/>
-      <w:r>
-        <w:rPr>
-          <w:rStyle w:val="Strong"/>
-          <w:rFonts w:asciiTheme="minorHAnsi" w:hAnsiTheme="minorHAnsi" w:cstheme="minorHAnsi"/>
-          <w:b w:val="0"/>
-          <w:bCs w:val="0"/>
-        </w:rPr>
-        <w:t xml:space="preserve"> resistor</w:t>
+        <w:t>external 4.7 kΩ resistor</w:t>
       </w:r>
       <w:r>
         <w:rPr>
@@ -6435,23 +6181,15 @@
           <w:szCs w:val="24"/>
         </w:rPr>
         <w:noBreakHyphen/>
-        <w:t>wire protocol with precise timing control. The microsecond delay function uses the STM32’s DWT cycle counter to generate accurate delays, while DHT22_WaitForPin ensures transitions occur within a timeout so the MCU never hangs. To start communication, the MCU drives the data pin low for 20 </w:t>
-      </w:r>
-      <w:proofErr w:type="spellStart"/>
-      <w:r>
-        <w:rPr>
-          <w:sz w:val="24"/>
-          <w:szCs w:val="24"/>
-        </w:rPr>
-        <w:t>ms</w:t>
-      </w:r>
-      <w:proofErr w:type="spellEnd"/>
-      <w:r>
-        <w:rPr>
-          <w:sz w:val="24"/>
-          <w:szCs w:val="24"/>
-        </w:rPr>
-        <w:t>, then releases it and switches the pin to input mode; the DHT22 responds with a specific low</w:t>
+        <w:t xml:space="preserve">wire protocol with precise timing control. The microsecond delay function uses the STM32’s DWT cycle counter to generate accurate delays, while DHT22_WaitForPin ensures transitions occur within a timeout so the MCU never </w:t>
+      </w:r>
+      <w:r>
+        <w:rPr>
+          <w:sz w:val="24"/>
+          <w:szCs w:val="24"/>
+        </w:rPr>
+        <w:lastRenderedPageBreak/>
+        <w:t>hangs. To start communication, the MCU drives the data pin low for 20 ms, then releases it and switches the pin to input mode; the DHT22 responds with a specific low</w:t>
       </w:r>
       <w:r>
         <w:rPr>
@@ -6459,15 +6197,7 @@
           <w:szCs w:val="24"/>
         </w:rPr>
         <w:noBreakHyphen/>
-        <w:t xml:space="preserve">high handshake. </w:t>
-      </w:r>
-      <w:r>
-        <w:rPr>
-          <w:sz w:val="24"/>
-          <w:szCs w:val="24"/>
-        </w:rPr>
-        <w:lastRenderedPageBreak/>
-        <w:t>The main read loop then captures 40 bits: each bit begins with a low pulse, followed by a high pulse whose duration encodes 0 or 1. The code samples the line after ~40 µs to decide the bit value and assembles the result into five bytes. A checksum verifies data integrity, and the raw humidity and temperature values are extracted from the first four bytes, scaled by 10 to yield human</w:t>
+        <w:t>high handshake. The main read loop then captures 40 bits: each bit begins with a low pulse, followed by a high pulse whose duration encodes 0 or 1. The code samples the line after ~40 µs to decide the bit value and assembles the result into five bytes. A checksum verifies data integrity, and the raw humidity and temperature values are extracted from the first four bytes, scaled by 10 to yield human</w:t>
       </w:r>
       <w:r>
         <w:rPr>
@@ -6635,23 +6365,13 @@
         </w:rPr>
         <w:t xml:space="preserve">HX711 </w:t>
       </w:r>
-      <w:proofErr w:type="spellStart"/>
-      <w:r>
-        <w:rPr>
-          <w:sz w:val="24"/>
-          <w:szCs w:val="24"/>
-          <w:lang w:val="en-US"/>
-        </w:rPr>
-        <w:t>Vcc</w:t>
-      </w:r>
-      <w:proofErr w:type="spellEnd"/>
-      <w:r>
-        <w:rPr>
-          <w:sz w:val="24"/>
-          <w:szCs w:val="24"/>
-          <w:lang w:val="en-US"/>
-        </w:rPr>
-        <w:t>:</w:t>
+      <w:r>
+        <w:rPr>
+          <w:sz w:val="24"/>
+          <w:szCs w:val="24"/>
+          <w:lang w:val="en-US"/>
+        </w:rPr>
+        <w:t>Vcc:</w:t>
       </w:r>
       <w:r>
         <w:rPr>
@@ -6758,6 +6478,7 @@
           <w:szCs w:val="24"/>
           <w:lang w:val="en-US"/>
         </w:rPr>
+        <w:lastRenderedPageBreak/>
         <w:drawing>
           <wp:inline distT="0" distB="0" distL="0" distR="0" wp14:anchorId="341E5B35" wp14:editId="13E0725F">
             <wp:extent cx="5731510" cy="3653790"/>
@@ -6808,7 +6529,6 @@
           <w:sz w:val="24"/>
           <w:szCs w:val="24"/>
         </w:rPr>
-        <w:lastRenderedPageBreak/>
         <w:t>A load cell is basically a metal bar with strain gauges that change resistance when the bar bends under force. This bending produces a very tiny voltage difference (in the range of millivolts). Because the signal is so small, the HX711 chip amplifies it about 128 times and then converts it into a 24</w:t>
       </w:r>
       <w:r>
@@ -6972,7 +6692,6 @@
         <w:rPr>
           <w:sz w:val="24"/>
           <w:szCs w:val="24"/>
-          <w:lang w:val="en-US"/>
         </w:rPr>
       </w:pPr>
       <w:r>
@@ -6988,7 +6707,15 @@
           <w:szCs w:val="24"/>
         </w:rPr>
         <w:noBreakHyphen/>
-        <w:t>bit ADC register, which the code assembles into value. After the 24th bit, the code issues one extra pulse (25th), which is not part of the data but re</w:t>
+        <w:t xml:space="preserve">bit ADC register, which the code assembles into value. After the 24th bit, the code issues </w:t>
+      </w:r>
+      <w:r>
+        <w:rPr>
+          <w:sz w:val="24"/>
+          <w:szCs w:val="24"/>
+        </w:rPr>
+        <w:lastRenderedPageBreak/>
+        <w:t>one extra pulse (25th), which is not part of the data but re</w:t>
       </w:r>
       <w:r>
         <w:rPr>
@@ -7014,6 +6741,3930 @@
         <w:noBreakHyphen/>
         <w:t>extend it into 32 bits so negative readings are preserved correctly. The tare routine averages multiple samples to establish a baseline offset, while the weight function subtracts this offset from new raw readings and multiplies by a calibration factor to convert counts into kilograms. In essence, the code handles clock generation, protocol framing, signed data conversion, and calibration, turning the millivolt signal from the load cell into a stable, meaningful weight measurement.</w:t>
       </w:r>
+    </w:p>
+    <w:p>
+      <w:pPr>
+        <w:jc w:val="both"/>
+        <w:rPr>
+          <w:sz w:val="24"/>
+          <w:szCs w:val="24"/>
+        </w:rPr>
+      </w:pPr>
+    </w:p>
+    <w:p>
+      <w:pPr>
+        <w:jc w:val="both"/>
+        <w:rPr>
+          <w:b/>
+          <w:bCs/>
+          <w:sz w:val="24"/>
+          <w:szCs w:val="24"/>
+        </w:rPr>
+      </w:pPr>
+      <w:r>
+        <w:rPr>
+          <w:b/>
+          <w:bCs/>
+          <w:sz w:val="24"/>
+          <w:szCs w:val="24"/>
+        </w:rPr>
+        <w:t>Sensor Specifications</w:t>
+      </w:r>
+    </w:p>
+    <w:p>
+      <w:pPr>
+        <w:pStyle w:val="ListParagraph"/>
+        <w:numPr>
+          <w:ilvl w:val="0"/>
+          <w:numId w:val="32"/>
+        </w:numPr>
+        <w:jc w:val="both"/>
+        <w:rPr>
+          <w:b/>
+          <w:bCs/>
+          <w:sz w:val="24"/>
+          <w:szCs w:val="24"/>
+          <w:lang w:val="en-US"/>
+        </w:rPr>
+      </w:pPr>
+      <w:r>
+        <w:rPr>
+          <w:b/>
+          <w:bCs/>
+          <w:sz w:val="24"/>
+          <w:szCs w:val="24"/>
+          <w:lang w:val="en-US"/>
+        </w:rPr>
+        <w:t>MQ2</w:t>
+      </w:r>
+      <w:r>
+        <w:rPr>
+          <w:b/>
+          <w:bCs/>
+          <w:sz w:val="24"/>
+          <w:szCs w:val="24"/>
+          <w:lang w:val="en-US"/>
+        </w:rPr>
+        <w:t>-</w:t>
+      </w:r>
+      <w:r>
+        <w:rPr>
+          <w:b/>
+          <w:bCs/>
+          <w:sz w:val="24"/>
+          <w:szCs w:val="24"/>
+          <w:lang w:val="en-US"/>
+        </w:rPr>
+        <w:t>LPG sensor</w:t>
+      </w:r>
+    </w:p>
+    <w:p>
+      <w:pPr>
+        <w:pStyle w:val="ListParagraph"/>
+        <w:jc w:val="both"/>
+        <w:rPr>
+          <w:b/>
+          <w:bCs/>
+          <w:sz w:val="24"/>
+          <w:szCs w:val="24"/>
+          <w:lang w:val="en-US"/>
+        </w:rPr>
+      </w:pPr>
+    </w:p>
+    <w:tbl>
+      <w:tblPr>
+        <w:tblStyle w:val="TableGrid"/>
+        <w:tblW w:w="0" w:type="auto"/>
+        <w:jc w:val="center"/>
+        <w:tblLook w:val="04A0" w:firstRow="1" w:lastRow="0" w:firstColumn="1" w:lastColumn="0" w:noHBand="0" w:noVBand="1"/>
+      </w:tblPr>
+      <w:tblGrid>
+        <w:gridCol w:w="4152"/>
+        <w:gridCol w:w="4144"/>
+      </w:tblGrid>
+      <w:tr>
+        <w:trPr>
+          <w:trHeight w:val="532"/>
+          <w:jc w:val="center"/>
+        </w:trPr>
+        <w:tc>
+          <w:tcPr>
+            <w:tcW w:w="4152" w:type="dxa"/>
+            <w:vAlign w:val="center"/>
+          </w:tcPr>
+          <w:p>
+            <w:pPr>
+              <w:pStyle w:val="ListParagraph"/>
+              <w:ind w:left="0"/>
+              <w:jc w:val="center"/>
+              <w:rPr>
+                <w:b/>
+                <w:bCs/>
+                <w:sz w:val="24"/>
+                <w:szCs w:val="24"/>
+                <w:lang w:val="en-US"/>
+              </w:rPr>
+            </w:pPr>
+            <w:r>
+              <w:rPr>
+                <w:b/>
+                <w:bCs/>
+                <w:sz w:val="24"/>
+                <w:szCs w:val="24"/>
+                <w:lang w:val="en-US"/>
+              </w:rPr>
+              <w:t>Parameter</w:t>
+            </w:r>
+          </w:p>
+        </w:tc>
+        <w:tc>
+          <w:tcPr>
+            <w:tcW w:w="4144" w:type="dxa"/>
+            <w:vAlign w:val="center"/>
+          </w:tcPr>
+          <w:p>
+            <w:pPr>
+              <w:pStyle w:val="ListParagraph"/>
+              <w:ind w:left="0"/>
+              <w:jc w:val="center"/>
+              <w:rPr>
+                <w:b/>
+                <w:bCs/>
+                <w:sz w:val="24"/>
+                <w:szCs w:val="24"/>
+                <w:lang w:val="en-US"/>
+              </w:rPr>
+            </w:pPr>
+            <w:r>
+              <w:rPr>
+                <w:b/>
+                <w:bCs/>
+                <w:sz w:val="24"/>
+                <w:szCs w:val="24"/>
+                <w:lang w:val="en-US"/>
+              </w:rPr>
+              <w:t>Values</w:t>
+            </w:r>
+          </w:p>
+        </w:tc>
+      </w:tr>
+      <w:tr>
+        <w:trPr>
+          <w:jc w:val="center"/>
+        </w:trPr>
+        <w:tc>
+          <w:tcPr>
+            <w:tcW w:w="4152" w:type="dxa"/>
+            <w:vAlign w:val="center"/>
+          </w:tcPr>
+          <w:p>
+            <w:pPr>
+              <w:pStyle w:val="ListParagraph"/>
+              <w:ind w:left="0"/>
+              <w:jc w:val="center"/>
+              <w:rPr>
+                <w:sz w:val="24"/>
+                <w:szCs w:val="24"/>
+                <w:lang w:val="en-US"/>
+              </w:rPr>
+            </w:pPr>
+            <w:r>
+              <w:rPr>
+                <w:sz w:val="24"/>
+                <w:szCs w:val="24"/>
+                <w:lang w:val="en-US"/>
+              </w:rPr>
+              <w:t>Detectable gases</w:t>
+            </w:r>
+          </w:p>
+        </w:tc>
+        <w:tc>
+          <w:tcPr>
+            <w:tcW w:w="4144" w:type="dxa"/>
+            <w:vAlign w:val="center"/>
+          </w:tcPr>
+          <w:p>
+            <w:pPr>
+              <w:pStyle w:val="ListParagraph"/>
+              <w:ind w:left="0"/>
+              <w:jc w:val="center"/>
+              <w:rPr>
+                <w:sz w:val="24"/>
+                <w:szCs w:val="24"/>
+                <w:lang w:val="en-US"/>
+              </w:rPr>
+            </w:pPr>
+            <w:r>
+              <w:rPr>
+                <w:sz w:val="24"/>
+                <w:szCs w:val="24"/>
+                <w:lang w:val="en-US"/>
+              </w:rPr>
+              <w:t>LPG,i-butane, propane, methane, alcohol, hydrogen, smoke</w:t>
+            </w:r>
+          </w:p>
+        </w:tc>
+      </w:tr>
+      <w:tr>
+        <w:trPr>
+          <w:jc w:val="center"/>
+        </w:trPr>
+        <w:tc>
+          <w:tcPr>
+            <w:tcW w:w="4152" w:type="dxa"/>
+            <w:vAlign w:val="center"/>
+          </w:tcPr>
+          <w:p>
+            <w:pPr>
+              <w:pStyle w:val="ListParagraph"/>
+              <w:ind w:left="0"/>
+              <w:jc w:val="center"/>
+              <w:rPr>
+                <w:sz w:val="24"/>
+                <w:szCs w:val="24"/>
+                <w:lang w:val="en-US"/>
+              </w:rPr>
+            </w:pPr>
+            <w:r>
+              <w:rPr>
+                <w:sz w:val="24"/>
+                <w:szCs w:val="24"/>
+              </w:rPr>
+              <w:t>Vc</w:t>
+            </w:r>
+            <w:r>
+              <w:rPr>
+                <w:sz w:val="24"/>
+                <w:szCs w:val="24"/>
+              </w:rPr>
+              <w:t>,</w:t>
+            </w:r>
+            <w:r>
+              <w:rPr>
+                <w:sz w:val="24"/>
+                <w:szCs w:val="24"/>
+              </w:rPr>
+              <w:t xml:space="preserve"> Circuit voltage</w:t>
+            </w:r>
+          </w:p>
+        </w:tc>
+        <w:tc>
+          <w:tcPr>
+            <w:tcW w:w="4144" w:type="dxa"/>
+            <w:vAlign w:val="center"/>
+          </w:tcPr>
+          <w:p>
+            <w:pPr>
+              <w:pStyle w:val="ListParagraph"/>
+              <w:ind w:left="0"/>
+              <w:jc w:val="center"/>
+              <w:rPr>
+                <w:sz w:val="24"/>
+                <w:szCs w:val="24"/>
+                <w:lang w:val="en-US"/>
+              </w:rPr>
+            </w:pPr>
+            <w:r>
+              <w:rPr>
+                <w:sz w:val="24"/>
+                <w:szCs w:val="24"/>
+              </w:rPr>
+              <w:t>5V±0.1 AC OR DC</w:t>
+            </w:r>
+          </w:p>
+        </w:tc>
+      </w:tr>
+      <w:tr>
+        <w:trPr>
+          <w:jc w:val="center"/>
+        </w:trPr>
+        <w:tc>
+          <w:tcPr>
+            <w:tcW w:w="4152" w:type="dxa"/>
+            <w:vAlign w:val="center"/>
+          </w:tcPr>
+          <w:p>
+            <w:pPr>
+              <w:pStyle w:val="ListParagraph"/>
+              <w:ind w:left="0"/>
+              <w:jc w:val="center"/>
+              <w:rPr>
+                <w:sz w:val="24"/>
+                <w:szCs w:val="24"/>
+                <w:lang w:val="en-US"/>
+              </w:rPr>
+            </w:pPr>
+            <w:r>
+              <w:rPr>
+                <w:sz w:val="24"/>
+                <w:szCs w:val="24"/>
+              </w:rPr>
+              <w:t>VH</w:t>
+            </w:r>
+            <w:r>
+              <w:rPr>
+                <w:sz w:val="24"/>
+                <w:szCs w:val="24"/>
+              </w:rPr>
+              <w:t>,</w:t>
+            </w:r>
+            <w:r>
+              <w:rPr>
+                <w:sz w:val="24"/>
+                <w:szCs w:val="24"/>
+              </w:rPr>
+              <w:t>Heating voltage</w:t>
+            </w:r>
+          </w:p>
+        </w:tc>
+        <w:tc>
+          <w:tcPr>
+            <w:tcW w:w="4144" w:type="dxa"/>
+            <w:vAlign w:val="center"/>
+          </w:tcPr>
+          <w:p>
+            <w:pPr>
+              <w:pStyle w:val="ListParagraph"/>
+              <w:ind w:left="0"/>
+              <w:jc w:val="center"/>
+              <w:rPr>
+                <w:sz w:val="24"/>
+                <w:szCs w:val="24"/>
+                <w:lang w:val="en-US"/>
+              </w:rPr>
+            </w:pPr>
+            <w:r>
+              <w:rPr>
+                <w:sz w:val="24"/>
+                <w:szCs w:val="24"/>
+              </w:rPr>
+              <w:t>5V±0.1 AC OR DC</w:t>
+            </w:r>
+          </w:p>
+        </w:tc>
+      </w:tr>
+      <w:tr>
+        <w:trPr>
+          <w:jc w:val="center"/>
+        </w:trPr>
+        <w:tc>
+          <w:tcPr>
+            <w:tcW w:w="4152" w:type="dxa"/>
+            <w:vAlign w:val="center"/>
+          </w:tcPr>
+          <w:p>
+            <w:pPr>
+              <w:pStyle w:val="ListParagraph"/>
+              <w:ind w:left="0"/>
+              <w:jc w:val="center"/>
+              <w:rPr>
+                <w:rFonts w:cstheme="minorHAnsi"/>
+                <w:sz w:val="24"/>
+                <w:szCs w:val="24"/>
+                <w:lang w:val="en-US"/>
+              </w:rPr>
+            </w:pPr>
+            <w:r>
+              <w:rPr>
+                <w:rFonts w:cstheme="minorHAnsi"/>
+                <w:kern w:val="0"/>
+                <w:sz w:val="24"/>
+                <w:szCs w:val="24"/>
+              </w:rPr>
+              <w:t>RL</w:t>
+            </w:r>
+            <w:r>
+              <w:rPr>
+                <w:rFonts w:cstheme="minorHAnsi"/>
+                <w:kern w:val="0"/>
+                <w:sz w:val="24"/>
+                <w:szCs w:val="24"/>
+              </w:rPr>
+              <w:t>,</w:t>
+            </w:r>
+            <w:r>
+              <w:rPr>
+                <w:rFonts w:cstheme="minorHAnsi"/>
+                <w:kern w:val="0"/>
+                <w:sz w:val="24"/>
+                <w:szCs w:val="24"/>
+              </w:rPr>
+              <w:t xml:space="preserve"> Load resistance can adjust</w:t>
+            </w:r>
+          </w:p>
+        </w:tc>
+        <w:tc>
+          <w:tcPr>
+            <w:tcW w:w="4144" w:type="dxa"/>
+            <w:vAlign w:val="center"/>
+          </w:tcPr>
+          <w:p>
+            <w:pPr>
+              <w:pStyle w:val="ListParagraph"/>
+              <w:ind w:left="0"/>
+              <w:jc w:val="center"/>
+              <w:rPr>
+                <w:rFonts w:cstheme="minorHAnsi"/>
+                <w:sz w:val="24"/>
+                <w:szCs w:val="24"/>
+                <w:lang w:val="en-US"/>
+              </w:rPr>
+            </w:pPr>
+            <w:r>
+              <w:rPr>
+                <w:rFonts w:cstheme="minorHAnsi"/>
+                <w:kern w:val="0"/>
+                <w:sz w:val="24"/>
+                <w:szCs w:val="24"/>
+              </w:rPr>
+              <w:t>20K</w:t>
+            </w:r>
+            <w:r>
+              <w:rPr>
+                <w:rFonts w:eastAsia="ﾋﾎﾌ・" w:cstheme="minorHAnsi"/>
+                <w:kern w:val="0"/>
+                <w:sz w:val="24"/>
+                <w:szCs w:val="24"/>
+              </w:rPr>
+              <w:t xml:space="preserve"> Ω</w:t>
+            </w:r>
+            <w:r>
+              <w:rPr>
+                <w:rFonts w:eastAsia="ﾋﾎﾌ・" w:cstheme="minorHAnsi"/>
+                <w:kern w:val="0"/>
+                <w:sz w:val="24"/>
+                <w:szCs w:val="24"/>
+              </w:rPr>
+              <w:t xml:space="preserve"> (typical) or (5K</w:t>
+            </w:r>
+            <w:r>
+              <w:rPr>
+                <w:rFonts w:eastAsia="ﾋﾎﾌ・" w:cstheme="minorHAnsi"/>
+                <w:kern w:val="0"/>
+                <w:sz w:val="24"/>
+                <w:szCs w:val="24"/>
+              </w:rPr>
+              <w:t xml:space="preserve"> Ω</w:t>
+            </w:r>
+            <w:r>
+              <w:rPr>
+                <w:rFonts w:eastAsia="ﾋﾎﾌ・" w:cstheme="minorHAnsi"/>
+                <w:kern w:val="0"/>
+                <w:sz w:val="24"/>
+                <w:szCs w:val="24"/>
+              </w:rPr>
+              <w:t xml:space="preserve"> -</w:t>
+            </w:r>
+            <w:r>
+              <w:rPr>
+                <w:rFonts w:eastAsia="ﾋﾎﾌ・" w:cstheme="minorHAnsi"/>
+                <w:kern w:val="0"/>
+                <w:sz w:val="24"/>
+                <w:szCs w:val="24"/>
+              </w:rPr>
+              <w:t xml:space="preserve"> 47K</w:t>
+            </w:r>
+            <w:r>
+              <w:rPr>
+                <w:rFonts w:eastAsia="ﾋﾎﾌ・" w:cstheme="minorHAnsi"/>
+                <w:kern w:val="0"/>
+                <w:sz w:val="24"/>
+                <w:szCs w:val="24"/>
+              </w:rPr>
+              <w:t xml:space="preserve"> Ω</w:t>
+            </w:r>
+            <w:r>
+              <w:rPr>
+                <w:rFonts w:eastAsia="ﾋﾎﾌ・" w:cstheme="minorHAnsi"/>
+                <w:kern w:val="0"/>
+                <w:sz w:val="24"/>
+                <w:szCs w:val="24"/>
+              </w:rPr>
+              <w:t>)</w:t>
+            </w:r>
+          </w:p>
+        </w:tc>
+      </w:tr>
+      <w:tr>
+        <w:trPr>
+          <w:jc w:val="center"/>
+        </w:trPr>
+        <w:tc>
+          <w:tcPr>
+            <w:tcW w:w="4152" w:type="dxa"/>
+            <w:vAlign w:val="center"/>
+          </w:tcPr>
+          <w:p>
+            <w:pPr>
+              <w:pStyle w:val="ListParagraph"/>
+              <w:ind w:left="0"/>
+              <w:jc w:val="center"/>
+              <w:rPr>
+                <w:rFonts w:cstheme="minorHAnsi"/>
+                <w:sz w:val="24"/>
+                <w:szCs w:val="24"/>
+                <w:lang w:val="en-US"/>
+              </w:rPr>
+            </w:pPr>
+            <w:r>
+              <w:rPr>
+                <w:rFonts w:cstheme="minorHAnsi"/>
+                <w:kern w:val="0"/>
+                <w:sz w:val="24"/>
+                <w:szCs w:val="24"/>
+              </w:rPr>
+              <w:t>RH</w:t>
+            </w:r>
+            <w:r>
+              <w:rPr>
+                <w:rFonts w:cstheme="minorHAnsi"/>
+                <w:kern w:val="0"/>
+                <w:sz w:val="24"/>
+                <w:szCs w:val="24"/>
+              </w:rPr>
+              <w:t>,</w:t>
+            </w:r>
+            <w:r>
+              <w:rPr>
+                <w:rFonts w:cstheme="minorHAnsi"/>
+                <w:kern w:val="0"/>
+                <w:sz w:val="24"/>
+                <w:szCs w:val="24"/>
+              </w:rPr>
+              <w:t xml:space="preserve"> Heater resistance 33</w:t>
+            </w:r>
+            <w:r>
+              <w:rPr>
+                <w:rFonts w:eastAsia="ﾋﾎﾌ・" w:cstheme="minorHAnsi"/>
+                <w:kern w:val="0"/>
+                <w:sz w:val="24"/>
+                <w:szCs w:val="24"/>
+              </w:rPr>
+              <w:t>Ω</w:t>
+            </w:r>
+            <w:r>
+              <w:rPr>
+                <w:rFonts w:ascii="Calibri" w:eastAsia="ﾋﾎﾌ・" w:hAnsi="Calibri" w:cs="Calibri"/>
+                <w:kern w:val="0"/>
+                <w:sz w:val="24"/>
+                <w:szCs w:val="24"/>
+              </w:rPr>
+              <w:t></w:t>
+            </w:r>
+            <w:r>
+              <w:rPr>
+                <w:rFonts w:eastAsia="ﾋﾎﾌ・" w:cstheme="minorHAnsi"/>
+                <w:kern w:val="0"/>
+                <w:sz w:val="24"/>
+                <w:szCs w:val="24"/>
+              </w:rPr>
+              <w:t>}</w:t>
+            </w:r>
+            <w:r>
+              <w:rPr>
+                <w:rFonts w:cstheme="minorHAnsi"/>
+                <w:kern w:val="0"/>
+                <w:sz w:val="24"/>
+                <w:szCs w:val="24"/>
+              </w:rPr>
+              <w:t>5%</w:t>
+            </w:r>
+          </w:p>
+        </w:tc>
+        <w:tc>
+          <w:tcPr>
+            <w:tcW w:w="4144" w:type="dxa"/>
+            <w:vAlign w:val="center"/>
+          </w:tcPr>
+          <w:p>
+            <w:pPr>
+              <w:pStyle w:val="ListParagraph"/>
+              <w:ind w:left="0"/>
+              <w:jc w:val="center"/>
+              <w:rPr>
+                <w:rFonts w:cstheme="minorHAnsi"/>
+                <w:sz w:val="24"/>
+                <w:szCs w:val="24"/>
+                <w:lang w:val="en-US"/>
+              </w:rPr>
+            </w:pPr>
+            <w:r>
+              <w:rPr>
+                <w:rFonts w:cstheme="minorHAnsi"/>
+                <w:kern w:val="0"/>
+                <w:sz w:val="24"/>
+                <w:szCs w:val="24"/>
+              </w:rPr>
+              <w:t>33</w:t>
+            </w:r>
+            <w:r>
+              <w:rPr>
+                <w:rFonts w:eastAsia="ﾋﾎﾌ・" w:cstheme="minorHAnsi"/>
+                <w:kern w:val="0"/>
+                <w:sz w:val="24"/>
+                <w:szCs w:val="24"/>
+              </w:rPr>
+              <w:t>Ω</w:t>
+            </w:r>
+            <w:r>
+              <w:rPr>
+                <w:rFonts w:eastAsia="ﾋﾎﾌ・" w:cstheme="minorHAnsi"/>
+                <w:kern w:val="0"/>
+                <w:sz w:val="24"/>
+                <w:szCs w:val="24"/>
+              </w:rPr>
+              <w:t xml:space="preserve"> ±</w:t>
+            </w:r>
+            <w:r>
+              <w:rPr>
+                <w:rFonts w:cstheme="minorHAnsi"/>
+                <w:kern w:val="0"/>
+                <w:sz w:val="24"/>
+                <w:szCs w:val="24"/>
+              </w:rPr>
+              <w:t>5%</w:t>
+            </w:r>
+          </w:p>
+        </w:tc>
+      </w:tr>
+      <w:tr>
+        <w:trPr>
+          <w:jc w:val="center"/>
+        </w:trPr>
+        <w:tc>
+          <w:tcPr>
+            <w:tcW w:w="4152" w:type="dxa"/>
+            <w:vAlign w:val="center"/>
+          </w:tcPr>
+          <w:p>
+            <w:pPr>
+              <w:pStyle w:val="ListParagraph"/>
+              <w:ind w:left="0"/>
+              <w:jc w:val="center"/>
+              <w:rPr>
+                <w:rFonts w:cstheme="minorHAnsi"/>
+                <w:kern w:val="0"/>
+                <w:sz w:val="24"/>
+                <w:szCs w:val="24"/>
+              </w:rPr>
+            </w:pPr>
+            <w:r>
+              <w:rPr>
+                <w:rFonts w:cstheme="minorHAnsi"/>
+                <w:kern w:val="0"/>
+                <w:sz w:val="24"/>
+                <w:szCs w:val="24"/>
+              </w:rPr>
+              <w:t>PH</w:t>
+            </w:r>
+            <w:r>
+              <w:rPr>
+                <w:rFonts w:cstheme="minorHAnsi"/>
+                <w:kern w:val="0"/>
+                <w:sz w:val="24"/>
+                <w:szCs w:val="24"/>
+              </w:rPr>
+              <w:t>,</w:t>
+            </w:r>
+            <w:r>
+              <w:rPr>
+                <w:rFonts w:cstheme="minorHAnsi"/>
+                <w:kern w:val="0"/>
+                <w:sz w:val="24"/>
+                <w:szCs w:val="24"/>
+              </w:rPr>
+              <w:t xml:space="preserve"> Heating consumption</w:t>
+            </w:r>
+          </w:p>
+        </w:tc>
+        <w:tc>
+          <w:tcPr>
+            <w:tcW w:w="4144" w:type="dxa"/>
+            <w:vAlign w:val="center"/>
+          </w:tcPr>
+          <w:p>
+            <w:pPr>
+              <w:pStyle w:val="ListParagraph"/>
+              <w:ind w:left="0"/>
+              <w:jc w:val="center"/>
+              <w:rPr>
+                <w:rFonts w:cstheme="minorHAnsi"/>
+                <w:kern w:val="0"/>
+                <w:sz w:val="24"/>
+                <w:szCs w:val="24"/>
+              </w:rPr>
+            </w:pPr>
+            <w:r>
+              <w:rPr>
+                <w:rFonts w:cstheme="minorHAnsi"/>
+                <w:kern w:val="0"/>
+                <w:sz w:val="24"/>
+                <w:szCs w:val="24"/>
+              </w:rPr>
+              <w:t>&lt;</w:t>
+            </w:r>
+            <w:r>
+              <w:rPr>
+                <w:rFonts w:cstheme="minorHAnsi"/>
+                <w:kern w:val="0"/>
+                <w:sz w:val="24"/>
+                <w:szCs w:val="24"/>
+              </w:rPr>
+              <w:t xml:space="preserve"> 800mw</w:t>
+            </w:r>
+          </w:p>
+        </w:tc>
+      </w:tr>
+      <w:tr>
+        <w:trPr>
+          <w:jc w:val="center"/>
+        </w:trPr>
+        <w:tc>
+          <w:tcPr>
+            <w:tcW w:w="4152" w:type="dxa"/>
+            <w:vAlign w:val="center"/>
+          </w:tcPr>
+          <w:p>
+            <w:pPr>
+              <w:jc w:val="center"/>
+              <w:rPr>
+                <w:rFonts w:cstheme="minorHAnsi"/>
+                <w:kern w:val="0"/>
+                <w:sz w:val="24"/>
+                <w:szCs w:val="24"/>
+              </w:rPr>
+            </w:pPr>
+            <w:r>
+              <w:rPr>
+                <w:rFonts w:cstheme="minorHAnsi"/>
+                <w:kern w:val="0"/>
+                <w:sz w:val="24"/>
+                <w:szCs w:val="24"/>
+              </w:rPr>
+              <w:t>Rs, Sensing Resistance</w:t>
+            </w:r>
+          </w:p>
+        </w:tc>
+        <w:tc>
+          <w:tcPr>
+            <w:tcW w:w="4144" w:type="dxa"/>
+            <w:vAlign w:val="center"/>
+          </w:tcPr>
+          <w:p>
+            <w:pPr>
+              <w:pStyle w:val="ListParagraph"/>
+              <w:ind w:left="0"/>
+              <w:jc w:val="center"/>
+              <w:rPr>
+                <w:rFonts w:cstheme="minorHAnsi"/>
+                <w:kern w:val="0"/>
+                <w:sz w:val="24"/>
+                <w:szCs w:val="24"/>
+              </w:rPr>
+            </w:pPr>
+            <w:r>
+              <w:rPr>
+                <w:rFonts w:cstheme="minorHAnsi"/>
+                <w:kern w:val="0"/>
+                <w:sz w:val="24"/>
+                <w:szCs w:val="24"/>
+              </w:rPr>
+              <w:t>3KΩ-30KΩ</w:t>
+            </w:r>
+          </w:p>
+        </w:tc>
+      </w:tr>
+      <w:tr>
+        <w:trPr>
+          <w:jc w:val="center"/>
+        </w:trPr>
+        <w:tc>
+          <w:tcPr>
+            <w:tcW w:w="4152" w:type="dxa"/>
+            <w:vAlign w:val="center"/>
+          </w:tcPr>
+          <w:p>
+            <w:pPr>
+              <w:jc w:val="center"/>
+              <w:rPr>
+                <w:rFonts w:cstheme="minorHAnsi"/>
+                <w:kern w:val="0"/>
+                <w:sz w:val="24"/>
+                <w:szCs w:val="24"/>
+              </w:rPr>
+            </w:pPr>
+            <w:r>
+              <w:rPr>
+                <w:rFonts w:cstheme="minorHAnsi"/>
+                <w:kern w:val="0"/>
+                <w:sz w:val="24"/>
+                <w:szCs w:val="24"/>
+              </w:rPr>
+              <w:t>Rs/R0</w:t>
+            </w:r>
+          </w:p>
+        </w:tc>
+        <w:tc>
+          <w:tcPr>
+            <w:tcW w:w="4144" w:type="dxa"/>
+            <w:vAlign w:val="center"/>
+          </w:tcPr>
+          <w:p>
+            <w:pPr>
+              <w:pStyle w:val="ListParagraph"/>
+              <w:ind w:left="0"/>
+              <w:jc w:val="center"/>
+              <w:rPr>
+                <w:rFonts w:cstheme="minorHAnsi"/>
+                <w:kern w:val="0"/>
+                <w:sz w:val="24"/>
+                <w:szCs w:val="24"/>
+              </w:rPr>
+            </w:pPr>
+            <w:r>
+              <w:rPr>
+                <w:rFonts w:cstheme="minorHAnsi"/>
+                <w:kern w:val="0"/>
+                <w:sz w:val="24"/>
+                <w:szCs w:val="24"/>
+              </w:rPr>
+              <w:t>9.8</w:t>
+            </w:r>
+          </w:p>
+        </w:tc>
+      </w:tr>
+      <w:tr>
+        <w:trPr>
+          <w:jc w:val="center"/>
+        </w:trPr>
+        <w:tc>
+          <w:tcPr>
+            <w:tcW w:w="4152" w:type="dxa"/>
+            <w:vAlign w:val="center"/>
+          </w:tcPr>
+          <w:p>
+            <w:pPr>
+              <w:jc w:val="center"/>
+              <w:rPr>
+                <w:rFonts w:cstheme="minorHAnsi"/>
+                <w:kern w:val="0"/>
+                <w:sz w:val="24"/>
+                <w:szCs w:val="24"/>
+              </w:rPr>
+            </w:pPr>
+            <w:r>
+              <w:rPr>
+                <w:rFonts w:cstheme="minorHAnsi"/>
+                <w:kern w:val="0"/>
+                <w:sz w:val="24"/>
+                <w:szCs w:val="24"/>
+              </w:rPr>
+              <w:t>Interface type</w:t>
+            </w:r>
+          </w:p>
+        </w:tc>
+        <w:tc>
+          <w:tcPr>
+            <w:tcW w:w="4144" w:type="dxa"/>
+            <w:vAlign w:val="center"/>
+          </w:tcPr>
+          <w:p>
+            <w:pPr>
+              <w:pStyle w:val="ListParagraph"/>
+              <w:ind w:left="0"/>
+              <w:jc w:val="center"/>
+              <w:rPr>
+                <w:rFonts w:cstheme="minorHAnsi"/>
+                <w:kern w:val="0"/>
+                <w:sz w:val="24"/>
+                <w:szCs w:val="24"/>
+              </w:rPr>
+            </w:pPr>
+            <w:r>
+              <w:rPr>
+                <w:rFonts w:cstheme="minorHAnsi"/>
+                <w:kern w:val="0"/>
+                <w:sz w:val="24"/>
+                <w:szCs w:val="24"/>
+              </w:rPr>
+              <w:t>ADC</w:t>
+            </w:r>
+          </w:p>
+        </w:tc>
+      </w:tr>
+    </w:tbl>
+    <w:p>
+      <w:pPr>
+        <w:pStyle w:val="ListParagraph"/>
+        <w:jc w:val="both"/>
+        <w:rPr>
+          <w:b/>
+          <w:bCs/>
+          <w:sz w:val="24"/>
+          <w:szCs w:val="24"/>
+          <w:lang w:val="en-US"/>
+        </w:rPr>
+      </w:pPr>
+    </w:p>
+    <w:p>
+      <w:pPr>
+        <w:pStyle w:val="ListParagraph"/>
+        <w:numPr>
+          <w:ilvl w:val="0"/>
+          <w:numId w:val="32"/>
+        </w:numPr>
+        <w:jc w:val="both"/>
+        <w:rPr>
+          <w:b/>
+          <w:bCs/>
+          <w:sz w:val="24"/>
+          <w:szCs w:val="24"/>
+          <w:lang w:val="en-US"/>
+        </w:rPr>
+      </w:pPr>
+      <w:r>
+        <w:rPr>
+          <w:b/>
+          <w:bCs/>
+          <w:sz w:val="24"/>
+          <w:szCs w:val="24"/>
+          <w:lang w:val="en-US"/>
+        </w:rPr>
+        <w:t>MQ4-Methane sensor</w:t>
+      </w:r>
+    </w:p>
+    <w:p>
+      <w:pPr>
+        <w:pStyle w:val="ListParagraph"/>
+        <w:jc w:val="both"/>
+        <w:rPr>
+          <w:b/>
+          <w:bCs/>
+          <w:sz w:val="24"/>
+          <w:szCs w:val="24"/>
+          <w:lang w:val="en-US"/>
+        </w:rPr>
+      </w:pPr>
+    </w:p>
+    <w:tbl>
+      <w:tblPr>
+        <w:tblStyle w:val="TableGrid"/>
+        <w:tblW w:w="0" w:type="auto"/>
+        <w:jc w:val="center"/>
+        <w:tblLook w:val="04A0" w:firstRow="1" w:lastRow="0" w:firstColumn="1" w:lastColumn="0" w:noHBand="0" w:noVBand="1"/>
+      </w:tblPr>
+      <w:tblGrid>
+        <w:gridCol w:w="4152"/>
+        <w:gridCol w:w="4144"/>
+      </w:tblGrid>
+      <w:tr>
+        <w:trPr>
+          <w:trHeight w:val="532"/>
+          <w:jc w:val="center"/>
+        </w:trPr>
+        <w:tc>
+          <w:tcPr>
+            <w:tcW w:w="4152" w:type="dxa"/>
+            <w:vAlign w:val="center"/>
+          </w:tcPr>
+          <w:p>
+            <w:pPr>
+              <w:pStyle w:val="ListParagraph"/>
+              <w:ind w:left="0"/>
+              <w:jc w:val="center"/>
+              <w:rPr>
+                <w:b/>
+                <w:bCs/>
+                <w:sz w:val="24"/>
+                <w:szCs w:val="24"/>
+                <w:lang w:val="en-US"/>
+              </w:rPr>
+            </w:pPr>
+            <w:r>
+              <w:rPr>
+                <w:b/>
+                <w:bCs/>
+                <w:sz w:val="24"/>
+                <w:szCs w:val="24"/>
+                <w:lang w:val="en-US"/>
+              </w:rPr>
+              <w:t>Parameter</w:t>
+            </w:r>
+          </w:p>
+        </w:tc>
+        <w:tc>
+          <w:tcPr>
+            <w:tcW w:w="4144" w:type="dxa"/>
+            <w:vAlign w:val="center"/>
+          </w:tcPr>
+          <w:p>
+            <w:pPr>
+              <w:pStyle w:val="ListParagraph"/>
+              <w:ind w:left="0"/>
+              <w:jc w:val="center"/>
+              <w:rPr>
+                <w:b/>
+                <w:bCs/>
+                <w:sz w:val="24"/>
+                <w:szCs w:val="24"/>
+                <w:lang w:val="en-US"/>
+              </w:rPr>
+            </w:pPr>
+            <w:r>
+              <w:rPr>
+                <w:b/>
+                <w:bCs/>
+                <w:sz w:val="24"/>
+                <w:szCs w:val="24"/>
+                <w:lang w:val="en-US"/>
+              </w:rPr>
+              <w:t>Values</w:t>
+            </w:r>
+          </w:p>
+        </w:tc>
+      </w:tr>
+      <w:tr>
+        <w:trPr>
+          <w:jc w:val="center"/>
+        </w:trPr>
+        <w:tc>
+          <w:tcPr>
+            <w:tcW w:w="4152" w:type="dxa"/>
+            <w:vAlign w:val="center"/>
+          </w:tcPr>
+          <w:p>
+            <w:pPr>
+              <w:pStyle w:val="ListParagraph"/>
+              <w:ind w:left="0"/>
+              <w:jc w:val="center"/>
+              <w:rPr>
+                <w:sz w:val="24"/>
+                <w:szCs w:val="24"/>
+                <w:lang w:val="en-US"/>
+              </w:rPr>
+            </w:pPr>
+            <w:r>
+              <w:rPr>
+                <w:sz w:val="24"/>
+                <w:szCs w:val="24"/>
+                <w:lang w:val="en-US"/>
+              </w:rPr>
+              <w:t>Detectable gases</w:t>
+            </w:r>
+          </w:p>
+        </w:tc>
+        <w:tc>
+          <w:tcPr>
+            <w:tcW w:w="4144" w:type="dxa"/>
+            <w:vAlign w:val="center"/>
+          </w:tcPr>
+          <w:p>
+            <w:pPr>
+              <w:pStyle w:val="ListParagraph"/>
+              <w:ind w:left="0"/>
+              <w:jc w:val="center"/>
+              <w:rPr>
+                <w:sz w:val="24"/>
+                <w:szCs w:val="24"/>
+                <w:lang w:val="en-US"/>
+              </w:rPr>
+            </w:pPr>
+            <w:r>
+              <w:rPr>
+                <w:sz w:val="24"/>
+                <w:szCs w:val="24"/>
+                <w:lang w:val="en-US"/>
+              </w:rPr>
+              <w:t>Methane, natural gas,LNG</w:t>
+            </w:r>
+          </w:p>
+        </w:tc>
+      </w:tr>
+      <w:tr>
+        <w:trPr>
+          <w:jc w:val="center"/>
+        </w:trPr>
+        <w:tc>
+          <w:tcPr>
+            <w:tcW w:w="4152" w:type="dxa"/>
+            <w:vAlign w:val="center"/>
+          </w:tcPr>
+          <w:p>
+            <w:pPr>
+              <w:pStyle w:val="ListParagraph"/>
+              <w:ind w:left="0"/>
+              <w:jc w:val="center"/>
+              <w:rPr>
+                <w:sz w:val="24"/>
+                <w:szCs w:val="24"/>
+                <w:lang w:val="en-US"/>
+              </w:rPr>
+            </w:pPr>
+            <w:r>
+              <w:rPr>
+                <w:sz w:val="24"/>
+                <w:szCs w:val="24"/>
+              </w:rPr>
+              <w:t>Vc</w:t>
+            </w:r>
+            <w:r>
+              <w:rPr>
+                <w:sz w:val="24"/>
+                <w:szCs w:val="24"/>
+              </w:rPr>
+              <w:t>,</w:t>
+            </w:r>
+            <w:r>
+              <w:rPr>
+                <w:sz w:val="24"/>
+                <w:szCs w:val="24"/>
+              </w:rPr>
+              <w:t xml:space="preserve"> Circuit voltage</w:t>
+            </w:r>
+          </w:p>
+        </w:tc>
+        <w:tc>
+          <w:tcPr>
+            <w:tcW w:w="4144" w:type="dxa"/>
+            <w:vAlign w:val="center"/>
+          </w:tcPr>
+          <w:p>
+            <w:pPr>
+              <w:pStyle w:val="ListParagraph"/>
+              <w:ind w:left="0"/>
+              <w:jc w:val="center"/>
+              <w:rPr>
+                <w:sz w:val="24"/>
+                <w:szCs w:val="24"/>
+                <w:lang w:val="en-US"/>
+              </w:rPr>
+            </w:pPr>
+            <w:r>
+              <w:rPr>
+                <w:sz w:val="24"/>
+                <w:szCs w:val="24"/>
+              </w:rPr>
+              <w:t>5V±0.1 AC OR DC</w:t>
+            </w:r>
+          </w:p>
+        </w:tc>
+      </w:tr>
+      <w:tr>
+        <w:trPr>
+          <w:jc w:val="center"/>
+        </w:trPr>
+        <w:tc>
+          <w:tcPr>
+            <w:tcW w:w="4152" w:type="dxa"/>
+            <w:vAlign w:val="center"/>
+          </w:tcPr>
+          <w:p>
+            <w:pPr>
+              <w:pStyle w:val="ListParagraph"/>
+              <w:ind w:left="0"/>
+              <w:jc w:val="center"/>
+              <w:rPr>
+                <w:sz w:val="24"/>
+                <w:szCs w:val="24"/>
+                <w:lang w:val="en-US"/>
+              </w:rPr>
+            </w:pPr>
+            <w:r>
+              <w:rPr>
+                <w:sz w:val="24"/>
+                <w:szCs w:val="24"/>
+              </w:rPr>
+              <w:t>VH</w:t>
+            </w:r>
+            <w:r>
+              <w:rPr>
+                <w:sz w:val="24"/>
+                <w:szCs w:val="24"/>
+              </w:rPr>
+              <w:t>,</w:t>
+            </w:r>
+            <w:r>
+              <w:rPr>
+                <w:sz w:val="24"/>
+                <w:szCs w:val="24"/>
+              </w:rPr>
+              <w:t>Heating voltage</w:t>
+            </w:r>
+          </w:p>
+        </w:tc>
+        <w:tc>
+          <w:tcPr>
+            <w:tcW w:w="4144" w:type="dxa"/>
+            <w:vAlign w:val="center"/>
+          </w:tcPr>
+          <w:p>
+            <w:pPr>
+              <w:pStyle w:val="ListParagraph"/>
+              <w:ind w:left="0"/>
+              <w:jc w:val="center"/>
+              <w:rPr>
+                <w:sz w:val="24"/>
+                <w:szCs w:val="24"/>
+                <w:lang w:val="en-US"/>
+              </w:rPr>
+            </w:pPr>
+            <w:r>
+              <w:rPr>
+                <w:sz w:val="24"/>
+                <w:szCs w:val="24"/>
+              </w:rPr>
+              <w:t>5V±0.1 AC OR DC</w:t>
+            </w:r>
+          </w:p>
+        </w:tc>
+      </w:tr>
+      <w:tr>
+        <w:trPr>
+          <w:jc w:val="center"/>
+        </w:trPr>
+        <w:tc>
+          <w:tcPr>
+            <w:tcW w:w="4152" w:type="dxa"/>
+            <w:vAlign w:val="center"/>
+          </w:tcPr>
+          <w:p>
+            <w:pPr>
+              <w:pStyle w:val="ListParagraph"/>
+              <w:ind w:left="0"/>
+              <w:jc w:val="center"/>
+              <w:rPr>
+                <w:rFonts w:cstheme="minorHAnsi"/>
+                <w:sz w:val="24"/>
+                <w:szCs w:val="24"/>
+                <w:lang w:val="en-US"/>
+              </w:rPr>
+            </w:pPr>
+            <w:r>
+              <w:rPr>
+                <w:rFonts w:cstheme="minorHAnsi"/>
+                <w:kern w:val="0"/>
+                <w:sz w:val="24"/>
+                <w:szCs w:val="24"/>
+              </w:rPr>
+              <w:t>RL</w:t>
+            </w:r>
+            <w:r>
+              <w:rPr>
+                <w:rFonts w:cstheme="minorHAnsi"/>
+                <w:kern w:val="0"/>
+                <w:sz w:val="24"/>
+                <w:szCs w:val="24"/>
+              </w:rPr>
+              <w:t>,</w:t>
+            </w:r>
+            <w:r>
+              <w:rPr>
+                <w:rFonts w:cstheme="minorHAnsi"/>
+                <w:kern w:val="0"/>
+                <w:sz w:val="24"/>
+                <w:szCs w:val="24"/>
+              </w:rPr>
+              <w:t xml:space="preserve"> Load resistance can adjust</w:t>
+            </w:r>
+          </w:p>
+        </w:tc>
+        <w:tc>
+          <w:tcPr>
+            <w:tcW w:w="4144" w:type="dxa"/>
+            <w:vAlign w:val="center"/>
+          </w:tcPr>
+          <w:p>
+            <w:pPr>
+              <w:pStyle w:val="ListParagraph"/>
+              <w:ind w:left="0"/>
+              <w:jc w:val="center"/>
+              <w:rPr>
+                <w:rFonts w:cstheme="minorHAnsi"/>
+                <w:sz w:val="24"/>
+                <w:szCs w:val="24"/>
+                <w:lang w:val="en-US"/>
+              </w:rPr>
+            </w:pPr>
+            <w:r>
+              <w:rPr>
+                <w:rFonts w:cstheme="minorHAnsi"/>
+                <w:kern w:val="0"/>
+                <w:sz w:val="24"/>
+                <w:szCs w:val="24"/>
+              </w:rPr>
+              <w:t>20K</w:t>
+            </w:r>
+            <w:r>
+              <w:rPr>
+                <w:rFonts w:eastAsia="ﾋﾎﾌ・" w:cstheme="minorHAnsi"/>
+                <w:kern w:val="0"/>
+                <w:sz w:val="24"/>
+                <w:szCs w:val="24"/>
+              </w:rPr>
+              <w:t xml:space="preserve"> Ω</w:t>
+            </w:r>
+            <w:r>
+              <w:rPr>
+                <w:rFonts w:eastAsia="ﾋﾎﾌ・" w:cstheme="minorHAnsi"/>
+                <w:kern w:val="0"/>
+                <w:sz w:val="24"/>
+                <w:szCs w:val="24"/>
+              </w:rPr>
+              <w:t xml:space="preserve"> (typical) </w:t>
+            </w:r>
+          </w:p>
+        </w:tc>
+      </w:tr>
+      <w:tr>
+        <w:trPr>
+          <w:jc w:val="center"/>
+        </w:trPr>
+        <w:tc>
+          <w:tcPr>
+            <w:tcW w:w="4152" w:type="dxa"/>
+            <w:vAlign w:val="center"/>
+          </w:tcPr>
+          <w:p>
+            <w:pPr>
+              <w:pStyle w:val="ListParagraph"/>
+              <w:ind w:left="0"/>
+              <w:jc w:val="center"/>
+              <w:rPr>
+                <w:rFonts w:cstheme="minorHAnsi"/>
+                <w:sz w:val="24"/>
+                <w:szCs w:val="24"/>
+                <w:lang w:val="en-US"/>
+              </w:rPr>
+            </w:pPr>
+            <w:r>
+              <w:rPr>
+                <w:rFonts w:cstheme="minorHAnsi"/>
+                <w:kern w:val="0"/>
+                <w:sz w:val="24"/>
+                <w:szCs w:val="24"/>
+              </w:rPr>
+              <w:t>RH</w:t>
+            </w:r>
+            <w:r>
+              <w:rPr>
+                <w:rFonts w:cstheme="minorHAnsi"/>
+                <w:kern w:val="0"/>
+                <w:sz w:val="24"/>
+                <w:szCs w:val="24"/>
+              </w:rPr>
+              <w:t>,</w:t>
+            </w:r>
+            <w:r>
+              <w:rPr>
+                <w:rFonts w:cstheme="minorHAnsi"/>
+                <w:kern w:val="0"/>
+                <w:sz w:val="24"/>
+                <w:szCs w:val="24"/>
+              </w:rPr>
+              <w:t xml:space="preserve"> Heater resistance 33</w:t>
+            </w:r>
+            <w:r>
+              <w:rPr>
+                <w:rFonts w:eastAsia="ﾋﾎﾌ・" w:cstheme="minorHAnsi"/>
+                <w:kern w:val="0"/>
+                <w:sz w:val="24"/>
+                <w:szCs w:val="24"/>
+              </w:rPr>
+              <w:t>Ω</w:t>
+            </w:r>
+            <w:r>
+              <w:rPr>
+                <w:rFonts w:ascii="Calibri" w:eastAsia="ﾋﾎﾌ・" w:hAnsi="Calibri" w:cs="Calibri"/>
+                <w:kern w:val="0"/>
+                <w:sz w:val="24"/>
+                <w:szCs w:val="24"/>
+              </w:rPr>
+              <w:t></w:t>
+            </w:r>
+            <w:r>
+              <w:rPr>
+                <w:rFonts w:eastAsia="ﾋﾎﾌ・" w:cstheme="minorHAnsi"/>
+                <w:kern w:val="0"/>
+                <w:sz w:val="24"/>
+                <w:szCs w:val="24"/>
+              </w:rPr>
+              <w:t>}</w:t>
+            </w:r>
+            <w:r>
+              <w:rPr>
+                <w:rFonts w:cstheme="minorHAnsi"/>
+                <w:kern w:val="0"/>
+                <w:sz w:val="24"/>
+                <w:szCs w:val="24"/>
+              </w:rPr>
+              <w:t>5%</w:t>
+            </w:r>
+          </w:p>
+        </w:tc>
+        <w:tc>
+          <w:tcPr>
+            <w:tcW w:w="4144" w:type="dxa"/>
+            <w:vAlign w:val="center"/>
+          </w:tcPr>
+          <w:p>
+            <w:pPr>
+              <w:pStyle w:val="ListParagraph"/>
+              <w:ind w:left="0"/>
+              <w:jc w:val="center"/>
+              <w:rPr>
+                <w:rFonts w:cstheme="minorHAnsi"/>
+                <w:sz w:val="24"/>
+                <w:szCs w:val="24"/>
+                <w:lang w:val="en-US"/>
+              </w:rPr>
+            </w:pPr>
+            <w:r>
+              <w:rPr>
+                <w:rFonts w:cstheme="minorHAnsi"/>
+                <w:kern w:val="0"/>
+                <w:sz w:val="24"/>
+                <w:szCs w:val="24"/>
+              </w:rPr>
+              <w:t>33</w:t>
+            </w:r>
+            <w:r>
+              <w:rPr>
+                <w:rFonts w:eastAsia="ﾋﾎﾌ・" w:cstheme="minorHAnsi"/>
+                <w:kern w:val="0"/>
+                <w:sz w:val="24"/>
+                <w:szCs w:val="24"/>
+              </w:rPr>
+              <w:t>Ω</w:t>
+            </w:r>
+            <w:r>
+              <w:rPr>
+                <w:rFonts w:eastAsia="ﾋﾎﾌ・" w:cstheme="minorHAnsi"/>
+                <w:kern w:val="0"/>
+                <w:sz w:val="24"/>
+                <w:szCs w:val="24"/>
+              </w:rPr>
+              <w:t xml:space="preserve"> ±</w:t>
+            </w:r>
+            <w:r>
+              <w:rPr>
+                <w:rFonts w:cstheme="minorHAnsi"/>
+                <w:kern w:val="0"/>
+                <w:sz w:val="24"/>
+                <w:szCs w:val="24"/>
+              </w:rPr>
+              <w:t>5%</w:t>
+            </w:r>
+          </w:p>
+        </w:tc>
+      </w:tr>
+      <w:tr>
+        <w:trPr>
+          <w:jc w:val="center"/>
+        </w:trPr>
+        <w:tc>
+          <w:tcPr>
+            <w:tcW w:w="4152" w:type="dxa"/>
+            <w:vAlign w:val="center"/>
+          </w:tcPr>
+          <w:p>
+            <w:pPr>
+              <w:pStyle w:val="ListParagraph"/>
+              <w:ind w:left="0"/>
+              <w:jc w:val="center"/>
+              <w:rPr>
+                <w:rFonts w:cstheme="minorHAnsi"/>
+                <w:kern w:val="0"/>
+                <w:sz w:val="24"/>
+                <w:szCs w:val="24"/>
+              </w:rPr>
+            </w:pPr>
+            <w:r>
+              <w:rPr>
+                <w:rFonts w:cstheme="minorHAnsi"/>
+                <w:kern w:val="0"/>
+                <w:sz w:val="24"/>
+                <w:szCs w:val="24"/>
+              </w:rPr>
+              <w:t>PH</w:t>
+            </w:r>
+            <w:r>
+              <w:rPr>
+                <w:rFonts w:cstheme="minorHAnsi"/>
+                <w:kern w:val="0"/>
+                <w:sz w:val="24"/>
+                <w:szCs w:val="24"/>
+              </w:rPr>
+              <w:t>,</w:t>
+            </w:r>
+            <w:r>
+              <w:rPr>
+                <w:rFonts w:cstheme="minorHAnsi"/>
+                <w:kern w:val="0"/>
+                <w:sz w:val="24"/>
+                <w:szCs w:val="24"/>
+              </w:rPr>
+              <w:t xml:space="preserve"> Heating consumption</w:t>
+            </w:r>
+          </w:p>
+        </w:tc>
+        <w:tc>
+          <w:tcPr>
+            <w:tcW w:w="4144" w:type="dxa"/>
+            <w:vAlign w:val="center"/>
+          </w:tcPr>
+          <w:p>
+            <w:pPr>
+              <w:pStyle w:val="ListParagraph"/>
+              <w:ind w:left="0"/>
+              <w:jc w:val="center"/>
+              <w:rPr>
+                <w:rFonts w:cstheme="minorHAnsi"/>
+                <w:kern w:val="0"/>
+                <w:sz w:val="24"/>
+                <w:szCs w:val="24"/>
+              </w:rPr>
+            </w:pPr>
+            <w:r>
+              <w:rPr>
+                <w:rFonts w:cstheme="minorHAnsi"/>
+                <w:kern w:val="0"/>
+                <w:sz w:val="24"/>
+                <w:szCs w:val="24"/>
+              </w:rPr>
+              <w:t>&lt;</w:t>
+            </w:r>
+            <w:r>
+              <w:rPr>
+                <w:rFonts w:cstheme="minorHAnsi"/>
+                <w:kern w:val="0"/>
+                <w:sz w:val="24"/>
+                <w:szCs w:val="24"/>
+              </w:rPr>
+              <w:t xml:space="preserve"> </w:t>
+            </w:r>
+            <w:r>
+              <w:rPr>
+                <w:rFonts w:cstheme="minorHAnsi"/>
+                <w:kern w:val="0"/>
+                <w:sz w:val="24"/>
+                <w:szCs w:val="24"/>
+              </w:rPr>
+              <w:t>75</w:t>
+            </w:r>
+            <w:r>
+              <w:rPr>
+                <w:rFonts w:cstheme="minorHAnsi"/>
+                <w:kern w:val="0"/>
+                <w:sz w:val="24"/>
+                <w:szCs w:val="24"/>
+              </w:rPr>
+              <w:t>0mw</w:t>
+            </w:r>
+          </w:p>
+        </w:tc>
+      </w:tr>
+      <w:tr>
+        <w:trPr>
+          <w:jc w:val="center"/>
+        </w:trPr>
+        <w:tc>
+          <w:tcPr>
+            <w:tcW w:w="4152" w:type="dxa"/>
+            <w:vAlign w:val="center"/>
+          </w:tcPr>
+          <w:p>
+            <w:pPr>
+              <w:jc w:val="center"/>
+              <w:rPr>
+                <w:rFonts w:cstheme="minorHAnsi"/>
+                <w:kern w:val="0"/>
+                <w:sz w:val="24"/>
+                <w:szCs w:val="24"/>
+              </w:rPr>
+            </w:pPr>
+            <w:r>
+              <w:rPr>
+                <w:rFonts w:cstheme="minorHAnsi"/>
+                <w:kern w:val="0"/>
+                <w:sz w:val="24"/>
+                <w:szCs w:val="24"/>
+              </w:rPr>
+              <w:t>Rs, Sensing Resistance</w:t>
+            </w:r>
+          </w:p>
+        </w:tc>
+        <w:tc>
+          <w:tcPr>
+            <w:tcW w:w="4144" w:type="dxa"/>
+            <w:vAlign w:val="center"/>
+          </w:tcPr>
+          <w:p>
+            <w:pPr>
+              <w:pStyle w:val="ListParagraph"/>
+              <w:ind w:left="0"/>
+              <w:jc w:val="center"/>
+              <w:rPr>
+                <w:rFonts w:cstheme="minorHAnsi"/>
+                <w:kern w:val="0"/>
+                <w:sz w:val="24"/>
+                <w:szCs w:val="24"/>
+              </w:rPr>
+            </w:pPr>
+            <w:r>
+              <w:rPr>
+                <w:rFonts w:cstheme="minorHAnsi"/>
+                <w:kern w:val="0"/>
+                <w:sz w:val="24"/>
+                <w:szCs w:val="24"/>
+              </w:rPr>
+              <w:t>10</w:t>
+            </w:r>
+            <w:r>
+              <w:rPr>
+                <w:rFonts w:cstheme="minorHAnsi"/>
+                <w:kern w:val="0"/>
+                <w:sz w:val="24"/>
+                <w:szCs w:val="24"/>
+              </w:rPr>
+              <w:t>KΩ-</w:t>
+            </w:r>
+            <w:r>
+              <w:rPr>
+                <w:rFonts w:cstheme="minorHAnsi"/>
+                <w:kern w:val="0"/>
+                <w:sz w:val="24"/>
+                <w:szCs w:val="24"/>
+              </w:rPr>
+              <w:t>6</w:t>
+            </w:r>
+            <w:r>
+              <w:rPr>
+                <w:rFonts w:cstheme="minorHAnsi"/>
+                <w:kern w:val="0"/>
+                <w:sz w:val="24"/>
+                <w:szCs w:val="24"/>
+              </w:rPr>
+              <w:t>0KΩ</w:t>
+            </w:r>
+          </w:p>
+        </w:tc>
+      </w:tr>
+      <w:tr>
+        <w:trPr>
+          <w:jc w:val="center"/>
+        </w:trPr>
+        <w:tc>
+          <w:tcPr>
+            <w:tcW w:w="4152" w:type="dxa"/>
+            <w:vAlign w:val="center"/>
+          </w:tcPr>
+          <w:p>
+            <w:pPr>
+              <w:jc w:val="center"/>
+              <w:rPr>
+                <w:rFonts w:cstheme="minorHAnsi"/>
+                <w:kern w:val="0"/>
+                <w:sz w:val="24"/>
+                <w:szCs w:val="24"/>
+              </w:rPr>
+            </w:pPr>
+            <w:r>
+              <w:rPr>
+                <w:rFonts w:cstheme="minorHAnsi"/>
+                <w:kern w:val="0"/>
+                <w:sz w:val="24"/>
+                <w:szCs w:val="24"/>
+              </w:rPr>
+              <w:t>Rs/R0</w:t>
+            </w:r>
+          </w:p>
+        </w:tc>
+        <w:tc>
+          <w:tcPr>
+            <w:tcW w:w="4144" w:type="dxa"/>
+            <w:vAlign w:val="center"/>
+          </w:tcPr>
+          <w:p>
+            <w:pPr>
+              <w:pStyle w:val="ListParagraph"/>
+              <w:ind w:left="0"/>
+              <w:jc w:val="center"/>
+              <w:rPr>
+                <w:rFonts w:cstheme="minorHAnsi"/>
+                <w:kern w:val="0"/>
+                <w:sz w:val="24"/>
+                <w:szCs w:val="24"/>
+              </w:rPr>
+            </w:pPr>
+            <w:r>
+              <w:rPr>
+                <w:rFonts w:cstheme="minorHAnsi"/>
+                <w:kern w:val="0"/>
+                <w:sz w:val="24"/>
+                <w:szCs w:val="24"/>
+              </w:rPr>
+              <w:t>4.4</w:t>
+            </w:r>
+          </w:p>
+        </w:tc>
+      </w:tr>
+      <w:tr>
+        <w:trPr>
+          <w:jc w:val="center"/>
+        </w:trPr>
+        <w:tc>
+          <w:tcPr>
+            <w:tcW w:w="4152" w:type="dxa"/>
+            <w:vAlign w:val="center"/>
+          </w:tcPr>
+          <w:p>
+            <w:pPr>
+              <w:jc w:val="center"/>
+              <w:rPr>
+                <w:rFonts w:cstheme="minorHAnsi"/>
+                <w:kern w:val="0"/>
+                <w:sz w:val="24"/>
+                <w:szCs w:val="24"/>
+              </w:rPr>
+            </w:pPr>
+            <w:r>
+              <w:rPr>
+                <w:rFonts w:cstheme="minorHAnsi"/>
+                <w:kern w:val="0"/>
+                <w:sz w:val="24"/>
+                <w:szCs w:val="24"/>
+              </w:rPr>
+              <w:t>Interface type</w:t>
+            </w:r>
+          </w:p>
+        </w:tc>
+        <w:tc>
+          <w:tcPr>
+            <w:tcW w:w="4144" w:type="dxa"/>
+            <w:vAlign w:val="center"/>
+          </w:tcPr>
+          <w:p>
+            <w:pPr>
+              <w:pStyle w:val="ListParagraph"/>
+              <w:ind w:left="0"/>
+              <w:jc w:val="center"/>
+              <w:rPr>
+                <w:rFonts w:cstheme="minorHAnsi"/>
+                <w:kern w:val="0"/>
+                <w:sz w:val="24"/>
+                <w:szCs w:val="24"/>
+              </w:rPr>
+            </w:pPr>
+            <w:r>
+              <w:rPr>
+                <w:rFonts w:cstheme="minorHAnsi"/>
+                <w:kern w:val="0"/>
+                <w:sz w:val="24"/>
+                <w:szCs w:val="24"/>
+              </w:rPr>
+              <w:t>ADC</w:t>
+            </w:r>
+          </w:p>
+        </w:tc>
+      </w:tr>
+    </w:tbl>
+    <w:p>
+      <w:pPr>
+        <w:jc w:val="both"/>
+        <w:rPr>
+          <w:b/>
+          <w:bCs/>
+          <w:sz w:val="24"/>
+          <w:szCs w:val="24"/>
+          <w:lang w:val="en-US"/>
+        </w:rPr>
+      </w:pPr>
+    </w:p>
+    <w:p>
+      <w:pPr>
+        <w:jc w:val="both"/>
+        <w:rPr>
+          <w:b/>
+          <w:bCs/>
+          <w:sz w:val="24"/>
+          <w:szCs w:val="24"/>
+          <w:lang w:val="en-US"/>
+        </w:rPr>
+      </w:pPr>
+    </w:p>
+    <w:p>
+      <w:pPr>
+        <w:jc w:val="both"/>
+        <w:rPr>
+          <w:b/>
+          <w:bCs/>
+          <w:sz w:val="24"/>
+          <w:szCs w:val="24"/>
+          <w:lang w:val="en-US"/>
+        </w:rPr>
+      </w:pPr>
+    </w:p>
+    <w:p>
+      <w:pPr>
+        <w:jc w:val="both"/>
+        <w:rPr>
+          <w:b/>
+          <w:bCs/>
+          <w:sz w:val="24"/>
+          <w:szCs w:val="24"/>
+          <w:lang w:val="en-US"/>
+        </w:rPr>
+      </w:pPr>
+    </w:p>
+    <w:p>
+      <w:pPr>
+        <w:jc w:val="both"/>
+        <w:rPr>
+          <w:b/>
+          <w:bCs/>
+          <w:sz w:val="24"/>
+          <w:szCs w:val="24"/>
+          <w:lang w:val="en-US"/>
+        </w:rPr>
+      </w:pPr>
+    </w:p>
+    <w:p>
+      <w:pPr>
+        <w:jc w:val="both"/>
+        <w:rPr>
+          <w:b/>
+          <w:bCs/>
+          <w:sz w:val="24"/>
+          <w:szCs w:val="24"/>
+          <w:lang w:val="en-US"/>
+        </w:rPr>
+      </w:pPr>
+    </w:p>
+    <w:p>
+      <w:pPr>
+        <w:pStyle w:val="ListParagraph"/>
+        <w:numPr>
+          <w:ilvl w:val="0"/>
+          <w:numId w:val="32"/>
+        </w:numPr>
+        <w:jc w:val="both"/>
+        <w:rPr>
+          <w:b/>
+          <w:bCs/>
+          <w:sz w:val="24"/>
+          <w:szCs w:val="24"/>
+          <w:lang w:val="en-US"/>
+        </w:rPr>
+      </w:pPr>
+      <w:r>
+        <w:rPr>
+          <w:b/>
+          <w:bCs/>
+          <w:sz w:val="24"/>
+          <w:szCs w:val="24"/>
+          <w:lang w:val="en-US"/>
+        </w:rPr>
+        <w:t>MQ7- Carbon Monoxide sensor</w:t>
+      </w:r>
+    </w:p>
+    <w:tbl>
+      <w:tblPr>
+        <w:tblStyle w:val="TableGrid"/>
+        <w:tblW w:w="0" w:type="auto"/>
+        <w:jc w:val="center"/>
+        <w:tblLook w:val="04A0" w:firstRow="1" w:lastRow="0" w:firstColumn="1" w:lastColumn="0" w:noHBand="0" w:noVBand="1"/>
+      </w:tblPr>
+      <w:tblGrid>
+        <w:gridCol w:w="4152"/>
+        <w:gridCol w:w="4144"/>
+      </w:tblGrid>
+      <w:tr>
+        <w:trPr>
+          <w:trHeight w:val="532"/>
+          <w:jc w:val="center"/>
+        </w:trPr>
+        <w:tc>
+          <w:tcPr>
+            <w:tcW w:w="4152" w:type="dxa"/>
+            <w:vAlign w:val="center"/>
+          </w:tcPr>
+          <w:p>
+            <w:pPr>
+              <w:pStyle w:val="ListParagraph"/>
+              <w:ind w:left="0"/>
+              <w:jc w:val="center"/>
+              <w:rPr>
+                <w:b/>
+                <w:bCs/>
+                <w:sz w:val="24"/>
+                <w:szCs w:val="24"/>
+                <w:lang w:val="en-US"/>
+              </w:rPr>
+            </w:pPr>
+            <w:r>
+              <w:rPr>
+                <w:b/>
+                <w:bCs/>
+                <w:sz w:val="24"/>
+                <w:szCs w:val="24"/>
+                <w:lang w:val="en-US"/>
+              </w:rPr>
+              <w:t>Parameter</w:t>
+            </w:r>
+          </w:p>
+        </w:tc>
+        <w:tc>
+          <w:tcPr>
+            <w:tcW w:w="4144" w:type="dxa"/>
+            <w:vAlign w:val="center"/>
+          </w:tcPr>
+          <w:p>
+            <w:pPr>
+              <w:pStyle w:val="ListParagraph"/>
+              <w:ind w:left="0"/>
+              <w:jc w:val="center"/>
+              <w:rPr>
+                <w:b/>
+                <w:bCs/>
+                <w:sz w:val="24"/>
+                <w:szCs w:val="24"/>
+                <w:lang w:val="en-US"/>
+              </w:rPr>
+            </w:pPr>
+            <w:r>
+              <w:rPr>
+                <w:b/>
+                <w:bCs/>
+                <w:sz w:val="24"/>
+                <w:szCs w:val="24"/>
+                <w:lang w:val="en-US"/>
+              </w:rPr>
+              <w:t>Values</w:t>
+            </w:r>
+          </w:p>
+        </w:tc>
+      </w:tr>
+      <w:tr>
+        <w:trPr>
+          <w:jc w:val="center"/>
+        </w:trPr>
+        <w:tc>
+          <w:tcPr>
+            <w:tcW w:w="4152" w:type="dxa"/>
+            <w:vAlign w:val="center"/>
+          </w:tcPr>
+          <w:p>
+            <w:pPr>
+              <w:pStyle w:val="ListParagraph"/>
+              <w:ind w:left="0"/>
+              <w:jc w:val="center"/>
+              <w:rPr>
+                <w:sz w:val="24"/>
+                <w:szCs w:val="24"/>
+                <w:lang w:val="en-US"/>
+              </w:rPr>
+            </w:pPr>
+            <w:r>
+              <w:rPr>
+                <w:sz w:val="24"/>
+                <w:szCs w:val="24"/>
+                <w:lang w:val="en-US"/>
+              </w:rPr>
+              <w:t>Detectable gases</w:t>
+            </w:r>
+          </w:p>
+        </w:tc>
+        <w:tc>
+          <w:tcPr>
+            <w:tcW w:w="4144" w:type="dxa"/>
+            <w:vAlign w:val="center"/>
+          </w:tcPr>
+          <w:p>
+            <w:pPr>
+              <w:pStyle w:val="ListParagraph"/>
+              <w:ind w:left="0"/>
+              <w:jc w:val="center"/>
+              <w:rPr>
+                <w:sz w:val="24"/>
+                <w:szCs w:val="24"/>
+                <w:lang w:val="en-US"/>
+              </w:rPr>
+            </w:pPr>
+            <w:r>
+              <w:rPr>
+                <w:sz w:val="24"/>
+                <w:szCs w:val="24"/>
+                <w:lang w:val="en-US"/>
+              </w:rPr>
+              <w:t>Methane, natural gas,LNG</w:t>
+            </w:r>
+          </w:p>
+        </w:tc>
+      </w:tr>
+      <w:tr>
+        <w:trPr>
+          <w:jc w:val="center"/>
+        </w:trPr>
+        <w:tc>
+          <w:tcPr>
+            <w:tcW w:w="4152" w:type="dxa"/>
+            <w:vAlign w:val="center"/>
+          </w:tcPr>
+          <w:p>
+            <w:pPr>
+              <w:pStyle w:val="ListParagraph"/>
+              <w:ind w:left="0"/>
+              <w:jc w:val="center"/>
+              <w:rPr>
+                <w:sz w:val="24"/>
+                <w:szCs w:val="24"/>
+                <w:lang w:val="en-US"/>
+              </w:rPr>
+            </w:pPr>
+            <w:r>
+              <w:rPr>
+                <w:sz w:val="24"/>
+                <w:szCs w:val="24"/>
+              </w:rPr>
+              <w:t>Vc</w:t>
+            </w:r>
+            <w:r>
+              <w:rPr>
+                <w:sz w:val="24"/>
+                <w:szCs w:val="24"/>
+              </w:rPr>
+              <w:t>,</w:t>
+            </w:r>
+            <w:r>
+              <w:rPr>
+                <w:sz w:val="24"/>
+                <w:szCs w:val="24"/>
+              </w:rPr>
+              <w:t xml:space="preserve"> Circuit voltage</w:t>
+            </w:r>
+          </w:p>
+        </w:tc>
+        <w:tc>
+          <w:tcPr>
+            <w:tcW w:w="4144" w:type="dxa"/>
+            <w:vAlign w:val="center"/>
+          </w:tcPr>
+          <w:p>
+            <w:pPr>
+              <w:pStyle w:val="ListParagraph"/>
+              <w:ind w:left="0"/>
+              <w:jc w:val="center"/>
+              <w:rPr>
+                <w:sz w:val="24"/>
+                <w:szCs w:val="24"/>
+                <w:lang w:val="en-US"/>
+              </w:rPr>
+            </w:pPr>
+            <w:r>
+              <w:rPr>
+                <w:sz w:val="24"/>
+                <w:szCs w:val="24"/>
+              </w:rPr>
+              <w:t>5V±0.1 AC OR DC</w:t>
+            </w:r>
+          </w:p>
+        </w:tc>
+      </w:tr>
+      <w:tr>
+        <w:trPr>
+          <w:jc w:val="center"/>
+        </w:trPr>
+        <w:tc>
+          <w:tcPr>
+            <w:tcW w:w="4152" w:type="dxa"/>
+            <w:vAlign w:val="center"/>
+          </w:tcPr>
+          <w:p>
+            <w:pPr>
+              <w:pStyle w:val="ListParagraph"/>
+              <w:ind w:left="0"/>
+              <w:jc w:val="center"/>
+              <w:rPr>
+                <w:sz w:val="24"/>
+                <w:szCs w:val="24"/>
+                <w:lang w:val="en-US"/>
+              </w:rPr>
+            </w:pPr>
+            <w:r>
+              <w:rPr>
+                <w:sz w:val="24"/>
+                <w:szCs w:val="24"/>
+              </w:rPr>
+              <w:t>VH</w:t>
+            </w:r>
+            <w:r>
+              <w:rPr>
+                <w:sz w:val="24"/>
+                <w:szCs w:val="24"/>
+              </w:rPr>
+              <w:t xml:space="preserve"> (H), </w:t>
+            </w:r>
+            <w:r>
+              <w:rPr>
+                <w:sz w:val="24"/>
+                <w:szCs w:val="24"/>
+              </w:rPr>
+              <w:t>Heating voltage</w:t>
+            </w:r>
+            <w:r>
+              <w:rPr>
+                <w:sz w:val="24"/>
+                <w:szCs w:val="24"/>
+              </w:rPr>
+              <w:t xml:space="preserve"> high</w:t>
+            </w:r>
+          </w:p>
+        </w:tc>
+        <w:tc>
+          <w:tcPr>
+            <w:tcW w:w="4144" w:type="dxa"/>
+            <w:vAlign w:val="center"/>
+          </w:tcPr>
+          <w:p>
+            <w:pPr>
+              <w:pStyle w:val="ListParagraph"/>
+              <w:ind w:left="0"/>
+              <w:jc w:val="center"/>
+              <w:rPr>
+                <w:sz w:val="24"/>
+                <w:szCs w:val="24"/>
+                <w:lang w:val="en-US"/>
+              </w:rPr>
+            </w:pPr>
+            <w:r>
+              <w:rPr>
+                <w:sz w:val="24"/>
+                <w:szCs w:val="24"/>
+              </w:rPr>
+              <w:t>5V±0.1 AC OR DC</w:t>
+            </w:r>
+          </w:p>
+        </w:tc>
+      </w:tr>
+      <w:tr>
+        <w:trPr>
+          <w:jc w:val="center"/>
+        </w:trPr>
+        <w:tc>
+          <w:tcPr>
+            <w:tcW w:w="4152" w:type="dxa"/>
+            <w:vAlign w:val="center"/>
+          </w:tcPr>
+          <w:p>
+            <w:pPr>
+              <w:pStyle w:val="ListParagraph"/>
+              <w:ind w:left="0"/>
+              <w:jc w:val="center"/>
+              <w:rPr>
+                <w:sz w:val="24"/>
+                <w:szCs w:val="24"/>
+              </w:rPr>
+            </w:pPr>
+            <w:r>
+              <w:rPr>
+                <w:sz w:val="24"/>
+                <w:szCs w:val="24"/>
+              </w:rPr>
+              <w:t>VH</w:t>
+            </w:r>
+            <w:r>
+              <w:rPr>
+                <w:sz w:val="24"/>
+                <w:szCs w:val="24"/>
+              </w:rPr>
+              <w:t xml:space="preserve"> (L), </w:t>
+            </w:r>
+            <w:r>
+              <w:rPr>
+                <w:sz w:val="24"/>
+                <w:szCs w:val="24"/>
+              </w:rPr>
+              <w:t>Heating voltage</w:t>
+            </w:r>
+            <w:r>
+              <w:rPr>
+                <w:sz w:val="24"/>
+                <w:szCs w:val="24"/>
+              </w:rPr>
+              <w:t xml:space="preserve"> low</w:t>
+            </w:r>
+          </w:p>
+        </w:tc>
+        <w:tc>
+          <w:tcPr>
+            <w:tcW w:w="4144" w:type="dxa"/>
+            <w:vAlign w:val="center"/>
+          </w:tcPr>
+          <w:p>
+            <w:pPr>
+              <w:pStyle w:val="ListParagraph"/>
+              <w:ind w:left="0"/>
+              <w:jc w:val="center"/>
+              <w:rPr>
+                <w:sz w:val="24"/>
+                <w:szCs w:val="24"/>
+              </w:rPr>
+            </w:pPr>
+            <w:r>
+              <w:rPr>
+                <w:sz w:val="24"/>
+                <w:szCs w:val="24"/>
+              </w:rPr>
+              <w:t>1.4</w:t>
+            </w:r>
+            <w:r>
+              <w:rPr>
+                <w:sz w:val="24"/>
+                <w:szCs w:val="24"/>
+              </w:rPr>
+              <w:t>V±0.1 AC OR DC</w:t>
+            </w:r>
+          </w:p>
+        </w:tc>
+      </w:tr>
+      <w:tr>
+        <w:trPr>
+          <w:jc w:val="center"/>
+        </w:trPr>
+        <w:tc>
+          <w:tcPr>
+            <w:tcW w:w="4152" w:type="dxa"/>
+            <w:vAlign w:val="center"/>
+          </w:tcPr>
+          <w:p>
+            <w:pPr>
+              <w:pStyle w:val="ListParagraph"/>
+              <w:ind w:left="0"/>
+              <w:jc w:val="center"/>
+              <w:rPr>
+                <w:rFonts w:cstheme="minorHAnsi"/>
+                <w:sz w:val="24"/>
+                <w:szCs w:val="24"/>
+                <w:lang w:val="en-US"/>
+              </w:rPr>
+            </w:pPr>
+            <w:r>
+              <w:rPr>
+                <w:rFonts w:cstheme="minorHAnsi"/>
+                <w:kern w:val="0"/>
+                <w:sz w:val="24"/>
+                <w:szCs w:val="24"/>
+              </w:rPr>
+              <w:t>RL</w:t>
+            </w:r>
+            <w:r>
+              <w:rPr>
+                <w:rFonts w:cstheme="minorHAnsi"/>
+                <w:kern w:val="0"/>
+                <w:sz w:val="24"/>
+                <w:szCs w:val="24"/>
+              </w:rPr>
+              <w:t>,</w:t>
+            </w:r>
+            <w:r>
+              <w:rPr>
+                <w:rFonts w:cstheme="minorHAnsi"/>
+                <w:kern w:val="0"/>
+                <w:sz w:val="24"/>
+                <w:szCs w:val="24"/>
+              </w:rPr>
+              <w:t xml:space="preserve"> Load resistance can adjust</w:t>
+            </w:r>
+          </w:p>
+        </w:tc>
+        <w:tc>
+          <w:tcPr>
+            <w:tcW w:w="4144" w:type="dxa"/>
+            <w:vAlign w:val="center"/>
+          </w:tcPr>
+          <w:p>
+            <w:pPr>
+              <w:pStyle w:val="ListParagraph"/>
+              <w:ind w:left="0"/>
+              <w:jc w:val="center"/>
+              <w:rPr>
+                <w:rFonts w:cstheme="minorHAnsi"/>
+                <w:sz w:val="24"/>
+                <w:szCs w:val="24"/>
+                <w:lang w:val="en-US"/>
+              </w:rPr>
+            </w:pPr>
+            <w:r>
+              <w:rPr>
+                <w:rFonts w:cstheme="minorHAnsi"/>
+                <w:kern w:val="0"/>
+                <w:sz w:val="24"/>
+                <w:szCs w:val="24"/>
+              </w:rPr>
+              <w:t>20K</w:t>
+            </w:r>
+            <w:r>
+              <w:rPr>
+                <w:rFonts w:eastAsia="ﾋﾎﾌ・" w:cstheme="minorHAnsi"/>
+                <w:kern w:val="0"/>
+                <w:sz w:val="24"/>
+                <w:szCs w:val="24"/>
+              </w:rPr>
+              <w:t xml:space="preserve"> Ω</w:t>
+            </w:r>
+            <w:r>
+              <w:rPr>
+                <w:rFonts w:eastAsia="ﾋﾎﾌ・" w:cstheme="minorHAnsi"/>
+                <w:kern w:val="0"/>
+                <w:sz w:val="24"/>
+                <w:szCs w:val="24"/>
+              </w:rPr>
+              <w:t xml:space="preserve"> (typical) </w:t>
+            </w:r>
+          </w:p>
+        </w:tc>
+      </w:tr>
+      <w:tr>
+        <w:trPr>
+          <w:jc w:val="center"/>
+        </w:trPr>
+        <w:tc>
+          <w:tcPr>
+            <w:tcW w:w="4152" w:type="dxa"/>
+            <w:vAlign w:val="center"/>
+          </w:tcPr>
+          <w:p>
+            <w:pPr>
+              <w:pStyle w:val="ListParagraph"/>
+              <w:ind w:left="0"/>
+              <w:jc w:val="center"/>
+              <w:rPr>
+                <w:rFonts w:cstheme="minorHAnsi"/>
+                <w:sz w:val="24"/>
+                <w:szCs w:val="24"/>
+                <w:lang w:val="en-US"/>
+              </w:rPr>
+            </w:pPr>
+            <w:r>
+              <w:rPr>
+                <w:rFonts w:cstheme="minorHAnsi"/>
+                <w:kern w:val="0"/>
+                <w:sz w:val="24"/>
+                <w:szCs w:val="24"/>
+              </w:rPr>
+              <w:t>RH</w:t>
+            </w:r>
+            <w:r>
+              <w:rPr>
+                <w:rFonts w:cstheme="minorHAnsi"/>
+                <w:kern w:val="0"/>
+                <w:sz w:val="24"/>
+                <w:szCs w:val="24"/>
+              </w:rPr>
+              <w:t>,</w:t>
+            </w:r>
+            <w:r>
+              <w:rPr>
+                <w:rFonts w:cstheme="minorHAnsi"/>
+                <w:kern w:val="0"/>
+                <w:sz w:val="24"/>
+                <w:szCs w:val="24"/>
+              </w:rPr>
+              <w:t xml:space="preserve"> Heater resistance 33</w:t>
+            </w:r>
+            <w:r>
+              <w:rPr>
+                <w:rFonts w:eastAsia="ﾋﾎﾌ・" w:cstheme="minorHAnsi"/>
+                <w:kern w:val="0"/>
+                <w:sz w:val="24"/>
+                <w:szCs w:val="24"/>
+              </w:rPr>
+              <w:t>Ω</w:t>
+            </w:r>
+            <w:r>
+              <w:rPr>
+                <w:rFonts w:ascii="Calibri" w:eastAsia="ﾋﾎﾌ・" w:hAnsi="Calibri" w:cs="Calibri"/>
+                <w:kern w:val="0"/>
+                <w:sz w:val="24"/>
+                <w:szCs w:val="24"/>
+              </w:rPr>
+              <w:t></w:t>
+            </w:r>
+            <w:r>
+              <w:rPr>
+                <w:rFonts w:eastAsia="ﾋﾎﾌ・" w:cstheme="minorHAnsi"/>
+                <w:kern w:val="0"/>
+                <w:sz w:val="24"/>
+                <w:szCs w:val="24"/>
+              </w:rPr>
+              <w:t>}</w:t>
+            </w:r>
+            <w:r>
+              <w:rPr>
+                <w:rFonts w:cstheme="minorHAnsi"/>
+                <w:kern w:val="0"/>
+                <w:sz w:val="24"/>
+                <w:szCs w:val="24"/>
+              </w:rPr>
+              <w:t>5%</w:t>
+            </w:r>
+          </w:p>
+        </w:tc>
+        <w:tc>
+          <w:tcPr>
+            <w:tcW w:w="4144" w:type="dxa"/>
+            <w:vAlign w:val="center"/>
+          </w:tcPr>
+          <w:p>
+            <w:pPr>
+              <w:pStyle w:val="ListParagraph"/>
+              <w:ind w:left="0"/>
+              <w:jc w:val="center"/>
+              <w:rPr>
+                <w:rFonts w:cstheme="minorHAnsi"/>
+                <w:sz w:val="24"/>
+                <w:szCs w:val="24"/>
+                <w:lang w:val="en-US"/>
+              </w:rPr>
+            </w:pPr>
+            <w:r>
+              <w:rPr>
+                <w:rFonts w:cstheme="minorHAnsi"/>
+                <w:kern w:val="0"/>
+                <w:sz w:val="24"/>
+                <w:szCs w:val="24"/>
+              </w:rPr>
+              <w:t>33</w:t>
+            </w:r>
+            <w:r>
+              <w:rPr>
+                <w:rFonts w:eastAsia="ﾋﾎﾌ・" w:cstheme="minorHAnsi"/>
+                <w:kern w:val="0"/>
+                <w:sz w:val="24"/>
+                <w:szCs w:val="24"/>
+              </w:rPr>
+              <w:t>Ω</w:t>
+            </w:r>
+            <w:r>
+              <w:rPr>
+                <w:rFonts w:eastAsia="ﾋﾎﾌ・" w:cstheme="minorHAnsi"/>
+                <w:kern w:val="0"/>
+                <w:sz w:val="24"/>
+                <w:szCs w:val="24"/>
+              </w:rPr>
+              <w:t xml:space="preserve"> ±</w:t>
+            </w:r>
+            <w:r>
+              <w:rPr>
+                <w:rFonts w:cstheme="minorHAnsi"/>
+                <w:kern w:val="0"/>
+                <w:sz w:val="24"/>
+                <w:szCs w:val="24"/>
+              </w:rPr>
+              <w:t>5%</w:t>
+            </w:r>
+          </w:p>
+        </w:tc>
+      </w:tr>
+      <w:tr>
+        <w:trPr>
+          <w:jc w:val="center"/>
+        </w:trPr>
+        <w:tc>
+          <w:tcPr>
+            <w:tcW w:w="4152" w:type="dxa"/>
+          </w:tcPr>
+          <w:p>
+            <w:pPr>
+              <w:pStyle w:val="ListParagraph"/>
+              <w:ind w:left="0"/>
+              <w:rPr>
+                <w:rFonts w:cstheme="minorHAnsi"/>
+                <w:kern w:val="0"/>
+                <w:sz w:val="24"/>
+                <w:szCs w:val="24"/>
+              </w:rPr>
+            </w:pPr>
+            <w:r>
+              <w:rPr>
+                <w:rFonts w:ascii="Times New Roman" w:hAnsi="Times New Roman" w:cs="Times New Roman"/>
+                <w:kern w:val="0"/>
+                <w:sz w:val="21"/>
+                <w:szCs w:val="21"/>
+              </w:rPr>
+              <w:t>T</w:t>
+            </w:r>
+            <w:r>
+              <w:rPr>
+                <w:rFonts w:ascii="Times New Roman" w:hAnsi="Times New Roman" w:cs="Times New Roman"/>
+                <w:kern w:val="0"/>
+                <w:sz w:val="15"/>
+                <w:szCs w:val="15"/>
+              </w:rPr>
+              <w:t xml:space="preserve">H (H) </w:t>
+            </w:r>
+            <w:r>
+              <w:rPr>
+                <w:rFonts w:ascii="Times New Roman" w:hAnsi="Times New Roman" w:cs="Times New Roman"/>
+                <w:kern w:val="0"/>
+                <w:sz w:val="21"/>
+                <w:szCs w:val="21"/>
+              </w:rPr>
+              <w:t xml:space="preserve">Heating time (high) </w:t>
+            </w:r>
+          </w:p>
+        </w:tc>
+        <w:tc>
+          <w:tcPr>
+            <w:tcW w:w="4144" w:type="dxa"/>
+          </w:tcPr>
+          <w:p>
+            <w:pPr>
+              <w:pStyle w:val="ListParagraph"/>
+              <w:ind w:left="0"/>
+              <w:jc w:val="center"/>
+              <w:rPr>
+                <w:rFonts w:cstheme="minorHAnsi"/>
+                <w:kern w:val="0"/>
+                <w:sz w:val="24"/>
+                <w:szCs w:val="24"/>
+              </w:rPr>
+            </w:pPr>
+            <w:r>
+              <w:rPr>
+                <w:rFonts w:ascii="Times New Roman" w:hAnsi="Times New Roman" w:cs="Times New Roman"/>
+                <w:kern w:val="0"/>
+                <w:sz w:val="21"/>
+                <w:szCs w:val="21"/>
+              </w:rPr>
+              <w:t xml:space="preserve"> 60</w:t>
+            </w:r>
+            <w:r>
+              <w:rPr>
+                <w:rFonts w:ascii="Times New Roman" w:hAnsi="Times New Roman" w:cs="Times New Roman"/>
+                <w:kern w:val="0"/>
+                <w:sz w:val="21"/>
+                <w:szCs w:val="21"/>
+              </w:rPr>
+              <w:t xml:space="preserve"> ±</w:t>
+            </w:r>
+            <w:r>
+              <w:rPr>
+                <w:rFonts w:ascii="Times New Roman" w:hAnsi="Times New Roman" w:cs="Times New Roman"/>
+                <w:kern w:val="0"/>
+                <w:sz w:val="21"/>
+                <w:szCs w:val="21"/>
+              </w:rPr>
+              <w:t>1 seconds</w:t>
+            </w:r>
+          </w:p>
+        </w:tc>
+      </w:tr>
+      <w:tr>
+        <w:trPr>
+          <w:jc w:val="center"/>
+        </w:trPr>
+        <w:tc>
+          <w:tcPr>
+            <w:tcW w:w="4152" w:type="dxa"/>
+          </w:tcPr>
+          <w:p>
+            <w:pPr>
+              <w:pStyle w:val="ListParagraph"/>
+              <w:ind w:left="0"/>
+              <w:rPr>
+                <w:rFonts w:cstheme="minorHAnsi"/>
+                <w:kern w:val="0"/>
+                <w:sz w:val="24"/>
+                <w:szCs w:val="24"/>
+              </w:rPr>
+            </w:pPr>
+            <w:r>
+              <w:rPr>
+                <w:rFonts w:ascii="Times New Roman" w:hAnsi="Times New Roman" w:cs="Times New Roman"/>
+                <w:kern w:val="0"/>
+                <w:sz w:val="21"/>
+                <w:szCs w:val="21"/>
+              </w:rPr>
+              <w:t>T</w:t>
+            </w:r>
+            <w:r>
+              <w:rPr>
+                <w:rFonts w:ascii="Times New Roman" w:hAnsi="Times New Roman" w:cs="Times New Roman"/>
+                <w:kern w:val="0"/>
+                <w:sz w:val="15"/>
+                <w:szCs w:val="15"/>
+              </w:rPr>
+              <w:t>H (</w:t>
+            </w:r>
+            <w:r>
+              <w:rPr>
+                <w:rFonts w:ascii="Times New Roman" w:hAnsi="Times New Roman" w:cs="Times New Roman"/>
+                <w:kern w:val="0"/>
+                <w:sz w:val="15"/>
+                <w:szCs w:val="15"/>
+              </w:rPr>
+              <w:t>L</w:t>
+            </w:r>
+            <w:r>
+              <w:rPr>
+                <w:rFonts w:ascii="Times New Roman" w:hAnsi="Times New Roman" w:cs="Times New Roman"/>
+                <w:kern w:val="0"/>
+                <w:sz w:val="15"/>
+                <w:szCs w:val="15"/>
+              </w:rPr>
+              <w:t xml:space="preserve">) </w:t>
+            </w:r>
+            <w:r>
+              <w:rPr>
+                <w:rFonts w:ascii="Times New Roman" w:hAnsi="Times New Roman" w:cs="Times New Roman"/>
+                <w:kern w:val="0"/>
+                <w:sz w:val="21"/>
+                <w:szCs w:val="21"/>
+              </w:rPr>
+              <w:t>Heating time (</w:t>
+            </w:r>
+            <w:r>
+              <w:rPr>
+                <w:rFonts w:ascii="Times New Roman" w:hAnsi="Times New Roman" w:cs="Times New Roman"/>
+                <w:kern w:val="0"/>
+                <w:sz w:val="21"/>
+                <w:szCs w:val="21"/>
+              </w:rPr>
+              <w:t>low</w:t>
+            </w:r>
+            <w:r>
+              <w:rPr>
+                <w:rFonts w:ascii="Times New Roman" w:hAnsi="Times New Roman" w:cs="Times New Roman"/>
+                <w:kern w:val="0"/>
+                <w:sz w:val="21"/>
+                <w:szCs w:val="21"/>
+              </w:rPr>
+              <w:t xml:space="preserve">) </w:t>
+            </w:r>
+          </w:p>
+        </w:tc>
+        <w:tc>
+          <w:tcPr>
+            <w:tcW w:w="4144" w:type="dxa"/>
+          </w:tcPr>
+          <w:p>
+            <w:pPr>
+              <w:pStyle w:val="ListParagraph"/>
+              <w:ind w:left="0"/>
+              <w:jc w:val="center"/>
+              <w:rPr>
+                <w:rFonts w:cstheme="minorHAnsi"/>
+                <w:kern w:val="0"/>
+                <w:sz w:val="24"/>
+                <w:szCs w:val="24"/>
+              </w:rPr>
+            </w:pPr>
+            <w:r>
+              <w:rPr>
+                <w:rFonts w:ascii="Times New Roman" w:hAnsi="Times New Roman" w:cs="Times New Roman"/>
+                <w:kern w:val="0"/>
+                <w:sz w:val="21"/>
+                <w:szCs w:val="21"/>
+              </w:rPr>
+              <w:t xml:space="preserve"> </w:t>
+            </w:r>
+            <w:r>
+              <w:rPr>
+                <w:rFonts w:ascii="Times New Roman" w:hAnsi="Times New Roman" w:cs="Times New Roman"/>
+                <w:kern w:val="0"/>
+                <w:sz w:val="21"/>
+                <w:szCs w:val="21"/>
+              </w:rPr>
+              <w:t>9</w:t>
+            </w:r>
+            <w:r>
+              <w:rPr>
+                <w:rFonts w:ascii="Times New Roman" w:hAnsi="Times New Roman" w:cs="Times New Roman"/>
+                <w:kern w:val="0"/>
+                <w:sz w:val="21"/>
+                <w:szCs w:val="21"/>
+              </w:rPr>
+              <w:t>0</w:t>
+            </w:r>
+            <w:r>
+              <w:rPr>
+                <w:rFonts w:ascii="Times New Roman" w:hAnsi="Times New Roman" w:cs="Times New Roman"/>
+                <w:kern w:val="0"/>
+                <w:sz w:val="21"/>
+                <w:szCs w:val="21"/>
+              </w:rPr>
+              <w:t>±</w:t>
+            </w:r>
+            <w:r>
+              <w:rPr>
+                <w:rFonts w:ascii="Times New Roman" w:hAnsi="Times New Roman" w:cs="Times New Roman"/>
+                <w:kern w:val="0"/>
+                <w:sz w:val="21"/>
+                <w:szCs w:val="21"/>
+              </w:rPr>
+              <w:t>1 seconds</w:t>
+            </w:r>
+          </w:p>
+        </w:tc>
+      </w:tr>
+      <w:tr>
+        <w:trPr>
+          <w:jc w:val="center"/>
+        </w:trPr>
+        <w:tc>
+          <w:tcPr>
+            <w:tcW w:w="4152" w:type="dxa"/>
+            <w:vAlign w:val="center"/>
+          </w:tcPr>
+          <w:p>
+            <w:pPr>
+              <w:pStyle w:val="ListParagraph"/>
+              <w:ind w:left="0"/>
+              <w:jc w:val="center"/>
+              <w:rPr>
+                <w:rFonts w:cstheme="minorHAnsi"/>
+                <w:kern w:val="0"/>
+                <w:sz w:val="24"/>
+                <w:szCs w:val="24"/>
+              </w:rPr>
+            </w:pPr>
+            <w:r>
+              <w:rPr>
+                <w:rFonts w:cstheme="minorHAnsi"/>
+                <w:kern w:val="0"/>
+                <w:sz w:val="24"/>
+                <w:szCs w:val="24"/>
+              </w:rPr>
+              <w:t>PH</w:t>
+            </w:r>
+            <w:r>
+              <w:rPr>
+                <w:rFonts w:cstheme="minorHAnsi"/>
+                <w:kern w:val="0"/>
+                <w:sz w:val="24"/>
+                <w:szCs w:val="24"/>
+              </w:rPr>
+              <w:t>,</w:t>
+            </w:r>
+            <w:r>
+              <w:rPr>
+                <w:rFonts w:cstheme="minorHAnsi"/>
+                <w:kern w:val="0"/>
+                <w:sz w:val="24"/>
+                <w:szCs w:val="24"/>
+              </w:rPr>
+              <w:t xml:space="preserve"> Heating consumption</w:t>
+            </w:r>
+          </w:p>
+        </w:tc>
+        <w:tc>
+          <w:tcPr>
+            <w:tcW w:w="4144" w:type="dxa"/>
+            <w:vAlign w:val="center"/>
+          </w:tcPr>
+          <w:p>
+            <w:pPr>
+              <w:pStyle w:val="ListParagraph"/>
+              <w:ind w:left="0"/>
+              <w:jc w:val="center"/>
+              <w:rPr>
+                <w:rFonts w:cstheme="minorHAnsi"/>
+                <w:kern w:val="0"/>
+                <w:sz w:val="24"/>
+                <w:szCs w:val="24"/>
+              </w:rPr>
+            </w:pPr>
+            <w:r>
+              <w:rPr>
+                <w:rFonts w:cstheme="minorHAnsi"/>
+                <w:kern w:val="0"/>
+                <w:sz w:val="24"/>
+                <w:szCs w:val="24"/>
+              </w:rPr>
+              <w:t>&lt;</w:t>
+            </w:r>
+            <w:r>
+              <w:rPr>
+                <w:rFonts w:cstheme="minorHAnsi"/>
+                <w:kern w:val="0"/>
+                <w:sz w:val="24"/>
+                <w:szCs w:val="24"/>
+              </w:rPr>
+              <w:t xml:space="preserve"> </w:t>
+            </w:r>
+            <w:r>
+              <w:rPr>
+                <w:rFonts w:cstheme="minorHAnsi"/>
+                <w:kern w:val="0"/>
+                <w:sz w:val="24"/>
+                <w:szCs w:val="24"/>
+              </w:rPr>
+              <w:t>35</w:t>
+            </w:r>
+            <w:r>
+              <w:rPr>
+                <w:rFonts w:cstheme="minorHAnsi"/>
+                <w:kern w:val="0"/>
+                <w:sz w:val="24"/>
+                <w:szCs w:val="24"/>
+              </w:rPr>
+              <w:t>0mw</w:t>
+            </w:r>
+          </w:p>
+        </w:tc>
+      </w:tr>
+      <w:tr>
+        <w:trPr>
+          <w:jc w:val="center"/>
+        </w:trPr>
+        <w:tc>
+          <w:tcPr>
+            <w:tcW w:w="4152" w:type="dxa"/>
+            <w:vAlign w:val="center"/>
+          </w:tcPr>
+          <w:p>
+            <w:pPr>
+              <w:jc w:val="center"/>
+              <w:rPr>
+                <w:rFonts w:cstheme="minorHAnsi"/>
+                <w:kern w:val="0"/>
+                <w:sz w:val="24"/>
+                <w:szCs w:val="24"/>
+              </w:rPr>
+            </w:pPr>
+            <w:r>
+              <w:rPr>
+                <w:rFonts w:cstheme="minorHAnsi"/>
+                <w:kern w:val="0"/>
+                <w:sz w:val="24"/>
+                <w:szCs w:val="24"/>
+              </w:rPr>
+              <w:t>Rs, Sensing Resistance</w:t>
+            </w:r>
+          </w:p>
+        </w:tc>
+        <w:tc>
+          <w:tcPr>
+            <w:tcW w:w="4144" w:type="dxa"/>
+            <w:vAlign w:val="center"/>
+          </w:tcPr>
+          <w:p>
+            <w:pPr>
+              <w:pStyle w:val="ListParagraph"/>
+              <w:ind w:left="0"/>
+              <w:jc w:val="center"/>
+              <w:rPr>
+                <w:rFonts w:cstheme="minorHAnsi"/>
+                <w:kern w:val="0"/>
+                <w:sz w:val="24"/>
+                <w:szCs w:val="24"/>
+              </w:rPr>
+            </w:pPr>
+            <w:r>
+              <w:rPr>
+                <w:rFonts w:cstheme="minorHAnsi"/>
+                <w:kern w:val="0"/>
+                <w:sz w:val="24"/>
+                <w:szCs w:val="24"/>
+              </w:rPr>
+              <w:t>2</w:t>
+            </w:r>
+            <w:r>
+              <w:rPr>
+                <w:rFonts w:cstheme="minorHAnsi"/>
+                <w:kern w:val="0"/>
+                <w:sz w:val="24"/>
+                <w:szCs w:val="24"/>
+              </w:rPr>
+              <w:t>KΩ-</w:t>
+            </w:r>
+            <w:r>
+              <w:rPr>
+                <w:rFonts w:cstheme="minorHAnsi"/>
+                <w:kern w:val="0"/>
+                <w:sz w:val="24"/>
+                <w:szCs w:val="24"/>
+              </w:rPr>
+              <w:t>2</w:t>
+            </w:r>
+            <w:r>
+              <w:rPr>
+                <w:rFonts w:cstheme="minorHAnsi"/>
+                <w:kern w:val="0"/>
+                <w:sz w:val="24"/>
+                <w:szCs w:val="24"/>
+              </w:rPr>
+              <w:t>0KΩ</w:t>
+            </w:r>
+          </w:p>
+        </w:tc>
+      </w:tr>
+      <w:tr>
+        <w:trPr>
+          <w:jc w:val="center"/>
+        </w:trPr>
+        <w:tc>
+          <w:tcPr>
+            <w:tcW w:w="4152" w:type="dxa"/>
+            <w:vAlign w:val="center"/>
+          </w:tcPr>
+          <w:p>
+            <w:pPr>
+              <w:jc w:val="center"/>
+              <w:rPr>
+                <w:rFonts w:cstheme="minorHAnsi"/>
+                <w:kern w:val="0"/>
+                <w:sz w:val="24"/>
+                <w:szCs w:val="24"/>
+              </w:rPr>
+            </w:pPr>
+            <w:r>
+              <w:rPr>
+                <w:rFonts w:cstheme="minorHAnsi"/>
+                <w:kern w:val="0"/>
+                <w:sz w:val="24"/>
+                <w:szCs w:val="24"/>
+              </w:rPr>
+              <w:t>Rs/R0</w:t>
+            </w:r>
+          </w:p>
+        </w:tc>
+        <w:tc>
+          <w:tcPr>
+            <w:tcW w:w="4144" w:type="dxa"/>
+            <w:vAlign w:val="center"/>
+          </w:tcPr>
+          <w:p>
+            <w:pPr>
+              <w:pStyle w:val="ListParagraph"/>
+              <w:ind w:left="0"/>
+              <w:jc w:val="center"/>
+              <w:rPr>
+                <w:rFonts w:cstheme="minorHAnsi"/>
+                <w:kern w:val="0"/>
+                <w:sz w:val="24"/>
+                <w:szCs w:val="24"/>
+              </w:rPr>
+            </w:pPr>
+            <w:r>
+              <w:rPr>
+                <w:rFonts w:cstheme="minorHAnsi"/>
+                <w:kern w:val="0"/>
+                <w:sz w:val="24"/>
+                <w:szCs w:val="24"/>
+              </w:rPr>
+              <w:t>1.5</w:t>
+            </w:r>
+          </w:p>
+        </w:tc>
+      </w:tr>
+      <w:tr>
+        <w:trPr>
+          <w:jc w:val="center"/>
+        </w:trPr>
+        <w:tc>
+          <w:tcPr>
+            <w:tcW w:w="4152" w:type="dxa"/>
+            <w:vAlign w:val="center"/>
+          </w:tcPr>
+          <w:p>
+            <w:pPr>
+              <w:jc w:val="center"/>
+              <w:rPr>
+                <w:rFonts w:cstheme="minorHAnsi"/>
+                <w:kern w:val="0"/>
+                <w:sz w:val="24"/>
+                <w:szCs w:val="24"/>
+              </w:rPr>
+            </w:pPr>
+            <w:r>
+              <w:rPr>
+                <w:rFonts w:cstheme="minorHAnsi"/>
+                <w:kern w:val="0"/>
+                <w:sz w:val="24"/>
+                <w:szCs w:val="24"/>
+              </w:rPr>
+              <w:t>Interface type</w:t>
+            </w:r>
+          </w:p>
+        </w:tc>
+        <w:tc>
+          <w:tcPr>
+            <w:tcW w:w="4144" w:type="dxa"/>
+            <w:vAlign w:val="center"/>
+          </w:tcPr>
+          <w:p>
+            <w:pPr>
+              <w:pStyle w:val="ListParagraph"/>
+              <w:ind w:left="0"/>
+              <w:jc w:val="center"/>
+              <w:rPr>
+                <w:rFonts w:cstheme="minorHAnsi"/>
+                <w:kern w:val="0"/>
+                <w:sz w:val="24"/>
+                <w:szCs w:val="24"/>
+              </w:rPr>
+            </w:pPr>
+            <w:r>
+              <w:rPr>
+                <w:rFonts w:cstheme="minorHAnsi"/>
+                <w:kern w:val="0"/>
+                <w:sz w:val="24"/>
+                <w:szCs w:val="24"/>
+              </w:rPr>
+              <w:t>ADC</w:t>
+            </w:r>
+          </w:p>
+        </w:tc>
+      </w:tr>
+    </w:tbl>
+    <w:p>
+      <w:pPr>
+        <w:jc w:val="both"/>
+        <w:rPr>
+          <w:b/>
+          <w:bCs/>
+          <w:sz w:val="24"/>
+          <w:szCs w:val="24"/>
+          <w:lang w:val="en-US"/>
+        </w:rPr>
+      </w:pPr>
+    </w:p>
+    <w:p>
+      <w:pPr>
+        <w:pStyle w:val="ListParagraph"/>
+        <w:numPr>
+          <w:ilvl w:val="0"/>
+          <w:numId w:val="32"/>
+        </w:numPr>
+        <w:jc w:val="both"/>
+        <w:rPr>
+          <w:b/>
+          <w:bCs/>
+          <w:sz w:val="24"/>
+          <w:szCs w:val="24"/>
+          <w:lang w:val="en-US"/>
+        </w:rPr>
+      </w:pPr>
+      <w:r>
+        <w:rPr>
+          <w:b/>
+          <w:bCs/>
+          <w:sz w:val="24"/>
+          <w:szCs w:val="24"/>
+          <w:lang w:val="en-US"/>
+        </w:rPr>
+        <w:t>DHT22-Temperature and Humidity Sensor</w:t>
+      </w:r>
+    </w:p>
+    <w:p>
+      <w:pPr>
+        <w:pStyle w:val="ListParagraph"/>
+        <w:jc w:val="both"/>
+        <w:rPr>
+          <w:b/>
+          <w:bCs/>
+          <w:sz w:val="24"/>
+          <w:szCs w:val="24"/>
+          <w:lang w:val="en-US"/>
+        </w:rPr>
+      </w:pPr>
+    </w:p>
+    <w:tbl>
+      <w:tblPr>
+        <w:tblStyle w:val="TableGrid"/>
+        <w:tblW w:w="0" w:type="auto"/>
+        <w:tblInd w:w="720" w:type="dxa"/>
+        <w:tblLook w:val="04A0" w:firstRow="1" w:lastRow="0" w:firstColumn="1" w:lastColumn="0" w:noHBand="0" w:noVBand="1"/>
+      </w:tblPr>
+      <w:tblGrid>
+        <w:gridCol w:w="4148"/>
+        <w:gridCol w:w="4148"/>
+      </w:tblGrid>
+      <w:tr>
+        <w:tc>
+          <w:tcPr>
+            <w:tcW w:w="4148" w:type="dxa"/>
+            <w:vAlign w:val="center"/>
+          </w:tcPr>
+          <w:p>
+            <w:pPr>
+              <w:pStyle w:val="ListParagraph"/>
+              <w:ind w:left="0"/>
+              <w:jc w:val="center"/>
+              <w:rPr>
+                <w:b/>
+                <w:bCs/>
+                <w:sz w:val="24"/>
+                <w:szCs w:val="24"/>
+                <w:lang w:val="en-US"/>
+              </w:rPr>
+            </w:pPr>
+            <w:r>
+              <w:rPr>
+                <w:b/>
+                <w:bCs/>
+                <w:sz w:val="24"/>
+                <w:szCs w:val="24"/>
+                <w:lang w:val="en-US"/>
+              </w:rPr>
+              <w:t>Parameter</w:t>
+            </w:r>
+          </w:p>
+        </w:tc>
+        <w:tc>
+          <w:tcPr>
+            <w:tcW w:w="4148" w:type="dxa"/>
+            <w:vAlign w:val="center"/>
+          </w:tcPr>
+          <w:p>
+            <w:pPr>
+              <w:pStyle w:val="ListParagraph"/>
+              <w:ind w:left="0"/>
+              <w:jc w:val="center"/>
+              <w:rPr>
+                <w:b/>
+                <w:bCs/>
+                <w:sz w:val="24"/>
+                <w:szCs w:val="24"/>
+                <w:lang w:val="en-US"/>
+              </w:rPr>
+            </w:pPr>
+            <w:r>
+              <w:rPr>
+                <w:b/>
+                <w:bCs/>
+                <w:sz w:val="24"/>
+                <w:szCs w:val="24"/>
+                <w:lang w:val="en-US"/>
+              </w:rPr>
+              <w:t>Values</w:t>
+            </w:r>
+          </w:p>
+        </w:tc>
+      </w:tr>
+      <w:tr>
+        <w:tc>
+          <w:tcPr>
+            <w:tcW w:w="4148" w:type="dxa"/>
+          </w:tcPr>
+          <w:p>
+            <w:pPr>
+              <w:pStyle w:val="ListParagraph"/>
+              <w:ind w:left="0"/>
+              <w:jc w:val="center"/>
+              <w:rPr>
+                <w:sz w:val="24"/>
+                <w:szCs w:val="24"/>
+                <w:lang w:val="en-US"/>
+              </w:rPr>
+            </w:pPr>
+            <w:r>
+              <w:rPr>
+                <w:sz w:val="24"/>
+                <w:szCs w:val="24"/>
+                <w:lang w:val="en-US"/>
+              </w:rPr>
+              <w:t>Power supply</w:t>
+            </w:r>
+          </w:p>
+        </w:tc>
+        <w:tc>
+          <w:tcPr>
+            <w:tcW w:w="4148" w:type="dxa"/>
+          </w:tcPr>
+          <w:p>
+            <w:pPr>
+              <w:pStyle w:val="ListParagraph"/>
+              <w:ind w:left="0"/>
+              <w:jc w:val="center"/>
+              <w:rPr>
+                <w:sz w:val="24"/>
+                <w:szCs w:val="24"/>
+                <w:lang w:val="en-US"/>
+              </w:rPr>
+            </w:pPr>
+            <w:r>
+              <w:rPr>
+                <w:sz w:val="24"/>
+                <w:szCs w:val="24"/>
+                <w:lang w:val="en-US"/>
+              </w:rPr>
+              <w:t>3.3 to 6V</w:t>
+            </w:r>
+          </w:p>
+        </w:tc>
+      </w:tr>
+      <w:tr>
+        <w:tc>
+          <w:tcPr>
+            <w:tcW w:w="4148" w:type="dxa"/>
+          </w:tcPr>
+          <w:p>
+            <w:pPr>
+              <w:pStyle w:val="ListParagraph"/>
+              <w:ind w:left="0"/>
+              <w:jc w:val="center"/>
+              <w:rPr>
+                <w:sz w:val="24"/>
+                <w:szCs w:val="24"/>
+                <w:lang w:val="en-US"/>
+              </w:rPr>
+            </w:pPr>
+            <w:r>
+              <w:rPr>
+                <w:sz w:val="24"/>
+                <w:szCs w:val="24"/>
+                <w:lang w:val="en-US"/>
+              </w:rPr>
+              <w:t>Output signal type</w:t>
+            </w:r>
+          </w:p>
+        </w:tc>
+        <w:tc>
+          <w:tcPr>
+            <w:tcW w:w="4148" w:type="dxa"/>
+          </w:tcPr>
+          <w:p>
+            <w:pPr>
+              <w:pStyle w:val="ListParagraph"/>
+              <w:ind w:left="0"/>
+              <w:jc w:val="center"/>
+              <w:rPr>
+                <w:sz w:val="24"/>
+                <w:szCs w:val="24"/>
+                <w:lang w:val="en-US"/>
+              </w:rPr>
+            </w:pPr>
+            <w:r>
+              <w:rPr>
+                <w:sz w:val="24"/>
+                <w:szCs w:val="24"/>
+                <w:lang w:val="en-US"/>
+              </w:rPr>
+              <w:t>Digital</w:t>
+            </w:r>
+          </w:p>
+        </w:tc>
+      </w:tr>
+      <w:tr>
+        <w:tc>
+          <w:tcPr>
+            <w:tcW w:w="4148" w:type="dxa"/>
+          </w:tcPr>
+          <w:p>
+            <w:pPr>
+              <w:pStyle w:val="ListParagraph"/>
+              <w:ind w:left="0"/>
+              <w:jc w:val="center"/>
+              <w:rPr>
+                <w:sz w:val="24"/>
+                <w:szCs w:val="24"/>
+                <w:lang w:val="en-US"/>
+              </w:rPr>
+            </w:pPr>
+            <w:r>
+              <w:rPr>
+                <w:sz w:val="24"/>
+                <w:szCs w:val="24"/>
+                <w:lang w:val="en-US"/>
+              </w:rPr>
+              <w:t>Operating range</w:t>
+            </w:r>
+          </w:p>
+        </w:tc>
+        <w:tc>
+          <w:tcPr>
+            <w:tcW w:w="4148" w:type="dxa"/>
+          </w:tcPr>
+          <w:p>
+            <w:pPr>
+              <w:pStyle w:val="ListParagraph"/>
+              <w:ind w:left="0"/>
+              <w:jc w:val="both"/>
+              <w:rPr>
+                <w:rFonts w:cstheme="minorHAnsi"/>
+                <w:sz w:val="24"/>
+                <w:szCs w:val="24"/>
+                <w:lang w:val="en-US"/>
+              </w:rPr>
+            </w:pPr>
+            <w:r>
+              <w:rPr>
+                <w:sz w:val="24"/>
+                <w:szCs w:val="24"/>
+                <w:lang w:val="en-US"/>
+              </w:rPr>
+              <w:t>0-100 % RH; temperature- -40 to 80</w:t>
+            </w:r>
+            <w:r>
+              <w:rPr>
+                <w:rFonts w:cstheme="minorHAnsi"/>
+                <w:sz w:val="24"/>
+                <w:szCs w:val="24"/>
+                <w:vertAlign w:val="superscript"/>
+                <w:lang w:val="en-US"/>
+              </w:rPr>
+              <w:t>o</w:t>
+            </w:r>
+            <w:r>
+              <w:rPr>
+                <w:rFonts w:cstheme="minorHAnsi"/>
+                <w:sz w:val="24"/>
+                <w:szCs w:val="24"/>
+                <w:vertAlign w:val="superscript"/>
+                <w:lang w:val="en-US"/>
+              </w:rPr>
+              <w:t xml:space="preserve"> </w:t>
+            </w:r>
+            <w:r>
+              <w:rPr>
+                <w:rFonts w:cstheme="minorHAnsi"/>
+                <w:sz w:val="24"/>
+                <w:szCs w:val="24"/>
+                <w:lang w:val="en-US"/>
+              </w:rPr>
+              <w:t>C</w:t>
+            </w:r>
+          </w:p>
+        </w:tc>
+      </w:tr>
+      <w:tr>
+        <w:tc>
+          <w:tcPr>
+            <w:tcW w:w="4148" w:type="dxa"/>
+          </w:tcPr>
+          <w:p>
+            <w:pPr>
+              <w:pStyle w:val="ListParagraph"/>
+              <w:ind w:left="0"/>
+              <w:jc w:val="center"/>
+              <w:rPr>
+                <w:sz w:val="24"/>
+                <w:szCs w:val="24"/>
+                <w:lang w:val="en-US"/>
+              </w:rPr>
+            </w:pPr>
+            <w:r>
+              <w:rPr>
+                <w:sz w:val="24"/>
+                <w:szCs w:val="24"/>
+                <w:lang w:val="en-US"/>
+              </w:rPr>
+              <w:t>Resolution or sensitivity</w:t>
+            </w:r>
+          </w:p>
+        </w:tc>
+        <w:tc>
+          <w:tcPr>
+            <w:tcW w:w="4148" w:type="dxa"/>
+          </w:tcPr>
+          <w:p>
+            <w:pPr>
+              <w:pStyle w:val="ListParagraph"/>
+              <w:ind w:left="0"/>
+              <w:jc w:val="center"/>
+              <w:rPr>
+                <w:sz w:val="24"/>
+                <w:szCs w:val="24"/>
+                <w:lang w:val="en-US"/>
+              </w:rPr>
+            </w:pPr>
+            <w:r>
+              <w:rPr>
+                <w:sz w:val="24"/>
+                <w:szCs w:val="24"/>
+                <w:lang w:val="en-US"/>
+              </w:rPr>
+              <w:t>Humidity 0.1% RH; Temperature 0.1</w:t>
+            </w:r>
+            <w:r>
+              <w:rPr>
+                <w:rFonts w:cstheme="minorHAnsi"/>
+                <w:sz w:val="24"/>
+                <w:szCs w:val="24"/>
+                <w:vertAlign w:val="superscript"/>
+                <w:lang w:val="en-US"/>
+              </w:rPr>
+              <w:t>o</w:t>
+            </w:r>
+            <w:r>
+              <w:rPr>
+                <w:rFonts w:cstheme="minorHAnsi"/>
+                <w:sz w:val="24"/>
+                <w:szCs w:val="24"/>
+                <w:vertAlign w:val="superscript"/>
+                <w:lang w:val="en-US"/>
+              </w:rPr>
+              <w:t xml:space="preserve"> </w:t>
+            </w:r>
+            <w:r>
+              <w:rPr>
+                <w:rFonts w:cstheme="minorHAnsi"/>
+                <w:sz w:val="24"/>
+                <w:szCs w:val="24"/>
+                <w:lang w:val="en-US"/>
+              </w:rPr>
+              <w:t>C</w:t>
+            </w:r>
+          </w:p>
+        </w:tc>
+      </w:tr>
+      <w:tr>
+        <w:tc>
+          <w:tcPr>
+            <w:tcW w:w="4148" w:type="dxa"/>
+            <w:vAlign w:val="center"/>
+          </w:tcPr>
+          <w:p>
+            <w:pPr>
+              <w:pStyle w:val="ListParagraph"/>
+              <w:ind w:left="0"/>
+              <w:jc w:val="center"/>
+              <w:rPr>
+                <w:sz w:val="24"/>
+                <w:szCs w:val="24"/>
+                <w:lang w:val="en-US"/>
+              </w:rPr>
+            </w:pPr>
+            <w:r>
+              <w:rPr>
+                <w:rFonts w:cstheme="minorHAnsi"/>
+                <w:kern w:val="0"/>
+                <w:sz w:val="24"/>
+                <w:szCs w:val="24"/>
+              </w:rPr>
+              <w:t>Interface type</w:t>
+            </w:r>
+          </w:p>
+        </w:tc>
+        <w:tc>
+          <w:tcPr>
+            <w:tcW w:w="4148" w:type="dxa"/>
+            <w:vAlign w:val="center"/>
+          </w:tcPr>
+          <w:p>
+            <w:pPr>
+              <w:pStyle w:val="ListParagraph"/>
+              <w:ind w:left="0"/>
+              <w:jc w:val="center"/>
+              <w:rPr>
+                <w:sz w:val="24"/>
+                <w:szCs w:val="24"/>
+                <w:lang w:val="en-US"/>
+              </w:rPr>
+            </w:pPr>
+            <w:r>
+              <w:rPr>
+                <w:sz w:val="24"/>
+                <w:szCs w:val="24"/>
+                <w:lang w:val="en-US"/>
+              </w:rPr>
+              <w:t>Single bus protocol</w:t>
+            </w:r>
+          </w:p>
+        </w:tc>
+      </w:tr>
+    </w:tbl>
+    <w:p>
+      <w:pPr>
+        <w:pStyle w:val="ListParagraph"/>
+        <w:jc w:val="both"/>
+        <w:rPr>
+          <w:b/>
+          <w:bCs/>
+          <w:sz w:val="24"/>
+          <w:szCs w:val="24"/>
+          <w:lang w:val="en-US"/>
+        </w:rPr>
+      </w:pPr>
+    </w:p>
+    <w:p>
+      <w:pPr>
+        <w:pStyle w:val="ListParagraph"/>
+        <w:numPr>
+          <w:ilvl w:val="0"/>
+          <w:numId w:val="32"/>
+        </w:numPr>
+        <w:jc w:val="both"/>
+        <w:rPr>
+          <w:b/>
+          <w:bCs/>
+          <w:sz w:val="24"/>
+          <w:szCs w:val="24"/>
+          <w:lang w:val="en-US"/>
+        </w:rPr>
+      </w:pPr>
+      <w:r>
+        <w:rPr>
+          <w:b/>
+          <w:bCs/>
+          <w:sz w:val="24"/>
+          <w:szCs w:val="24"/>
+          <w:lang w:val="en-US"/>
+        </w:rPr>
+        <w:t>Load cell +</w:t>
+      </w:r>
+      <w:r>
+        <w:rPr>
+          <w:b/>
+          <w:bCs/>
+          <w:sz w:val="24"/>
+          <w:szCs w:val="24"/>
+          <w:lang w:val="en-US"/>
+        </w:rPr>
+        <w:t>HX711</w:t>
+      </w:r>
+    </w:p>
+    <w:p>
+      <w:pPr>
+        <w:pStyle w:val="ListParagraph"/>
+        <w:jc w:val="both"/>
+        <w:rPr>
+          <w:b/>
+          <w:bCs/>
+          <w:sz w:val="24"/>
+          <w:szCs w:val="24"/>
+          <w:lang w:val="en-US"/>
+        </w:rPr>
+      </w:pPr>
+    </w:p>
+    <w:tbl>
+      <w:tblPr>
+        <w:tblStyle w:val="TableGrid"/>
+        <w:tblW w:w="0" w:type="auto"/>
+        <w:tblInd w:w="720" w:type="dxa"/>
+        <w:tblLook w:val="04A0" w:firstRow="1" w:lastRow="0" w:firstColumn="1" w:lastColumn="0" w:noHBand="0" w:noVBand="1"/>
+      </w:tblPr>
+      <w:tblGrid>
+        <w:gridCol w:w="4148"/>
+        <w:gridCol w:w="4148"/>
+      </w:tblGrid>
+      <w:tr>
+        <w:tc>
+          <w:tcPr>
+            <w:tcW w:w="4148" w:type="dxa"/>
+            <w:vAlign w:val="center"/>
+          </w:tcPr>
+          <w:p>
+            <w:pPr>
+              <w:pStyle w:val="ListParagraph"/>
+              <w:ind w:left="0"/>
+              <w:jc w:val="center"/>
+              <w:rPr>
+                <w:b/>
+                <w:bCs/>
+                <w:sz w:val="24"/>
+                <w:szCs w:val="24"/>
+                <w:lang w:val="en-US"/>
+              </w:rPr>
+            </w:pPr>
+            <w:r>
+              <w:rPr>
+                <w:b/>
+                <w:bCs/>
+                <w:sz w:val="24"/>
+                <w:szCs w:val="24"/>
+                <w:lang w:val="en-US"/>
+              </w:rPr>
+              <w:t>Parameter</w:t>
+            </w:r>
+          </w:p>
+        </w:tc>
+        <w:tc>
+          <w:tcPr>
+            <w:tcW w:w="4148" w:type="dxa"/>
+            <w:vAlign w:val="center"/>
+          </w:tcPr>
+          <w:p>
+            <w:pPr>
+              <w:pStyle w:val="ListParagraph"/>
+              <w:ind w:left="0"/>
+              <w:jc w:val="center"/>
+              <w:rPr>
+                <w:b/>
+                <w:bCs/>
+                <w:sz w:val="24"/>
+                <w:szCs w:val="24"/>
+                <w:lang w:val="en-US"/>
+              </w:rPr>
+            </w:pPr>
+            <w:r>
+              <w:rPr>
+                <w:b/>
+                <w:bCs/>
+                <w:sz w:val="24"/>
+                <w:szCs w:val="24"/>
+                <w:lang w:val="en-US"/>
+              </w:rPr>
+              <w:t>Values</w:t>
+            </w:r>
+          </w:p>
+        </w:tc>
+      </w:tr>
+      <w:tr>
+        <w:tc>
+          <w:tcPr>
+            <w:tcW w:w="4148" w:type="dxa"/>
+          </w:tcPr>
+          <w:p>
+            <w:pPr>
+              <w:pStyle w:val="ListParagraph"/>
+              <w:ind w:left="0"/>
+              <w:jc w:val="center"/>
+              <w:rPr>
+                <w:sz w:val="24"/>
+                <w:szCs w:val="24"/>
+                <w:lang w:val="en-US"/>
+              </w:rPr>
+            </w:pPr>
+            <w:r>
+              <w:rPr>
+                <w:sz w:val="24"/>
+                <w:szCs w:val="24"/>
+                <w:lang w:val="en-US"/>
+              </w:rPr>
+              <w:t>Power supply</w:t>
+            </w:r>
+          </w:p>
+        </w:tc>
+        <w:tc>
+          <w:tcPr>
+            <w:tcW w:w="4148" w:type="dxa"/>
+          </w:tcPr>
+          <w:p>
+            <w:pPr>
+              <w:pStyle w:val="ListParagraph"/>
+              <w:ind w:left="0"/>
+              <w:jc w:val="center"/>
+              <w:rPr>
+                <w:sz w:val="24"/>
+                <w:szCs w:val="24"/>
+                <w:lang w:val="en-US"/>
+              </w:rPr>
+            </w:pPr>
+            <w:r>
+              <w:rPr>
+                <w:sz w:val="24"/>
+                <w:szCs w:val="24"/>
+                <w:lang w:val="en-US"/>
+              </w:rPr>
+              <w:t>2.6V to 5.5V (3.3V typical)</w:t>
+            </w:r>
+          </w:p>
+        </w:tc>
+      </w:tr>
+      <w:tr>
+        <w:tc>
+          <w:tcPr>
+            <w:tcW w:w="4148" w:type="dxa"/>
+          </w:tcPr>
+          <w:p>
+            <w:pPr>
+              <w:pStyle w:val="ListParagraph"/>
+              <w:ind w:left="0"/>
+              <w:jc w:val="center"/>
+              <w:rPr>
+                <w:sz w:val="24"/>
+                <w:szCs w:val="24"/>
+                <w:lang w:val="en-US"/>
+              </w:rPr>
+            </w:pPr>
+            <w:r>
+              <w:rPr>
+                <w:sz w:val="24"/>
+                <w:szCs w:val="24"/>
+                <w:lang w:val="en-US"/>
+              </w:rPr>
+              <w:t xml:space="preserve">Output </w:t>
+            </w:r>
+            <w:r>
+              <w:rPr>
+                <w:sz w:val="24"/>
+                <w:szCs w:val="24"/>
+                <w:lang w:val="en-US"/>
+              </w:rPr>
+              <w:t>data coding</w:t>
+            </w:r>
+          </w:p>
+        </w:tc>
+        <w:tc>
+          <w:tcPr>
+            <w:tcW w:w="4148" w:type="dxa"/>
+          </w:tcPr>
+          <w:p>
+            <w:pPr>
+              <w:pStyle w:val="ListParagraph"/>
+              <w:ind w:left="0"/>
+              <w:jc w:val="center"/>
+              <w:rPr>
+                <w:sz w:val="24"/>
+                <w:szCs w:val="24"/>
+                <w:lang w:val="en-US"/>
+              </w:rPr>
+            </w:pPr>
+            <w:r>
+              <w:rPr>
+                <w:sz w:val="24"/>
+                <w:szCs w:val="24"/>
+                <w:lang w:val="en-US"/>
+              </w:rPr>
+              <w:t>2’s compliment</w:t>
+            </w:r>
+          </w:p>
+        </w:tc>
+      </w:tr>
+      <w:tr>
+        <w:tc>
+          <w:tcPr>
+            <w:tcW w:w="4148" w:type="dxa"/>
+          </w:tcPr>
+          <w:p>
+            <w:pPr>
+              <w:pStyle w:val="ListParagraph"/>
+              <w:ind w:left="0"/>
+              <w:jc w:val="center"/>
+              <w:rPr>
+                <w:sz w:val="24"/>
+                <w:szCs w:val="24"/>
+                <w:lang w:val="en-US"/>
+              </w:rPr>
+            </w:pPr>
+            <w:r>
+              <w:rPr>
+                <w:sz w:val="24"/>
+                <w:szCs w:val="24"/>
+                <w:lang w:val="en-US"/>
+              </w:rPr>
+              <w:t xml:space="preserve">ADC </w:t>
+            </w:r>
+            <w:r>
+              <w:rPr>
+                <w:sz w:val="24"/>
+                <w:szCs w:val="24"/>
+                <w:lang w:val="en-US"/>
+              </w:rPr>
+              <w:t>resolution</w:t>
+            </w:r>
+          </w:p>
+        </w:tc>
+        <w:tc>
+          <w:tcPr>
+            <w:tcW w:w="4148" w:type="dxa"/>
+          </w:tcPr>
+          <w:p>
+            <w:pPr>
+              <w:pStyle w:val="ListParagraph"/>
+              <w:ind w:left="0"/>
+              <w:jc w:val="center"/>
+              <w:rPr>
+                <w:rFonts w:cstheme="minorHAnsi"/>
+                <w:sz w:val="24"/>
+                <w:szCs w:val="24"/>
+                <w:lang w:val="en-US"/>
+              </w:rPr>
+            </w:pPr>
+            <w:r>
+              <w:rPr>
+                <w:rFonts w:cstheme="minorHAnsi"/>
+                <w:sz w:val="24"/>
+                <w:szCs w:val="24"/>
+                <w:lang w:val="en-US"/>
+              </w:rPr>
+              <w:t>24 bits</w:t>
+            </w:r>
+          </w:p>
+        </w:tc>
+      </w:tr>
+      <w:tr>
+        <w:tc>
+          <w:tcPr>
+            <w:tcW w:w="4148" w:type="dxa"/>
+          </w:tcPr>
+          <w:p>
+            <w:pPr>
+              <w:pStyle w:val="ListParagraph"/>
+              <w:ind w:left="0"/>
+              <w:jc w:val="center"/>
+              <w:rPr>
+                <w:sz w:val="24"/>
+                <w:szCs w:val="24"/>
+                <w:lang w:val="en-US"/>
+              </w:rPr>
+            </w:pPr>
+            <w:r>
+              <w:rPr>
+                <w:sz w:val="24"/>
+                <w:szCs w:val="24"/>
+                <w:lang w:val="en-US"/>
+              </w:rPr>
+              <w:t>No. of Differential input channels</w:t>
+            </w:r>
+          </w:p>
+        </w:tc>
+        <w:tc>
+          <w:tcPr>
+            <w:tcW w:w="4148" w:type="dxa"/>
+          </w:tcPr>
+          <w:p>
+            <w:pPr>
+              <w:pStyle w:val="ListParagraph"/>
+              <w:ind w:left="0"/>
+              <w:jc w:val="center"/>
+              <w:rPr>
+                <w:sz w:val="24"/>
+                <w:szCs w:val="24"/>
+                <w:lang w:val="en-US"/>
+              </w:rPr>
+            </w:pPr>
+            <w:r>
+              <w:rPr>
+                <w:sz w:val="24"/>
+                <w:szCs w:val="24"/>
+                <w:lang w:val="en-US"/>
+              </w:rPr>
+              <w:t>2-with selectable PGA gain of 32,64,128</w:t>
+            </w:r>
+          </w:p>
+        </w:tc>
+      </w:tr>
+      <w:tr>
+        <w:tc>
+          <w:tcPr>
+            <w:tcW w:w="4148" w:type="dxa"/>
+            <w:vAlign w:val="center"/>
+          </w:tcPr>
+          <w:p>
+            <w:pPr>
+              <w:pStyle w:val="ListParagraph"/>
+              <w:ind w:left="0"/>
+              <w:jc w:val="center"/>
+              <w:rPr>
+                <w:sz w:val="24"/>
+                <w:szCs w:val="24"/>
+                <w:lang w:val="en-US"/>
+              </w:rPr>
+            </w:pPr>
+            <w:r>
+              <w:rPr>
+                <w:rFonts w:cstheme="minorHAnsi"/>
+                <w:kern w:val="0"/>
+                <w:sz w:val="24"/>
+                <w:szCs w:val="24"/>
+              </w:rPr>
+              <w:t>Interface type</w:t>
+            </w:r>
+          </w:p>
+        </w:tc>
+        <w:tc>
+          <w:tcPr>
+            <w:tcW w:w="4148" w:type="dxa"/>
+            <w:vAlign w:val="center"/>
+          </w:tcPr>
+          <w:p>
+            <w:pPr>
+              <w:pStyle w:val="ListParagraph"/>
+              <w:ind w:left="0"/>
+              <w:jc w:val="center"/>
+              <w:rPr>
+                <w:sz w:val="24"/>
+                <w:szCs w:val="24"/>
+                <w:lang w:val="en-US"/>
+              </w:rPr>
+            </w:pPr>
+            <w:r>
+              <w:rPr>
+                <w:sz w:val="24"/>
+                <w:szCs w:val="24"/>
+                <w:lang w:val="en-US"/>
+              </w:rPr>
+              <w:t>S</w:t>
+            </w:r>
+            <w:r>
+              <w:rPr>
+                <w:sz w:val="24"/>
+                <w:szCs w:val="24"/>
+                <w:lang w:val="en-US"/>
+              </w:rPr>
+              <w:t>erial interface using GPIO</w:t>
+            </w:r>
+          </w:p>
+        </w:tc>
+      </w:tr>
+    </w:tbl>
+    <w:p>
+      <w:pPr>
+        <w:pStyle w:val="ListParagraph"/>
+        <w:jc w:val="both"/>
+        <w:rPr>
+          <w:b/>
+          <w:bCs/>
+          <w:sz w:val="24"/>
+          <w:szCs w:val="24"/>
+          <w:lang w:val="en-US"/>
+        </w:rPr>
+      </w:pPr>
     </w:p>
     <w:sectPr>
       <w:pgSz w:w="11906" w:h="16838"/>
@@ -8076,6 +11727,95 @@
     </w:lvl>
   </w:abstractNum>
   <w:abstractNum w:abstractNumId="8" w15:restartNumberingAfterBreak="0">
+    <w:nsid w:val="251F539A"/>
+    <w:multiLevelType w:val="hybridMultilevel"/>
+    <w:tmpl w:val="232A62BA"/>
+    <w:lvl w:ilvl="0" w:tplc="4009000F">
+      <w:start w:val="1"/>
+      <w:numFmt w:val="decimal"/>
+      <w:lvlText w:val="%1."/>
+      <w:lvlJc w:val="left"/>
+      <w:pPr>
+        <w:ind w:left="720" w:hanging="360"/>
+      </w:pPr>
+      <w:rPr>
+        <w:rFonts w:hint="default"/>
+      </w:rPr>
+    </w:lvl>
+    <w:lvl w:ilvl="1" w:tplc="40090019" w:tentative="1">
+      <w:start w:val="1"/>
+      <w:numFmt w:val="lowerLetter"/>
+      <w:lvlText w:val="%2."/>
+      <w:lvlJc w:val="left"/>
+      <w:pPr>
+        <w:ind w:left="1440" w:hanging="360"/>
+      </w:pPr>
+    </w:lvl>
+    <w:lvl w:ilvl="2" w:tplc="4009001B" w:tentative="1">
+      <w:start w:val="1"/>
+      <w:numFmt w:val="lowerRoman"/>
+      <w:lvlText w:val="%3."/>
+      <w:lvlJc w:val="right"/>
+      <w:pPr>
+        <w:ind w:left="2160" w:hanging="180"/>
+      </w:pPr>
+    </w:lvl>
+    <w:lvl w:ilvl="3" w:tplc="4009000F" w:tentative="1">
+      <w:start w:val="1"/>
+      <w:numFmt w:val="decimal"/>
+      <w:lvlText w:val="%4."/>
+      <w:lvlJc w:val="left"/>
+      <w:pPr>
+        <w:ind w:left="2880" w:hanging="360"/>
+      </w:pPr>
+    </w:lvl>
+    <w:lvl w:ilvl="4" w:tplc="40090019" w:tentative="1">
+      <w:start w:val="1"/>
+      <w:numFmt w:val="lowerLetter"/>
+      <w:lvlText w:val="%5."/>
+      <w:lvlJc w:val="left"/>
+      <w:pPr>
+        <w:ind w:left="3600" w:hanging="360"/>
+      </w:pPr>
+    </w:lvl>
+    <w:lvl w:ilvl="5" w:tplc="4009001B" w:tentative="1">
+      <w:start w:val="1"/>
+      <w:numFmt w:val="lowerRoman"/>
+      <w:lvlText w:val="%6."/>
+      <w:lvlJc w:val="right"/>
+      <w:pPr>
+        <w:ind w:left="4320" w:hanging="180"/>
+      </w:pPr>
+    </w:lvl>
+    <w:lvl w:ilvl="6" w:tplc="4009000F" w:tentative="1">
+      <w:start w:val="1"/>
+      <w:numFmt w:val="decimal"/>
+      <w:lvlText w:val="%7."/>
+      <w:lvlJc w:val="left"/>
+      <w:pPr>
+        <w:ind w:left="5040" w:hanging="360"/>
+      </w:pPr>
+    </w:lvl>
+    <w:lvl w:ilvl="7" w:tplc="40090019" w:tentative="1">
+      <w:start w:val="1"/>
+      <w:numFmt w:val="lowerLetter"/>
+      <w:lvlText w:val="%8."/>
+      <w:lvlJc w:val="left"/>
+      <w:pPr>
+        <w:ind w:left="5760" w:hanging="360"/>
+      </w:pPr>
+    </w:lvl>
+    <w:lvl w:ilvl="8" w:tplc="4009001B" w:tentative="1">
+      <w:start w:val="1"/>
+      <w:numFmt w:val="lowerRoman"/>
+      <w:lvlText w:val="%9."/>
+      <w:lvlJc w:val="right"/>
+      <w:pPr>
+        <w:ind w:left="6480" w:hanging="180"/>
+      </w:pPr>
+    </w:lvl>
+  </w:abstractNum>
+  <w:abstractNum w:abstractNumId="9" w15:restartNumberingAfterBreak="0">
     <w:nsid w:val="26FA764D"/>
     <w:multiLevelType w:val="multilevel"/>
     <w:tmpl w:val="56009C4E"/>
@@ -8188,7 +11928,7 @@
       </w:pPr>
     </w:lvl>
   </w:abstractNum>
-  <w:abstractNum w:abstractNumId="9" w15:restartNumberingAfterBreak="0">
+  <w:abstractNum w:abstractNumId="10" w15:restartNumberingAfterBreak="0">
     <w:nsid w:val="358149EA"/>
     <w:multiLevelType w:val="multilevel"/>
     <w:tmpl w:val="93B4ECF8"/>
@@ -8337,7 +12077,7 @@
       </w:rPr>
     </w:lvl>
   </w:abstractNum>
-  <w:abstractNum w:abstractNumId="10" w15:restartNumberingAfterBreak="0">
+  <w:abstractNum w:abstractNumId="11" w15:restartNumberingAfterBreak="0">
     <w:nsid w:val="36D95C30"/>
     <w:multiLevelType w:val="hybridMultilevel"/>
     <w:tmpl w:val="C7D003F2"/>
@@ -8477,7 +12217,7 @@
       </w:rPr>
     </w:lvl>
   </w:abstractNum>
-  <w:abstractNum w:abstractNumId="11" w15:restartNumberingAfterBreak="0">
+  <w:abstractNum w:abstractNumId="12" w15:restartNumberingAfterBreak="0">
     <w:nsid w:val="45F517DB"/>
     <w:multiLevelType w:val="hybridMultilevel"/>
     <w:tmpl w:val="CE8EB636"/>
@@ -8590,7 +12330,7 @@
       </w:rPr>
     </w:lvl>
   </w:abstractNum>
-  <w:abstractNum w:abstractNumId="12" w15:restartNumberingAfterBreak="0">
+  <w:abstractNum w:abstractNumId="13" w15:restartNumberingAfterBreak="0">
     <w:nsid w:val="49EB7ADD"/>
     <w:multiLevelType w:val="multilevel"/>
     <w:tmpl w:val="AB58E030"/>
@@ -8739,7 +12479,7 @@
       </w:rPr>
     </w:lvl>
   </w:abstractNum>
-  <w:abstractNum w:abstractNumId="13" w15:restartNumberingAfterBreak="0">
+  <w:abstractNum w:abstractNumId="14" w15:restartNumberingAfterBreak="0">
     <w:nsid w:val="4B302BD4"/>
     <w:multiLevelType w:val="hybridMultilevel"/>
     <w:tmpl w:val="9D36AA86"/>
@@ -8828,7 +12568,7 @@
       </w:pPr>
     </w:lvl>
   </w:abstractNum>
-  <w:abstractNum w:abstractNumId="14" w15:restartNumberingAfterBreak="0">
+  <w:abstractNum w:abstractNumId="15" w15:restartNumberingAfterBreak="0">
     <w:nsid w:val="56CE5A07"/>
     <w:multiLevelType w:val="hybridMultilevel"/>
     <w:tmpl w:val="305460F4"/>
@@ -8968,7 +12708,7 @@
       </w:rPr>
     </w:lvl>
   </w:abstractNum>
-  <w:abstractNum w:abstractNumId="15" w15:restartNumberingAfterBreak="0">
+  <w:abstractNum w:abstractNumId="16" w15:restartNumberingAfterBreak="0">
     <w:nsid w:val="57E41D64"/>
     <w:multiLevelType w:val="hybridMultilevel"/>
     <w:tmpl w:val="9F0ACD00"/>
@@ -9108,7 +12848,7 @@
       </w:rPr>
     </w:lvl>
   </w:abstractNum>
-  <w:abstractNum w:abstractNumId="16" w15:restartNumberingAfterBreak="0">
+  <w:abstractNum w:abstractNumId="17" w15:restartNumberingAfterBreak="0">
     <w:nsid w:val="5A303293"/>
     <w:multiLevelType w:val="hybridMultilevel"/>
     <w:tmpl w:val="D7184CF6"/>
@@ -9248,7 +12988,7 @@
       </w:rPr>
     </w:lvl>
   </w:abstractNum>
-  <w:abstractNum w:abstractNumId="17" w15:restartNumberingAfterBreak="0">
+  <w:abstractNum w:abstractNumId="18" w15:restartNumberingAfterBreak="0">
     <w:nsid w:val="5C6315DD"/>
     <w:multiLevelType w:val="multilevel"/>
     <w:tmpl w:val="E4728940"/>
@@ -9397,7 +13137,7 @@
       </w:rPr>
     </w:lvl>
   </w:abstractNum>
-  <w:abstractNum w:abstractNumId="18" w15:restartNumberingAfterBreak="0">
+  <w:abstractNum w:abstractNumId="19" w15:restartNumberingAfterBreak="0">
     <w:nsid w:val="606C69CB"/>
     <w:multiLevelType w:val="multilevel"/>
     <w:tmpl w:val="C9FC62F8"/>
@@ -9546,7 +13286,7 @@
       </w:rPr>
     </w:lvl>
   </w:abstractNum>
-  <w:abstractNum w:abstractNumId="19" w15:restartNumberingAfterBreak="0">
+  <w:abstractNum w:abstractNumId="20" w15:restartNumberingAfterBreak="0">
     <w:nsid w:val="69BB0BE0"/>
     <w:multiLevelType w:val="hybridMultilevel"/>
     <w:tmpl w:val="617EB404"/>
@@ -9686,7 +13426,7 @@
       </w:rPr>
     </w:lvl>
   </w:abstractNum>
-  <w:abstractNum w:abstractNumId="20" w15:restartNumberingAfterBreak="0">
+  <w:abstractNum w:abstractNumId="21" w15:restartNumberingAfterBreak="0">
     <w:nsid w:val="6AB030F7"/>
     <w:multiLevelType w:val="hybridMultilevel"/>
     <w:tmpl w:val="46EEA212"/>
@@ -9799,7 +13539,7 @@
       </w:rPr>
     </w:lvl>
   </w:abstractNum>
-  <w:abstractNum w:abstractNumId="21" w15:restartNumberingAfterBreak="0">
+  <w:abstractNum w:abstractNumId="22" w15:restartNumberingAfterBreak="0">
     <w:nsid w:val="6B962F89"/>
     <w:multiLevelType w:val="hybridMultilevel"/>
     <w:tmpl w:val="BACCB840"/>
@@ -9939,7 +13679,7 @@
       </w:rPr>
     </w:lvl>
   </w:abstractNum>
-  <w:abstractNum w:abstractNumId="22" w15:restartNumberingAfterBreak="0">
+  <w:abstractNum w:abstractNumId="23" w15:restartNumberingAfterBreak="0">
     <w:nsid w:val="6CDA336A"/>
     <w:multiLevelType w:val="hybridMultilevel"/>
     <w:tmpl w:val="4E7670AE"/>
@@ -10079,7 +13819,7 @@
       </w:rPr>
     </w:lvl>
   </w:abstractNum>
-  <w:abstractNum w:abstractNumId="23" w15:restartNumberingAfterBreak="0">
+  <w:abstractNum w:abstractNumId="24" w15:restartNumberingAfterBreak="0">
     <w:nsid w:val="6F2B0C99"/>
     <w:multiLevelType w:val="hybridMultilevel"/>
     <w:tmpl w:val="01F8D37E"/>
@@ -10192,7 +13932,7 @@
       </w:rPr>
     </w:lvl>
   </w:abstractNum>
-  <w:abstractNum w:abstractNumId="24" w15:restartNumberingAfterBreak="0">
+  <w:abstractNum w:abstractNumId="25" w15:restartNumberingAfterBreak="0">
     <w:nsid w:val="6F6E201E"/>
     <w:multiLevelType w:val="hybridMultilevel"/>
     <w:tmpl w:val="8E980682"/>
@@ -10332,7 +14072,7 @@
       </w:rPr>
     </w:lvl>
   </w:abstractNum>
-  <w:abstractNum w:abstractNumId="25" w15:restartNumberingAfterBreak="0">
+  <w:abstractNum w:abstractNumId="26" w15:restartNumberingAfterBreak="0">
     <w:nsid w:val="70CD4AED"/>
     <w:multiLevelType w:val="hybridMultilevel"/>
     <w:tmpl w:val="4B1274F0"/>
@@ -10472,7 +14212,7 @@
       </w:rPr>
     </w:lvl>
   </w:abstractNum>
-  <w:abstractNum w:abstractNumId="26" w15:restartNumberingAfterBreak="0">
+  <w:abstractNum w:abstractNumId="27" w15:restartNumberingAfterBreak="0">
     <w:nsid w:val="783B3D5F"/>
     <w:multiLevelType w:val="hybridMultilevel"/>
     <w:tmpl w:val="5ED474B2"/>
@@ -10612,7 +14352,7 @@
       </w:rPr>
     </w:lvl>
   </w:abstractNum>
-  <w:abstractNum w:abstractNumId="27" w15:restartNumberingAfterBreak="0">
+  <w:abstractNum w:abstractNumId="28" w15:restartNumberingAfterBreak="0">
     <w:nsid w:val="79A91BB6"/>
     <w:multiLevelType w:val="multilevel"/>
     <w:tmpl w:val="A36A922A"/>
@@ -10761,7 +14501,7 @@
       </w:rPr>
     </w:lvl>
   </w:abstractNum>
-  <w:abstractNum w:abstractNumId="28" w15:restartNumberingAfterBreak="0">
+  <w:abstractNum w:abstractNumId="29" w15:restartNumberingAfterBreak="0">
     <w:nsid w:val="7EBD6CE2"/>
     <w:multiLevelType w:val="hybridMultilevel"/>
     <w:tmpl w:val="EE1A1C06"/>
@@ -10874,7 +14614,7 @@
       </w:rPr>
     </w:lvl>
   </w:abstractNum>
-  <w:abstractNum w:abstractNumId="29" w15:restartNumberingAfterBreak="0">
+  <w:abstractNum w:abstractNumId="30" w15:restartNumberingAfterBreak="0">
     <w:nsid w:val="7F3555A1"/>
     <w:multiLevelType w:val="hybridMultilevel"/>
     <w:tmpl w:val="ABEE4F4C"/>
@@ -11014,7 +14754,7 @@
       </w:rPr>
     </w:lvl>
   </w:abstractNum>
-  <w:abstractNum w:abstractNumId="30" w15:restartNumberingAfterBreak="0">
+  <w:abstractNum w:abstractNumId="31" w15:restartNumberingAfterBreak="0">
     <w:nsid w:val="7FA946F7"/>
     <w:multiLevelType w:val="hybridMultilevel"/>
     <w:tmpl w:val="5B0C56C4"/>
@@ -11158,94 +14898,97 @@
     <w:abstractNumId w:val="1"/>
   </w:num>
   <w:num w:numId="2" w16cid:durableId="207378518">
-    <w:abstractNumId w:val="24"/>
+    <w:abstractNumId w:val="25"/>
   </w:num>
   <w:num w:numId="3" w16cid:durableId="1622959244">
     <w:abstractNumId w:val="4"/>
   </w:num>
   <w:num w:numId="4" w16cid:durableId="1830710149">
-    <w:abstractNumId w:val="21"/>
+    <w:abstractNumId w:val="22"/>
   </w:num>
   <w:num w:numId="5" w16cid:durableId="6491571">
-    <w:abstractNumId w:val="10"/>
+    <w:abstractNumId w:val="11"/>
   </w:num>
   <w:num w:numId="6" w16cid:durableId="1906722806">
     <w:abstractNumId w:val="0"/>
   </w:num>
   <w:num w:numId="7" w16cid:durableId="227495081">
-    <w:abstractNumId w:val="14"/>
+    <w:abstractNumId w:val="15"/>
   </w:num>
   <w:num w:numId="8" w16cid:durableId="1906182019">
     <w:abstractNumId w:val="7"/>
   </w:num>
   <w:num w:numId="9" w16cid:durableId="1467157761">
-    <w:abstractNumId w:val="22"/>
+    <w:abstractNumId w:val="23"/>
   </w:num>
   <w:num w:numId="10" w16cid:durableId="957296911">
-    <w:abstractNumId w:val="26"/>
+    <w:abstractNumId w:val="27"/>
   </w:num>
   <w:num w:numId="11" w16cid:durableId="1743676954">
     <w:abstractNumId w:val="5"/>
   </w:num>
   <w:num w:numId="12" w16cid:durableId="1858158302">
+    <w:abstractNumId w:val="31"/>
+  </w:num>
+  <w:num w:numId="13" w16cid:durableId="1601644658">
+    <w:abstractNumId w:val="17"/>
+  </w:num>
+  <w:num w:numId="14" w16cid:durableId="928393718">
+    <w:abstractNumId w:val="20"/>
+  </w:num>
+  <w:num w:numId="15" w16cid:durableId="1925803085">
     <w:abstractNumId w:val="30"/>
   </w:num>
-  <w:num w:numId="13" w16cid:durableId="1601644658">
+  <w:num w:numId="16" w16cid:durableId="807935079">
     <w:abstractNumId w:val="16"/>
   </w:num>
-  <w:num w:numId="14" w16cid:durableId="928393718">
-    <w:abstractNumId w:val="19"/>
-  </w:num>
-  <w:num w:numId="15" w16cid:durableId="1925803085">
-    <w:abstractNumId w:val="29"/>
-  </w:num>
-  <w:num w:numId="16" w16cid:durableId="807935079">
-    <w:abstractNumId w:val="15"/>
-  </w:num>
   <w:num w:numId="17" w16cid:durableId="1368674603">
-    <w:abstractNumId w:val="25"/>
+    <w:abstractNumId w:val="26"/>
   </w:num>
   <w:num w:numId="18" w16cid:durableId="5452043">
     <w:abstractNumId w:val="6"/>
   </w:num>
   <w:num w:numId="19" w16cid:durableId="1854493569">
-    <w:abstractNumId w:val="11"/>
+    <w:abstractNumId w:val="12"/>
   </w:num>
   <w:num w:numId="20" w16cid:durableId="950207302">
-    <w:abstractNumId w:val="13"/>
+    <w:abstractNumId w:val="14"/>
   </w:num>
   <w:num w:numId="21" w16cid:durableId="834228262">
-    <w:abstractNumId w:val="28"/>
+    <w:abstractNumId w:val="29"/>
   </w:num>
   <w:num w:numId="22" w16cid:durableId="1137603474">
-    <w:abstractNumId w:val="9"/>
+    <w:abstractNumId w:val="10"/>
   </w:num>
   <w:num w:numId="23" w16cid:durableId="1406420481">
     <w:abstractNumId w:val="3"/>
   </w:num>
   <w:num w:numId="24" w16cid:durableId="1953979480">
-    <w:abstractNumId w:val="27"/>
+    <w:abstractNumId w:val="28"/>
   </w:num>
   <w:num w:numId="25" w16cid:durableId="2111732095">
-    <w:abstractNumId w:val="8"/>
+    <w:abstractNumId w:val="9"/>
   </w:num>
   <w:num w:numId="26" w16cid:durableId="1644651298">
-    <w:abstractNumId w:val="17"/>
+    <w:abstractNumId w:val="18"/>
   </w:num>
   <w:num w:numId="27" w16cid:durableId="731387957">
-    <w:abstractNumId w:val="12"/>
+    <w:abstractNumId w:val="13"/>
   </w:num>
   <w:num w:numId="28" w16cid:durableId="245845369">
-    <w:abstractNumId w:val="18"/>
+    <w:abstractNumId w:val="19"/>
   </w:num>
   <w:num w:numId="29" w16cid:durableId="1140420511">
     <w:abstractNumId w:val="2"/>
   </w:num>
   <w:num w:numId="30" w16cid:durableId="1112359595">
-    <w:abstractNumId w:val="23"/>
+    <w:abstractNumId w:val="24"/>
   </w:num>
   <w:num w:numId="31" w16cid:durableId="1308851327">
-    <w:abstractNumId w:val="20"/>
+    <w:abstractNumId w:val="21"/>
+  </w:num>
+  <w:num w:numId="32" w16cid:durableId="665280855">
+    <w:abstractNumId w:val="8"/>
   </w:num>
 </w:numbering>
 </file>
@@ -11650,6 +15393,7 @@
   <w:style w:type="paragraph" w:default="1" w:styleId="Normal">
     <w:name w:val="Normal"/>
     <w:qFormat/>
+    <w:rsid w:val="00E5640B"/>
   </w:style>
   <w:style w:type="paragraph" w:styleId="Heading1">
     <w:name w:val="heading 1"/>

</xml_diff>